<commit_message>
Fix GitHub Pages 404 issue (HashRouter and base url)
</commit_message>
<xml_diff>
--- a/자료/시스템 아키텍처.docx
+++ b/자료/시스템 아키텍처.docx
@@ -1755,7 +1755,6 @@
           <w:szCs w:val="21"/>
         </w:rPr>
       </w:pPr>
-      <w:proofErr w:type="spellStart"/>
       <w:r>
         <w:rPr>
           <w:rFonts w:ascii="Arial" w:eastAsia="굴림" w:hAnsi="Arial" w:cs="Arial"/>
@@ -1766,7 +1765,6 @@
         </w:rPr>
         <w:t>사이드바에</w:t>
       </w:r>
-      <w:proofErr w:type="spellEnd"/>
       <w:r>
         <w:rPr>
           <w:rFonts w:ascii="Arial" w:eastAsia="굴림" w:hAnsi="Arial" w:cs="Arial"/>
@@ -2066,7 +2064,6 @@
         </w:rPr>
         <w:t xml:space="preserve"> </w:t>
       </w:r>
-      <w:proofErr w:type="spellStart"/>
       <w:r>
         <w:rPr>
           <w:rFonts w:ascii="Arial" w:eastAsia="굴림" w:hAnsi="Arial" w:cs="Arial"/>
@@ -2077,7 +2074,6 @@
         </w:rPr>
         <w:t>시각화하였습니다</w:t>
       </w:r>
-      <w:proofErr w:type="spellEnd"/>
       <w:r>
         <w:rPr>
           <w:rFonts w:ascii="Arial" w:eastAsia="굴림" w:hAnsi="Arial" w:cs="Arial"/>
@@ -2264,7 +2260,6 @@
         </w:rPr>
         <w:t> </w:t>
       </w:r>
-      <w:proofErr w:type="spellStart"/>
       <w:r>
         <w:rPr>
           <w:rFonts w:ascii="Arial" w:eastAsia="굴림" w:hAnsi="Arial" w:cs="Arial"/>
@@ -2275,29 +2270,16 @@
         </w:rPr>
         <w:t>엔티티를</w:t>
       </w:r>
-      <w:proofErr w:type="spellEnd"/>
-      <w:r>
-        <w:rPr>
-          <w:rFonts w:ascii="Arial" w:eastAsia="굴림" w:hAnsi="Arial" w:cs="Arial"/>
-          <w:color w:val="2B2D31"/>
-          <w:kern w:val="0"/>
-          <w:sz w:val="21"/>
-          <w:szCs w:val="21"/>
-        </w:rPr>
-        <w:t xml:space="preserve"> </w:t>
-      </w:r>
-      <w:proofErr w:type="spellStart"/>
-      <w:r>
-        <w:rPr>
-          <w:rFonts w:ascii="Arial" w:eastAsia="굴림" w:hAnsi="Arial" w:cs="Arial"/>
-          <w:color w:val="2B2D31"/>
-          <w:kern w:val="0"/>
-          <w:sz w:val="21"/>
-          <w:szCs w:val="21"/>
-        </w:rPr>
-        <w:t>Firestore</w:t>
-      </w:r>
-      <w:proofErr w:type="spellEnd"/>
+      <w:r>
+        <w:rPr>
+          <w:rFonts w:ascii="Arial" w:eastAsia="굴림" w:hAnsi="Arial" w:cs="Arial"/>
+          <w:color w:val="2B2D31"/>
+          <w:kern w:val="0"/>
+          <w:sz w:val="21"/>
+          <w:szCs w:val="21"/>
+        </w:rPr>
+        <w:t xml:space="preserve"> Firestore</w:t>
+      </w:r>
       <w:r>
         <w:rPr>
           <w:rFonts w:ascii="Arial" w:eastAsia="굴림" w:hAnsi="Arial" w:cs="Arial"/>
@@ -2540,7 +2522,6 @@
         </w:rPr>
         <w:t>(</w:t>
       </w:r>
-      <w:proofErr w:type="spellStart"/>
       <w:r>
         <w:rPr>
           <w:rFonts w:ascii="Courier New" w:eastAsia="굴림" w:hAnsi="Courier New" w:cs="Courier New"/>
@@ -2552,7 +2533,6 @@
         </w:rPr>
         <w:t>UserProfile</w:t>
       </w:r>
-      <w:proofErr w:type="spellEnd"/>
       <w:r>
         <w:rPr>
           <w:rFonts w:ascii="Arial" w:eastAsia="굴림" w:hAnsi="Arial" w:cs="Arial"/>
@@ -2583,7 +2563,6 @@
         </w:rPr>
         <w:t> </w:t>
       </w:r>
-      <w:proofErr w:type="spellStart"/>
       <w:r>
         <w:rPr>
           <w:rFonts w:ascii="Courier New" w:eastAsia="굴림" w:hAnsi="Courier New" w:cs="Courier New"/>
@@ -2595,7 +2574,6 @@
         </w:rPr>
         <w:t>divisionId</w:t>
       </w:r>
-      <w:proofErr w:type="spellEnd"/>
       <w:r>
         <w:rPr>
           <w:rFonts w:ascii="Arial" w:eastAsia="굴림" w:hAnsi="Arial" w:cs="Arial"/>
@@ -2616,7 +2594,6 @@
         </w:rPr>
         <w:t> </w:t>
       </w:r>
-      <w:proofErr w:type="spellStart"/>
       <w:r>
         <w:rPr>
           <w:rFonts w:ascii="Courier New" w:eastAsia="굴림" w:hAnsi="Courier New" w:cs="Courier New"/>
@@ -2628,7 +2605,6 @@
         </w:rPr>
         <w:t>teamId</w:t>
       </w:r>
-      <w:proofErr w:type="spellEnd"/>
       <w:r>
         <w:rPr>
           <w:rFonts w:ascii="Arial" w:eastAsia="굴림" w:hAnsi="Arial" w:cs="Arial"/>
@@ -3043,7 +3019,7 @@
         <w:spacing w:after="105" w:line="315" w:lineRule="atLeast"/>
         <w:rPr>
           <w:rStyle w:val="ng-star-inserted1"/>
-          <w:rFonts w:ascii="Arial" w:hAnsi="Arial" w:cs="Arial" w:hint="eastAsia"/>
+          <w:rFonts w:ascii="Arial" w:hAnsi="Arial" w:cs="Arial"/>
           <w:color w:val="2B2D31"/>
           <w:sz w:val="21"/>
           <w:szCs w:val="21"/>
@@ -3451,20 +3427,157 @@
           <w:sz w:val="21"/>
           <w:szCs w:val="21"/>
         </w:rPr>
-        <w:t xml:space="preserve"> Python (Django/</w:t>
-      </w:r>
-      <w:proofErr w:type="spellStart"/>
-      <w:r>
-        <w:rPr>
-          <w:rStyle w:val="ng-star-inserted1"/>
-          <w:rFonts w:ascii="Arial" w:hAnsi="Arial" w:cs="Arial"/>
-          <w:color w:val="2B2D31"/>
-          <w:sz w:val="21"/>
-          <w:szCs w:val="21"/>
-        </w:rPr>
-        <w:t>FastAPI</w:t>
-      </w:r>
-      <w:proofErr w:type="spellEnd"/>
+        <w:t xml:space="preserve"> Python (Django/FastAPI)</w:t>
+      </w:r>
+      <w:r>
+        <w:rPr>
+          <w:rFonts w:ascii="Arial" w:hAnsi="Arial" w:cs="Arial"/>
+          <w:color w:val="2B2D31"/>
+          <w:sz w:val="21"/>
+          <w:szCs w:val="21"/>
+        </w:rPr>
+        <w:br/>
+      </w:r>
+      <w:r>
+        <w:rPr>
+          <w:rStyle w:val="ng-star-inserted1"/>
+          <w:rFonts w:ascii="Arial" w:hAnsi="Arial" w:cs="Arial"/>
+          <w:color w:val="2B2D31"/>
+          <w:sz w:val="21"/>
+          <w:szCs w:val="21"/>
+        </w:rPr>
+        <w:t xml:space="preserve">Database: MySQL </w:t>
+      </w:r>
+      <w:r>
+        <w:rPr>
+          <w:rStyle w:val="ng-star-inserted1"/>
+          <w:rFonts w:ascii="Arial" w:hAnsi="Arial" w:cs="Arial"/>
+          <w:color w:val="2B2D31"/>
+          <w:sz w:val="21"/>
+          <w:szCs w:val="21"/>
+        </w:rPr>
+        <w:t>또는</w:t>
+      </w:r>
+      <w:r>
+        <w:rPr>
+          <w:rStyle w:val="ng-star-inserted1"/>
+          <w:rFonts w:ascii="Arial" w:hAnsi="Arial" w:cs="Arial"/>
+          <w:color w:val="2B2D31"/>
+          <w:sz w:val="21"/>
+          <w:szCs w:val="21"/>
+        </w:rPr>
+        <w:t xml:space="preserve"> PostgreSQL (</w:t>
+      </w:r>
+      <w:r>
+        <w:rPr>
+          <w:rStyle w:val="ng-star-inserted1"/>
+          <w:rFonts w:ascii="Arial" w:hAnsi="Arial" w:cs="Arial"/>
+          <w:color w:val="2B2D31"/>
+          <w:sz w:val="21"/>
+          <w:szCs w:val="21"/>
+        </w:rPr>
+        <w:t>관계형</w:t>
+      </w:r>
+      <w:r>
+        <w:rPr>
+          <w:rStyle w:val="ng-star-inserted1"/>
+          <w:rFonts w:ascii="Arial" w:hAnsi="Arial" w:cs="Arial"/>
+          <w:color w:val="2B2D31"/>
+          <w:sz w:val="21"/>
+          <w:szCs w:val="21"/>
+        </w:rPr>
+        <w:t xml:space="preserve"> </w:t>
+      </w:r>
+      <w:r>
+        <w:rPr>
+          <w:rStyle w:val="ng-star-inserted1"/>
+          <w:rFonts w:ascii="Arial" w:hAnsi="Arial" w:cs="Arial"/>
+          <w:color w:val="2B2D31"/>
+          <w:sz w:val="21"/>
+          <w:szCs w:val="21"/>
+        </w:rPr>
+        <w:t>데이터베이스가</w:t>
+      </w:r>
+      <w:r>
+        <w:rPr>
+          <w:rStyle w:val="ng-star-inserted1"/>
+          <w:rFonts w:ascii="Arial" w:hAnsi="Arial" w:cs="Arial"/>
+          <w:color w:val="2B2D31"/>
+          <w:sz w:val="21"/>
+          <w:szCs w:val="21"/>
+        </w:rPr>
+        <w:t xml:space="preserve"> </w:t>
+      </w:r>
+      <w:r>
+        <w:rPr>
+          <w:rStyle w:val="ng-star-inserted1"/>
+          <w:rFonts w:ascii="Arial" w:hAnsi="Arial" w:cs="Arial"/>
+          <w:color w:val="2B2D31"/>
+          <w:sz w:val="21"/>
+          <w:szCs w:val="21"/>
+        </w:rPr>
+        <w:t>결재</w:t>
+      </w:r>
+      <w:r>
+        <w:rPr>
+          <w:rStyle w:val="ng-star-inserted1"/>
+          <w:rFonts w:ascii="Arial" w:hAnsi="Arial" w:cs="Arial"/>
+          <w:color w:val="2B2D31"/>
+          <w:sz w:val="21"/>
+          <w:szCs w:val="21"/>
+        </w:rPr>
+        <w:t xml:space="preserve"> </w:t>
+      </w:r>
+      <w:r>
+        <w:rPr>
+          <w:rStyle w:val="ng-star-inserted1"/>
+          <w:rFonts w:ascii="Arial" w:hAnsi="Arial" w:cs="Arial"/>
+          <w:color w:val="2B2D31"/>
+          <w:sz w:val="21"/>
+          <w:szCs w:val="21"/>
+        </w:rPr>
+        <w:t>라인</w:t>
+      </w:r>
+      <w:r>
+        <w:rPr>
+          <w:rStyle w:val="ng-star-inserted1"/>
+          <w:rFonts w:ascii="Arial" w:hAnsi="Arial" w:cs="Arial"/>
+          <w:color w:val="2B2D31"/>
+          <w:sz w:val="21"/>
+          <w:szCs w:val="21"/>
+        </w:rPr>
+        <w:t xml:space="preserve"> </w:t>
+      </w:r>
+      <w:r>
+        <w:rPr>
+          <w:rStyle w:val="ng-star-inserted1"/>
+          <w:rFonts w:ascii="Arial" w:hAnsi="Arial" w:cs="Arial"/>
+          <w:color w:val="2B2D31"/>
+          <w:sz w:val="21"/>
+          <w:szCs w:val="21"/>
+        </w:rPr>
+        <w:t>관리에</w:t>
+      </w:r>
+      <w:r>
+        <w:rPr>
+          <w:rStyle w:val="ng-star-inserted1"/>
+          <w:rFonts w:ascii="Arial" w:hAnsi="Arial" w:cs="Arial"/>
+          <w:color w:val="2B2D31"/>
+          <w:sz w:val="21"/>
+          <w:szCs w:val="21"/>
+        </w:rPr>
+        <w:t xml:space="preserve"> </w:t>
+      </w:r>
+      <w:r>
+        <w:rPr>
+          <w:rStyle w:val="ng-star-inserted1"/>
+          <w:rFonts w:ascii="Arial" w:hAnsi="Arial" w:cs="Arial"/>
+          <w:color w:val="2B2D31"/>
+          <w:sz w:val="21"/>
+          <w:szCs w:val="21"/>
+        </w:rPr>
+        <w:t>적합</w:t>
+      </w:r>
       <w:r>
         <w:rPr>
           <w:rStyle w:val="ng-star-inserted1"/>
@@ -3492,7 +3605,77 @@
           <w:sz w:val="21"/>
           <w:szCs w:val="21"/>
         </w:rPr>
-        <w:t xml:space="preserve">Database: MySQL </w:t>
+        <w:t>출력</w:t>
+      </w:r>
+      <w:r>
+        <w:rPr>
+          <w:rStyle w:val="ng-star-inserted1"/>
+          <w:rFonts w:ascii="Arial" w:hAnsi="Arial" w:cs="Arial"/>
+          <w:color w:val="2B2D31"/>
+          <w:sz w:val="21"/>
+          <w:szCs w:val="21"/>
+        </w:rPr>
+        <w:t xml:space="preserve">: </w:t>
+      </w:r>
+      <w:r>
+        <w:rPr>
+          <w:rStyle w:val="ng-star-inserted1"/>
+          <w:rFonts w:ascii="Arial" w:hAnsi="Arial" w:cs="Arial"/>
+          <w:color w:val="2B2D31"/>
+          <w:sz w:val="21"/>
+          <w:szCs w:val="21"/>
+        </w:rPr>
+        <w:t>브라우저</w:t>
+      </w:r>
+      <w:r>
+        <w:rPr>
+          <w:rStyle w:val="ng-star-inserted1"/>
+          <w:rFonts w:ascii="Arial" w:hAnsi="Arial" w:cs="Arial"/>
+          <w:color w:val="2B2D31"/>
+          <w:sz w:val="21"/>
+          <w:szCs w:val="21"/>
+        </w:rPr>
+        <w:t xml:space="preserve"> </w:t>
+      </w:r>
+      <w:r>
+        <w:rPr>
+          <w:rStyle w:val="ng-star-inserted1"/>
+          <w:rFonts w:ascii="Arial" w:hAnsi="Arial" w:cs="Arial"/>
+          <w:color w:val="2B2D31"/>
+          <w:sz w:val="21"/>
+          <w:szCs w:val="21"/>
+        </w:rPr>
+        <w:t>인쇄</w:t>
+      </w:r>
+      <w:r>
+        <w:rPr>
+          <w:rStyle w:val="ng-star-inserted1"/>
+          <w:rFonts w:ascii="Arial" w:hAnsi="Arial" w:cs="Arial"/>
+          <w:color w:val="2B2D31"/>
+          <w:sz w:val="21"/>
+          <w:szCs w:val="21"/>
+        </w:rPr>
+        <w:t xml:space="preserve"> </w:t>
+      </w:r>
+      <w:r>
+        <w:rPr>
+          <w:rStyle w:val="ng-star-inserted1"/>
+          <w:rFonts w:ascii="Arial" w:hAnsi="Arial" w:cs="Arial"/>
+          <w:color w:val="2B2D31"/>
+          <w:sz w:val="21"/>
+          <w:szCs w:val="21"/>
+        </w:rPr>
+        <w:t>기능</w:t>
+      </w:r>
+      <w:r>
+        <w:rPr>
+          <w:rStyle w:val="ng-star-inserted1"/>
+          <w:rFonts w:ascii="Arial" w:hAnsi="Arial" w:cs="Arial"/>
+          <w:color w:val="2B2D31"/>
+          <w:sz w:val="21"/>
+          <w:szCs w:val="21"/>
+        </w:rPr>
+        <w:t xml:space="preserve"> </w:t>
       </w:r>
       <w:r>
         <w:rPr>
@@ -3512,235 +3695,6 @@
           <w:sz w:val="21"/>
           <w:szCs w:val="21"/>
         </w:rPr>
-        <w:t xml:space="preserve"> PostgreSQL (</w:t>
-      </w:r>
-      <w:r>
-        <w:rPr>
-          <w:rStyle w:val="ng-star-inserted1"/>
-          <w:rFonts w:ascii="Arial" w:hAnsi="Arial" w:cs="Arial"/>
-          <w:color w:val="2B2D31"/>
-          <w:sz w:val="21"/>
-          <w:szCs w:val="21"/>
-        </w:rPr>
-        <w:t>관계형</w:t>
-      </w:r>
-      <w:r>
-        <w:rPr>
-          <w:rStyle w:val="ng-star-inserted1"/>
-          <w:rFonts w:ascii="Arial" w:hAnsi="Arial" w:cs="Arial"/>
-          <w:color w:val="2B2D31"/>
-          <w:sz w:val="21"/>
-          <w:szCs w:val="21"/>
-        </w:rPr>
-        <w:t xml:space="preserve"> </w:t>
-      </w:r>
-      <w:r>
-        <w:rPr>
-          <w:rStyle w:val="ng-star-inserted1"/>
-          <w:rFonts w:ascii="Arial" w:hAnsi="Arial" w:cs="Arial"/>
-          <w:color w:val="2B2D31"/>
-          <w:sz w:val="21"/>
-          <w:szCs w:val="21"/>
-        </w:rPr>
-        <w:t>데이터베이스가</w:t>
-      </w:r>
-      <w:r>
-        <w:rPr>
-          <w:rStyle w:val="ng-star-inserted1"/>
-          <w:rFonts w:ascii="Arial" w:hAnsi="Arial" w:cs="Arial"/>
-          <w:color w:val="2B2D31"/>
-          <w:sz w:val="21"/>
-          <w:szCs w:val="21"/>
-        </w:rPr>
-        <w:t xml:space="preserve"> </w:t>
-      </w:r>
-      <w:r>
-        <w:rPr>
-          <w:rStyle w:val="ng-star-inserted1"/>
-          <w:rFonts w:ascii="Arial" w:hAnsi="Arial" w:cs="Arial"/>
-          <w:color w:val="2B2D31"/>
-          <w:sz w:val="21"/>
-          <w:szCs w:val="21"/>
-        </w:rPr>
-        <w:t>결재</w:t>
-      </w:r>
-      <w:r>
-        <w:rPr>
-          <w:rStyle w:val="ng-star-inserted1"/>
-          <w:rFonts w:ascii="Arial" w:hAnsi="Arial" w:cs="Arial"/>
-          <w:color w:val="2B2D31"/>
-          <w:sz w:val="21"/>
-          <w:szCs w:val="21"/>
-        </w:rPr>
-        <w:t xml:space="preserve"> </w:t>
-      </w:r>
-      <w:r>
-        <w:rPr>
-          <w:rStyle w:val="ng-star-inserted1"/>
-          <w:rFonts w:ascii="Arial" w:hAnsi="Arial" w:cs="Arial"/>
-          <w:color w:val="2B2D31"/>
-          <w:sz w:val="21"/>
-          <w:szCs w:val="21"/>
-        </w:rPr>
-        <w:t>라인</w:t>
-      </w:r>
-      <w:r>
-        <w:rPr>
-          <w:rStyle w:val="ng-star-inserted1"/>
-          <w:rFonts w:ascii="Arial" w:hAnsi="Arial" w:cs="Arial"/>
-          <w:color w:val="2B2D31"/>
-          <w:sz w:val="21"/>
-          <w:szCs w:val="21"/>
-        </w:rPr>
-        <w:t xml:space="preserve"> </w:t>
-      </w:r>
-      <w:r>
-        <w:rPr>
-          <w:rStyle w:val="ng-star-inserted1"/>
-          <w:rFonts w:ascii="Arial" w:hAnsi="Arial" w:cs="Arial"/>
-          <w:color w:val="2B2D31"/>
-          <w:sz w:val="21"/>
-          <w:szCs w:val="21"/>
-        </w:rPr>
-        <w:t>관리에</w:t>
-      </w:r>
-      <w:r>
-        <w:rPr>
-          <w:rStyle w:val="ng-star-inserted1"/>
-          <w:rFonts w:ascii="Arial" w:hAnsi="Arial" w:cs="Arial"/>
-          <w:color w:val="2B2D31"/>
-          <w:sz w:val="21"/>
-          <w:szCs w:val="21"/>
-        </w:rPr>
-        <w:t xml:space="preserve"> </w:t>
-      </w:r>
-      <w:r>
-        <w:rPr>
-          <w:rStyle w:val="ng-star-inserted1"/>
-          <w:rFonts w:ascii="Arial" w:hAnsi="Arial" w:cs="Arial"/>
-          <w:color w:val="2B2D31"/>
-          <w:sz w:val="21"/>
-          <w:szCs w:val="21"/>
-        </w:rPr>
-        <w:t>적합</w:t>
-      </w:r>
-      <w:r>
-        <w:rPr>
-          <w:rStyle w:val="ng-star-inserted1"/>
-          <w:rFonts w:ascii="Arial" w:hAnsi="Arial" w:cs="Arial"/>
-          <w:color w:val="2B2D31"/>
-          <w:sz w:val="21"/>
-          <w:szCs w:val="21"/>
-        </w:rPr>
-        <w:t>)</w:t>
-      </w:r>
-      <w:r>
-        <w:rPr>
-          <w:rFonts w:ascii="Arial" w:hAnsi="Arial" w:cs="Arial"/>
-          <w:color w:val="2B2D31"/>
-          <w:sz w:val="21"/>
-          <w:szCs w:val="21"/>
-        </w:rPr>
-        <w:br/>
-      </w:r>
-      <w:r>
-        <w:rPr>
-          <w:rStyle w:val="ng-star-inserted1"/>
-          <w:rFonts w:ascii="Arial" w:hAnsi="Arial" w:cs="Arial"/>
-          <w:color w:val="2B2D31"/>
-          <w:sz w:val="21"/>
-          <w:szCs w:val="21"/>
-        </w:rPr>
-        <w:t>출력</w:t>
-      </w:r>
-      <w:r>
-        <w:rPr>
-          <w:rStyle w:val="ng-star-inserted1"/>
-          <w:rFonts w:ascii="Arial" w:hAnsi="Arial" w:cs="Arial"/>
-          <w:color w:val="2B2D31"/>
-          <w:sz w:val="21"/>
-          <w:szCs w:val="21"/>
-        </w:rPr>
-        <w:t xml:space="preserve">: </w:t>
-      </w:r>
-      <w:r>
-        <w:rPr>
-          <w:rStyle w:val="ng-star-inserted1"/>
-          <w:rFonts w:ascii="Arial" w:hAnsi="Arial" w:cs="Arial"/>
-          <w:color w:val="2B2D31"/>
-          <w:sz w:val="21"/>
-          <w:szCs w:val="21"/>
-        </w:rPr>
-        <w:t>브라우저</w:t>
-      </w:r>
-      <w:r>
-        <w:rPr>
-          <w:rStyle w:val="ng-star-inserted1"/>
-          <w:rFonts w:ascii="Arial" w:hAnsi="Arial" w:cs="Arial"/>
-          <w:color w:val="2B2D31"/>
-          <w:sz w:val="21"/>
-          <w:szCs w:val="21"/>
-        </w:rPr>
-        <w:t xml:space="preserve"> </w:t>
-      </w:r>
-      <w:r>
-        <w:rPr>
-          <w:rStyle w:val="ng-star-inserted1"/>
-          <w:rFonts w:ascii="Arial" w:hAnsi="Arial" w:cs="Arial"/>
-          <w:color w:val="2B2D31"/>
-          <w:sz w:val="21"/>
-          <w:szCs w:val="21"/>
-        </w:rPr>
-        <w:t>인쇄</w:t>
-      </w:r>
-      <w:r>
-        <w:rPr>
-          <w:rStyle w:val="ng-star-inserted1"/>
-          <w:rFonts w:ascii="Arial" w:hAnsi="Arial" w:cs="Arial"/>
-          <w:color w:val="2B2D31"/>
-          <w:sz w:val="21"/>
-          <w:szCs w:val="21"/>
-        </w:rPr>
-        <w:t xml:space="preserve"> </w:t>
-      </w:r>
-      <w:r>
-        <w:rPr>
-          <w:rStyle w:val="ng-star-inserted1"/>
-          <w:rFonts w:ascii="Arial" w:hAnsi="Arial" w:cs="Arial"/>
-          <w:color w:val="2B2D31"/>
-          <w:sz w:val="21"/>
-          <w:szCs w:val="21"/>
-        </w:rPr>
-        <w:t>기능</w:t>
-      </w:r>
-      <w:r>
-        <w:rPr>
-          <w:rStyle w:val="ng-star-inserted1"/>
-          <w:rFonts w:ascii="Arial" w:hAnsi="Arial" w:cs="Arial"/>
-          <w:color w:val="2B2D31"/>
-          <w:sz w:val="21"/>
-          <w:szCs w:val="21"/>
-        </w:rPr>
-        <w:t xml:space="preserve"> </w:t>
-      </w:r>
-      <w:r>
-        <w:rPr>
-          <w:rStyle w:val="ng-star-inserted1"/>
-          <w:rFonts w:ascii="Arial" w:hAnsi="Arial" w:cs="Arial"/>
-          <w:color w:val="2B2D31"/>
-          <w:sz w:val="21"/>
-          <w:szCs w:val="21"/>
-        </w:rPr>
-        <w:t>또는</w:t>
-      </w:r>
-      <w:r>
-        <w:rPr>
-          <w:rStyle w:val="ng-star-inserted1"/>
-          <w:rFonts w:ascii="Arial" w:hAnsi="Arial" w:cs="Arial"/>
-          <w:color w:val="2B2D31"/>
-          <w:sz w:val="21"/>
-          <w:szCs w:val="21"/>
-        </w:rPr>
         <w:t xml:space="preserve"> PDF </w:t>
       </w:r>
       <w:r>
@@ -3781,29 +3735,7 @@
           <w:sz w:val="21"/>
           <w:szCs w:val="21"/>
         </w:rPr>
-        <w:t xml:space="preserve"> (</w:t>
-      </w:r>
-      <w:proofErr w:type="spellStart"/>
-      <w:r>
-        <w:rPr>
-          <w:rStyle w:val="ng-star-inserted1"/>
-          <w:rFonts w:ascii="Arial" w:hAnsi="Arial" w:cs="Arial"/>
-          <w:color w:val="2B2D31"/>
-          <w:sz w:val="21"/>
-          <w:szCs w:val="21"/>
-        </w:rPr>
-        <w:t>jspdf</w:t>
-      </w:r>
-      <w:proofErr w:type="spellEnd"/>
-      <w:r>
-        <w:rPr>
-          <w:rStyle w:val="ng-star-inserted1"/>
-          <w:rFonts w:ascii="Arial" w:hAnsi="Arial" w:cs="Arial"/>
-          <w:color w:val="2B2D31"/>
-          <w:sz w:val="21"/>
-          <w:szCs w:val="21"/>
-        </w:rPr>
-        <w:t>, html2canvas)</w:t>
+        <w:t xml:space="preserve"> (jspdf, html2canvas)</w:t>
       </w:r>
     </w:p>
     <w:p>
@@ -4349,27 +4281,15 @@
         </w:rPr>
         <w:br/>
       </w:r>
-      <w:proofErr w:type="spellStart"/>
-      <w:r>
-        <w:rPr>
-          <w:rStyle w:val="ng-star-inserted1"/>
-          <w:rFonts w:ascii="Arial" w:hAnsi="Arial" w:cs="Arial"/>
-          <w:color w:val="2B2D31"/>
-          <w:sz w:val="21"/>
-          <w:szCs w:val="21"/>
-        </w:rPr>
-        <w:t>LeaveRequests</w:t>
-      </w:r>
-      <w:proofErr w:type="spellEnd"/>
-      <w:r>
-        <w:rPr>
-          <w:rStyle w:val="ng-star-inserted1"/>
-          <w:rFonts w:ascii="Arial" w:hAnsi="Arial" w:cs="Arial"/>
-          <w:color w:val="2B2D31"/>
-          <w:sz w:val="21"/>
-          <w:szCs w:val="21"/>
-        </w:rPr>
-        <w:t xml:space="preserve"> (</w:t>
+      <w:r>
+        <w:rPr>
+          <w:rStyle w:val="ng-star-inserted1"/>
+          <w:rFonts w:ascii="Arial" w:hAnsi="Arial" w:cs="Arial"/>
+          <w:color w:val="2B2D31"/>
+          <w:sz w:val="21"/>
+          <w:szCs w:val="21"/>
+        </w:rPr>
+        <w:t>LeaveRequests (</w:t>
       </w:r>
       <w:r>
         <w:rPr>
@@ -4431,7 +4351,6 @@
         </w:rPr>
         <w:t xml:space="preserve">ID, </w:t>
       </w:r>
-      <w:proofErr w:type="spellStart"/>
       <w:r>
         <w:rPr>
           <w:rStyle w:val="ng-star-inserted1"/>
@@ -4442,7 +4361,6 @@
         </w:rPr>
         <w:t>휴가종류</w:t>
       </w:r>
-      <w:proofErr w:type="spellEnd"/>
       <w:r>
         <w:rPr>
           <w:rStyle w:val="ng-star-inserted1"/>
@@ -4493,7 +4411,6 @@
         </w:rPr>
         <w:t>/</w:t>
       </w:r>
-      <w:proofErr w:type="spellStart"/>
       <w:r>
         <w:rPr>
           <w:rStyle w:val="ng-star-inserted1"/>
@@ -4504,7 +4421,6 @@
         </w:rPr>
         <w:t>반차</w:t>
       </w:r>
-      <w:proofErr w:type="spellEnd"/>
       <w:r>
         <w:rPr>
           <w:rStyle w:val="ng-star-inserted1"/>
@@ -4575,7 +4491,6 @@
         </w:rPr>
         <w:t xml:space="preserve">, </w:t>
       </w:r>
-      <w:proofErr w:type="spellStart"/>
       <w:r>
         <w:rPr>
           <w:rStyle w:val="ng-star-inserted1"/>
@@ -4586,7 +4501,6 @@
         </w:rPr>
         <w:t>결재상태</w:t>
       </w:r>
-      <w:proofErr w:type="spellEnd"/>
       <w:r>
         <w:rPr>
           <w:rStyle w:val="ng-star-inserted1"/>
@@ -4617,7 +4531,6 @@
         </w:rPr>
         <w:t>/</w:t>
       </w:r>
-      <w:proofErr w:type="spellStart"/>
       <w:r>
         <w:rPr>
           <w:rStyle w:val="ng-star-inserted1"/>
@@ -4628,7 +4541,6 @@
         </w:rPr>
         <w:t>인사승인</w:t>
       </w:r>
-      <w:proofErr w:type="spellEnd"/>
       <w:r>
         <w:rPr>
           <w:rStyle w:val="ng-star-inserted1"/>
@@ -5014,7 +4926,6 @@
         </w:rPr>
         <w:t xml:space="preserve">: </w:t>
       </w:r>
-      <w:proofErr w:type="spellStart"/>
       <w:r>
         <w:rPr>
           <w:rStyle w:val="ng-star-inserted1"/>
@@ -5025,7 +4936,6 @@
         </w:rPr>
         <w:t>부여받은</w:t>
       </w:r>
-      <w:proofErr w:type="spellEnd"/>
       <w:r>
         <w:rPr>
           <w:rStyle w:val="ng-star-inserted1"/>
@@ -6838,7 +6748,6 @@
         </w:rPr>
         <w:t xml:space="preserve"> </w:t>
       </w:r>
-      <w:proofErr w:type="spellStart"/>
       <w:r>
         <w:rPr>
           <w:rStyle w:val="ng-star-inserted1"/>
@@ -6849,7 +6758,6 @@
         </w:rPr>
         <w:t>결재권자</w:t>
       </w:r>
-      <w:proofErr w:type="spellEnd"/>
       <w:r>
         <w:rPr>
           <w:rStyle w:val="ng-star-inserted1"/>
@@ -6880,7 +6788,6 @@
         </w:rPr>
         <w:t xml:space="preserve"> (</w:t>
       </w:r>
-      <w:proofErr w:type="spellStart"/>
       <w:r>
         <w:rPr>
           <w:rStyle w:val="ng-star-inserted1"/>
@@ -6891,7 +6798,6 @@
         </w:rPr>
         <w:t>인사본부장</w:t>
       </w:r>
-      <w:proofErr w:type="spellEnd"/>
       <w:r>
         <w:rPr>
           <w:rStyle w:val="ng-star-inserted1"/>
@@ -7418,7 +7324,6 @@
         </w:rPr>
         <w:br/>
       </w:r>
-      <w:proofErr w:type="spellStart"/>
       <w:r>
         <w:rPr>
           <w:rStyle w:val="ng-star-inserted1"/>
@@ -7429,7 +7334,6 @@
         </w:rPr>
         <w:t>필터링</w:t>
       </w:r>
-      <w:proofErr w:type="spellEnd"/>
       <w:r>
         <w:rPr>
           <w:rStyle w:val="ng-star-inserted1"/>
@@ -7520,7 +7424,6 @@
         </w:rPr>
         <w:t xml:space="preserve"> </w:t>
       </w:r>
-      <w:proofErr w:type="spellStart"/>
       <w:r>
         <w:rPr>
           <w:rStyle w:val="ng-star-inserted1"/>
@@ -7531,7 +7434,6 @@
         </w:rPr>
         <w:t>필터링</w:t>
       </w:r>
-      <w:proofErr w:type="spellEnd"/>
       <w:r>
         <w:rPr>
           <w:rFonts w:ascii="Arial" w:hAnsi="Arial" w:cs="Arial"/>
@@ -7827,29 +7729,7 @@
           <w:sz w:val="21"/>
           <w:szCs w:val="21"/>
         </w:rPr>
-        <w:t xml:space="preserve">: </w:t>
-      </w:r>
-      <w:proofErr w:type="spellStart"/>
-      <w:r>
-        <w:rPr>
-          <w:rStyle w:val="ng-star-inserted1"/>
-          <w:rFonts w:ascii="Arial" w:hAnsi="Arial" w:cs="Arial"/>
-          <w:color w:val="2B2D31"/>
-          <w:sz w:val="21"/>
-          <w:szCs w:val="21"/>
-        </w:rPr>
-        <w:t>ExcelJS</w:t>
-      </w:r>
-      <w:proofErr w:type="spellEnd"/>
-      <w:r>
-        <w:rPr>
-          <w:rStyle w:val="ng-star-inserted1"/>
-          <w:rFonts w:ascii="Arial" w:hAnsi="Arial" w:cs="Arial"/>
-          <w:color w:val="2B2D31"/>
-          <w:sz w:val="21"/>
-          <w:szCs w:val="21"/>
-        </w:rPr>
-        <w:t xml:space="preserve"> </w:t>
+        <w:t xml:space="preserve">: ExcelJS </w:t>
       </w:r>
       <w:r>
         <w:rPr>
@@ -8078,7 +7958,6 @@
         </w:rPr>
         <w:t xml:space="preserve"> </w:t>
       </w:r>
-      <w:proofErr w:type="spellStart"/>
       <w:r>
         <w:rPr>
           <w:rStyle w:val="ng-star-inserted1"/>
@@ -8089,7 +7968,6 @@
         </w:rPr>
         <w:t>워크플로우</w:t>
       </w:r>
-      <w:proofErr w:type="spellEnd"/>
       <w:r>
         <w:rPr>
           <w:rStyle w:val="ng-star-inserted1"/>
@@ -8911,7 +8789,6 @@
         </w:rPr>
         <w:t xml:space="preserve"> (</w:t>
       </w:r>
-      <w:proofErr w:type="spellStart"/>
       <w:r>
         <w:rPr>
           <w:rStyle w:val="ng-star-inserted1"/>
@@ -8922,7 +8799,6 @@
         </w:rPr>
         <w:t>백엔드</w:t>
       </w:r>
-      <w:proofErr w:type="spellEnd"/>
       <w:r>
         <w:rPr>
           <w:rStyle w:val="ng-star-inserted1"/>
@@ -9073,7 +8949,6 @@
         </w:rPr>
         <w:t xml:space="preserve"> </w:t>
       </w:r>
-      <w:proofErr w:type="spellStart"/>
       <w:r>
         <w:rPr>
           <w:rStyle w:val="ng-star-inserted1"/>
@@ -9084,7 +8959,6 @@
         </w:rPr>
         <w:t>로직</w:t>
       </w:r>
-      <w:proofErr w:type="spellEnd"/>
       <w:r>
         <w:rPr>
           <w:rStyle w:val="ng-star-inserted1"/>
@@ -9134,7 +9008,6 @@
         </w:rPr>
         <w:t xml:space="preserve"> (</w:t>
       </w:r>
-      <w:proofErr w:type="spellStart"/>
       <w:r>
         <w:rPr>
           <w:rStyle w:val="ng-star-inserted1"/>
@@ -9145,7 +9018,6 @@
         </w:rPr>
         <w:t>프론트엔드</w:t>
       </w:r>
-      <w:proofErr w:type="spellEnd"/>
       <w:r>
         <w:rPr>
           <w:rStyle w:val="ng-star-inserted1"/>
@@ -9363,31 +9235,8 @@
           <w:sz w:val="21"/>
           <w:szCs w:val="21"/>
         </w:rPr>
-        <w:t>(</w:t>
-      </w:r>
-      <w:proofErr w:type="spellStart"/>
-      <w:r>
-        <w:rPr>
-          <w:rStyle w:val="ng-star-inserted1"/>
-          <w:rFonts w:ascii="Arial" w:hAnsi="Arial" w:cs="Arial"/>
-          <w:color w:val="2B2D31"/>
-          <w:sz w:val="21"/>
-          <w:szCs w:val="21"/>
-        </w:rPr>
-        <w:t>bcrypt</w:t>
-      </w:r>
-      <w:proofErr w:type="spellEnd"/>
-      <w:r>
-        <w:rPr>
-          <w:rStyle w:val="ng-star-inserted1"/>
-          <w:rFonts w:ascii="Arial" w:hAnsi="Arial" w:cs="Arial"/>
-          <w:color w:val="2B2D31"/>
-          <w:sz w:val="21"/>
-          <w:szCs w:val="21"/>
-        </w:rPr>
-        <w:t xml:space="preserve">), </w:t>
-      </w:r>
-      <w:proofErr w:type="spellStart"/>
+        <w:t xml:space="preserve">(bcrypt), </w:t>
+      </w:r>
       <w:r>
         <w:rPr>
           <w:rStyle w:val="ng-star-inserted1"/>
@@ -9398,7 +9247,6 @@
         </w:rPr>
         <w:t>권한별</w:t>
       </w:r>
-      <w:proofErr w:type="spellEnd"/>
       <w:r>
         <w:rPr>
           <w:rStyle w:val="ng-star-inserted1"/>
@@ -9538,7 +9386,6 @@
         </w:rPr>
         <w:t xml:space="preserve">): </w:t>
       </w:r>
-      <w:proofErr w:type="spellStart"/>
       <w:r>
         <w:rPr>
           <w:rStyle w:val="ng-star-inserted1"/>
@@ -9549,7 +9396,6 @@
         </w:rPr>
         <w:t>클라우드</w:t>
       </w:r>
-      <w:proofErr w:type="spellEnd"/>
       <w:r>
         <w:rPr>
           <w:rStyle w:val="ng-star-inserted1"/>
@@ -9744,29 +9590,7 @@
           <w:sz w:val="21"/>
           <w:szCs w:val="21"/>
         </w:rPr>
-        <w:t>(</w:t>
-      </w:r>
-      <w:proofErr w:type="spellStart"/>
-      <w:r>
-        <w:rPr>
-          <w:rStyle w:val="ng-star-inserted1"/>
-          <w:rFonts w:ascii="Arial" w:hAnsi="Arial" w:cs="Arial"/>
-          <w:color w:val="2B2D31"/>
-          <w:sz w:val="21"/>
-          <w:szCs w:val="21"/>
-        </w:rPr>
-        <w:t>Timezone</w:t>
-      </w:r>
-      <w:proofErr w:type="spellEnd"/>
-      <w:r>
-        <w:rPr>
-          <w:rStyle w:val="ng-star-inserted1"/>
-          <w:rFonts w:ascii="Arial" w:hAnsi="Arial" w:cs="Arial"/>
-          <w:color w:val="2B2D31"/>
-          <w:sz w:val="21"/>
-          <w:szCs w:val="21"/>
-        </w:rPr>
-        <w:t xml:space="preserve">): </w:t>
+        <w:t xml:space="preserve">(Timezone): </w:t>
       </w:r>
       <w:r>
         <w:rPr>
@@ -10376,7 +10200,6 @@
         </w:rPr>
         <w:t xml:space="preserve"> </w:t>
       </w:r>
-      <w:proofErr w:type="spellStart"/>
       <w:r>
         <w:rPr>
           <w:rStyle w:val="ng-star-inserted1"/>
@@ -10387,7 +10210,6 @@
         </w:rPr>
         <w:t>반응형</w:t>
       </w:r>
-      <w:proofErr w:type="spellEnd"/>
       <w:r>
         <w:rPr>
           <w:rStyle w:val="ng-star-inserted1"/>
@@ -10908,29 +10730,7 @@
           <w:sz w:val="21"/>
           <w:szCs w:val="21"/>
         </w:rPr>
-        <w:t xml:space="preserve">: 15 </w:t>
-      </w:r>
-      <w:proofErr w:type="gramStart"/>
-      <w:r>
-        <w:rPr>
-          <w:rFonts w:ascii="Arial" w:eastAsia="굴림" w:hAnsi="Arial" w:cs="Arial"/>
-          <w:color w:val="2B2D31"/>
-          <w:kern w:val="0"/>
-          <w:sz w:val="21"/>
-          <w:szCs w:val="21"/>
-        </w:rPr>
-        <w:t>days</w:t>
-      </w:r>
-      <w:proofErr w:type="gramEnd"/>
-      <w:r>
-        <w:rPr>
-          <w:rFonts w:ascii="Arial" w:eastAsia="굴림" w:hAnsi="Arial" w:cs="Arial"/>
-          <w:color w:val="2B2D31"/>
-          <w:kern w:val="0"/>
-          <w:sz w:val="21"/>
-          <w:szCs w:val="21"/>
-        </w:rPr>
-        <w:t xml:space="preserve"> base leave, with 1 additional day every 2 years of service (max 25 days).</w:t>
+        <w:t>: 15 days base leave, with 1 additional day every 2 years of service (max 25 days).</w:t>
       </w:r>
     </w:p>
     <w:p>
@@ -11248,31 +11048,17 @@
           <w:szCs w:val="21"/>
         </w:rPr>
       </w:pPr>
-      <w:proofErr w:type="spellStart"/>
-      <w:r>
-        <w:rPr>
-          <w:rFonts w:ascii="Arial" w:eastAsia="굴림" w:hAnsi="Arial" w:cs="Arial"/>
-          <w:b/>
-          <w:bCs/>
-          <w:color w:val="2B2D31"/>
-          <w:kern w:val="0"/>
-          <w:sz w:val="21"/>
-          <w:szCs w:val="21"/>
-        </w:rPr>
-        <w:t>Firestore</w:t>
-      </w:r>
-      <w:proofErr w:type="spellEnd"/>
-      <w:r>
-        <w:rPr>
-          <w:rFonts w:ascii="Arial" w:eastAsia="굴림" w:hAnsi="Arial" w:cs="Arial"/>
-          <w:b/>
-          <w:bCs/>
-          <w:color w:val="2B2D31"/>
-          <w:kern w:val="0"/>
-          <w:sz w:val="21"/>
-          <w:szCs w:val="21"/>
-        </w:rPr>
-        <w:t xml:space="preserve"> Security</w:t>
+      <w:r>
+        <w:rPr>
+          <w:rFonts w:ascii="Arial" w:eastAsia="굴림" w:hAnsi="Arial" w:cs="Arial"/>
+          <w:b/>
+          <w:bCs/>
+          <w:color w:val="2B2D31"/>
+          <w:kern w:val="0"/>
+          <w:sz w:val="21"/>
+          <w:szCs w:val="21"/>
+        </w:rPr>
+        <w:t>Firestore Security</w:t>
       </w:r>
       <w:r>
         <w:rPr>
@@ -11370,29 +11156,7 @@
           <w:sz w:val="21"/>
           <w:szCs w:val="21"/>
         </w:rPr>
-        <w:t xml:space="preserve">: Refined </w:t>
-      </w:r>
-      <w:proofErr w:type="spellStart"/>
-      <w:r>
-        <w:rPr>
-          <w:rFonts w:ascii="Arial" w:eastAsia="굴림" w:hAnsi="Arial" w:cs="Arial"/>
-          <w:color w:val="2B2D31"/>
-          <w:kern w:val="0"/>
-          <w:sz w:val="21"/>
-          <w:szCs w:val="21"/>
-        </w:rPr>
-        <w:t>TypeScript</w:t>
-      </w:r>
-      <w:proofErr w:type="spellEnd"/>
-      <w:r>
-        <w:rPr>
-          <w:rFonts w:ascii="Arial" w:eastAsia="굴림" w:hAnsi="Arial" w:cs="Arial"/>
-          <w:color w:val="2B2D31"/>
-          <w:kern w:val="0"/>
-          <w:sz w:val="21"/>
-          <w:szCs w:val="21"/>
-        </w:rPr>
-        <w:t xml:space="preserve"> interfaces and helper functions for robust data handling.</w:t>
+        <w:t>: Refined TypeScript interfaces and helper functions for robust data handling.</w:t>
       </w:r>
     </w:p>
     <w:p>
@@ -11514,31 +11278,17 @@
           <w:szCs w:val="21"/>
         </w:rPr>
       </w:pPr>
-      <w:proofErr w:type="spellStart"/>
-      <w:r>
-        <w:rPr>
-          <w:rFonts w:ascii="Arial" w:eastAsia="굴림" w:hAnsi="Arial" w:cs="Arial"/>
-          <w:b/>
-          <w:bCs/>
-          <w:color w:val="2B2D31"/>
-          <w:kern w:val="0"/>
-          <w:sz w:val="21"/>
-          <w:szCs w:val="21"/>
-        </w:rPr>
-        <w:t>Firestore</w:t>
-      </w:r>
-      <w:proofErr w:type="spellEnd"/>
-      <w:r>
-        <w:rPr>
-          <w:rFonts w:ascii="Arial" w:eastAsia="굴림" w:hAnsi="Arial" w:cs="Arial"/>
-          <w:b/>
-          <w:bCs/>
-          <w:color w:val="2B2D31"/>
-          <w:kern w:val="0"/>
-          <w:sz w:val="21"/>
-          <w:szCs w:val="21"/>
-        </w:rPr>
-        <w:t xml:space="preserve"> Rules</w:t>
+      <w:r>
+        <w:rPr>
+          <w:rFonts w:ascii="Arial" w:eastAsia="굴림" w:hAnsi="Arial" w:cs="Arial"/>
+          <w:b/>
+          <w:bCs/>
+          <w:color w:val="2B2D31"/>
+          <w:kern w:val="0"/>
+          <w:sz w:val="21"/>
+          <w:szCs w:val="21"/>
+        </w:rPr>
+        <w:t>Firestore Rules</w:t>
       </w:r>
       <w:r>
         <w:rPr>
@@ -11550,7 +11300,6 @@
         </w:rPr>
         <w:t>: The security rules have been updated and deployed to support the new </w:t>
       </w:r>
-      <w:proofErr w:type="spellStart"/>
       <w:r>
         <w:rPr>
           <w:rFonts w:ascii="Courier New" w:eastAsia="굴림" w:hAnsi="Courier New" w:cs="Arial"/>
@@ -11562,7 +11311,6 @@
         </w:rPr>
         <w:t>overtimeRequests</w:t>
       </w:r>
-      <w:proofErr w:type="spellEnd"/>
       <w:r>
         <w:rPr>
           <w:rFonts w:ascii="Arial" w:eastAsia="굴림" w:hAnsi="Arial" w:cs="Arial"/>
@@ -11714,7 +11462,6 @@
         </w:rPr>
         <w:t>Refined the </w:t>
       </w:r>
-      <w:proofErr w:type="spellStart"/>
       <w:r>
         <w:rPr>
           <w:rStyle w:val="inline-code"/>
@@ -11726,7 +11473,6 @@
         </w:rPr>
         <w:t>calculateLeaveEntitlement</w:t>
       </w:r>
-      <w:proofErr w:type="spellEnd"/>
       <w:r>
         <w:rPr>
           <w:rStyle w:val="ng-star-inserted1"/>
@@ -11859,29 +11605,7 @@
           <w:sz w:val="21"/>
           <w:szCs w:val="21"/>
         </w:rPr>
-        <w:t xml:space="preserve">: 15 </w:t>
-      </w:r>
-      <w:proofErr w:type="gramStart"/>
-      <w:r>
-        <w:rPr>
-          <w:rStyle w:val="ng-star-inserted1"/>
-          <w:rFonts w:ascii="Arial" w:hAnsi="Arial" w:cs="Arial"/>
-          <w:color w:val="2B2D31"/>
-          <w:sz w:val="21"/>
-          <w:szCs w:val="21"/>
-        </w:rPr>
-        <w:t>days</w:t>
-      </w:r>
-      <w:proofErr w:type="gramEnd"/>
-      <w:r>
-        <w:rPr>
-          <w:rStyle w:val="ng-star-inserted1"/>
-          <w:rFonts w:ascii="Arial" w:hAnsi="Arial" w:cs="Arial"/>
-          <w:color w:val="2B2D31"/>
-          <w:sz w:val="21"/>
-          <w:szCs w:val="21"/>
-        </w:rPr>
-        <w:t xml:space="preserve"> base + 1 additional day for every 2 years of service (max 25 days).</w:t>
+        <w:t>: 15 days base + 1 additional day for every 2 years of service (max 25 days).</w:t>
       </w:r>
     </w:p>
     <w:p>
@@ -12027,8 +11751,6 @@
         </w:rPr>
         <w:t>: Replaced the browser's </w:t>
       </w:r>
-      <w:proofErr w:type="spellStart"/>
-      <w:proofErr w:type="gramStart"/>
       <w:r>
         <w:rPr>
           <w:rStyle w:val="inline-code"/>
@@ -12040,8 +11762,6 @@
         </w:rPr>
         <w:t>window.prompt</w:t>
       </w:r>
-      <w:proofErr w:type="spellEnd"/>
-      <w:proofErr w:type="gramEnd"/>
       <w:r>
         <w:rPr>
           <w:rStyle w:val="ng-star-inserted1"/>
@@ -12189,7 +11909,6 @@
           <w:szCs w:val="21"/>
         </w:rPr>
       </w:pPr>
-      <w:proofErr w:type="spellStart"/>
       <w:r>
         <w:rPr>
           <w:rStyle w:val="ng-star-inserted1"/>
@@ -12202,7 +11921,6 @@
         </w:rPr>
         <w:t>연월차</w:t>
       </w:r>
-      <w:proofErr w:type="spellEnd"/>
       <w:r>
         <w:rPr>
           <w:rStyle w:val="ng-star-inserted1"/>
@@ -12239,7 +11957,6 @@
         </w:rPr>
         <w:t xml:space="preserve"> </w:t>
       </w:r>
-      <w:proofErr w:type="spellStart"/>
       <w:r>
         <w:rPr>
           <w:rStyle w:val="ng-star-inserted1"/>
@@ -12252,7 +11969,6 @@
         </w:rPr>
         <w:t>로직</w:t>
       </w:r>
-      <w:proofErr w:type="spellEnd"/>
       <w:r>
         <w:rPr>
           <w:rStyle w:val="ng-star-inserted1"/>
@@ -12265,7 +11981,6 @@
         </w:rPr>
         <w:t xml:space="preserve"> (</w:t>
       </w:r>
-      <w:proofErr w:type="spellStart"/>
       <w:r>
         <w:rPr>
           <w:rStyle w:val="inline-code"/>
@@ -12279,7 +11994,6 @@
         </w:rPr>
         <w:t>calculateLeaveEntitlement</w:t>
       </w:r>
-      <w:proofErr w:type="spellEnd"/>
       <w:r>
         <w:rPr>
           <w:rStyle w:val="ng-star-inserted1"/>
@@ -12379,7 +12093,6 @@
         </w:rPr>
         <w:t xml:space="preserve"> </w:t>
       </w:r>
-      <w:proofErr w:type="spellStart"/>
       <w:r>
         <w:rPr>
           <w:rStyle w:val="ng-star-inserted1"/>
@@ -12392,7 +12105,6 @@
         </w:rPr>
         <w:t>입사자</w:t>
       </w:r>
-      <w:proofErr w:type="spellEnd"/>
       <w:r>
         <w:rPr>
           <w:rStyle w:val="ng-star-inserted1"/>
@@ -12620,7 +12332,6 @@
         </w:rPr>
         <w:t xml:space="preserve"> </w:t>
       </w:r>
-      <w:proofErr w:type="spellStart"/>
       <w:r>
         <w:rPr>
           <w:rStyle w:val="ng-star-inserted1"/>
@@ -12633,7 +12344,6 @@
         </w:rPr>
         <w:t>입사자</w:t>
       </w:r>
-      <w:proofErr w:type="spellEnd"/>
       <w:r>
         <w:rPr>
           <w:rStyle w:val="ng-star-inserted1"/>
@@ -12841,7 +12551,6 @@
         </w:rPr>
         <w:t>(</w:t>
       </w:r>
-      <w:proofErr w:type="spellStart"/>
       <w:r>
         <w:rPr>
           <w:rStyle w:val="inline-code"/>
@@ -12853,7 +12562,6 @@
         </w:rPr>
         <w:t>joinDate</w:t>
       </w:r>
-      <w:proofErr w:type="spellEnd"/>
       <w:r>
         <w:rPr>
           <w:rStyle w:val="ng-star-inserted1"/>
@@ -13241,7 +12949,6 @@
         </w:rPr>
         <w:t xml:space="preserve"> </w:t>
       </w:r>
-      <w:proofErr w:type="spellStart"/>
       <w:r>
         <w:rPr>
           <w:rStyle w:val="ng-star-inserted1"/>
@@ -13254,7 +12961,6 @@
         </w:rPr>
         <w:t>로직</w:t>
       </w:r>
-      <w:proofErr w:type="spellEnd"/>
       <w:r>
         <w:rPr>
           <w:rStyle w:val="ng-star-inserted1"/>
@@ -13267,7 +12973,6 @@
         </w:rPr>
         <w:t xml:space="preserve"> (</w:t>
       </w:r>
-      <w:proofErr w:type="spellStart"/>
       <w:r>
         <w:rPr>
           <w:rStyle w:val="inline-code"/>
@@ -13281,7 +12986,6 @@
         </w:rPr>
         <w:t>handleApproveLeave</w:t>
       </w:r>
-      <w:proofErr w:type="spellEnd"/>
       <w:r>
         <w:rPr>
           <w:rStyle w:val="ng-star-inserted1"/>
@@ -13522,7 +13226,6 @@
         </w:rPr>
         <w:t> </w:t>
       </w:r>
-      <w:proofErr w:type="spellStart"/>
       <w:r>
         <w:rPr>
           <w:rStyle w:val="inline-code"/>
@@ -13534,7 +13237,6 @@
         </w:rPr>
         <w:t>usedLeave</w:t>
       </w:r>
-      <w:proofErr w:type="spellEnd"/>
       <w:r>
         <w:rPr>
           <w:rStyle w:val="ng-star-inserted1"/>
@@ -13642,7 +13344,6 @@
           <w:szCs w:val="21"/>
         </w:rPr>
       </w:pPr>
-      <w:proofErr w:type="spellStart"/>
       <w:r>
         <w:rPr>
           <w:rStyle w:val="ng-star-inserted1"/>
@@ -13655,7 +13356,6 @@
         </w:rPr>
         <w:t>반차</w:t>
       </w:r>
-      <w:proofErr w:type="spellEnd"/>
       <w:r>
         <w:rPr>
           <w:rStyle w:val="ng-star-inserted1"/>
@@ -14534,7 +14234,6 @@
           <w:szCs w:val="21"/>
         </w:rPr>
       </w:pPr>
-      <w:proofErr w:type="spellStart"/>
       <w:r>
         <w:rPr>
           <w:rStyle w:val="inline-code"/>
@@ -14546,7 +14245,6 @@
         </w:rPr>
         <w:t>UserProfile</w:t>
       </w:r>
-      <w:proofErr w:type="spellEnd"/>
       <w:r>
         <w:rPr>
           <w:rStyle w:val="ng-star-inserted1"/>
@@ -14577,7 +14275,6 @@
         </w:rPr>
         <w:t> </w:t>
       </w:r>
-      <w:proofErr w:type="spellStart"/>
       <w:r>
         <w:rPr>
           <w:rStyle w:val="inline-code"/>
@@ -14589,7 +14286,6 @@
         </w:rPr>
         <w:t>usedLeave</w:t>
       </w:r>
-      <w:proofErr w:type="spellEnd"/>
       <w:r>
         <w:rPr>
           <w:rStyle w:val="ng-star-inserted1"/>
@@ -14657,7 +14353,6 @@
           <w:szCs w:val="21"/>
         </w:rPr>
       </w:pPr>
-      <w:proofErr w:type="spellStart"/>
       <w:r>
         <w:rPr>
           <w:rStyle w:val="inline-code"/>
@@ -14669,7 +14364,6 @@
         </w:rPr>
         <w:t>firestore.rules</w:t>
       </w:r>
-      <w:proofErr w:type="spellEnd"/>
       <w:r>
         <w:rPr>
           <w:rStyle w:val="ng-star-inserted1"/>
@@ -14750,7 +14444,6 @@
         </w:rPr>
         <w:t> </w:t>
       </w:r>
-      <w:proofErr w:type="spellStart"/>
       <w:r>
         <w:rPr>
           <w:rStyle w:val="inline-code"/>
@@ -14762,7 +14455,6 @@
         </w:rPr>
         <w:t>usedLeave</w:t>
       </w:r>
-      <w:proofErr w:type="spellEnd"/>
       <w:r>
         <w:rPr>
           <w:rStyle w:val="ng-star-inserted1"/>
@@ -15284,13 +14976,7 @@
         </w:rPr>
       </w:pPr>
     </w:p>
-    <w:p>
-      <w:pPr>
-        <w:rPr>
-          <w:rFonts w:hint="eastAsia"/>
-        </w:rPr>
-      </w:pPr>
-    </w:p>
+    <w:p/>
     <w:p>
       <w:pPr>
         <w:pStyle w:val="ng-star-inserted"/>
@@ -15303,7 +14989,6 @@
           <w:szCs w:val="21"/>
         </w:rPr>
       </w:pPr>
-      <w:proofErr w:type="spellStart"/>
       <w:r>
         <w:rPr>
           <w:rStyle w:val="ng-star-inserted1"/>
@@ -15314,7 +14999,6 @@
         </w:rPr>
         <w:t>지출결의</w:t>
       </w:r>
-      <w:proofErr w:type="spellEnd"/>
       <w:r>
         <w:rPr>
           <w:rStyle w:val="ng-star-inserted1"/>
@@ -15613,7 +15297,6 @@
         </w:rPr>
         <w:t> </w:t>
       </w:r>
-      <w:proofErr w:type="spellStart"/>
       <w:r>
         <w:rPr>
           <w:rStyle w:val="inline-code"/>
@@ -15625,7 +15308,6 @@
         </w:rPr>
         <w:t>finance_director</w:t>
       </w:r>
-      <w:proofErr w:type="spellEnd"/>
       <w:r>
         <w:rPr>
           <w:rStyle w:val="ng-star-inserted1"/>
@@ -15636,7 +15318,6 @@
         </w:rPr>
         <w:t> (</w:t>
       </w:r>
-      <w:proofErr w:type="spellStart"/>
       <w:r>
         <w:rPr>
           <w:rStyle w:val="ng-star-inserted1"/>
@@ -15647,7 +15328,6 @@
         </w:rPr>
         <w:t>재무본부장</w:t>
       </w:r>
-      <w:proofErr w:type="spellEnd"/>
       <w:r>
         <w:rPr>
           <w:rStyle w:val="ng-star-inserted1"/>
@@ -16244,7 +15924,6 @@
         </w:rPr>
         <w:t xml:space="preserve"> </w:t>
       </w:r>
-      <w:proofErr w:type="spellStart"/>
       <w:r>
         <w:rPr>
           <w:rStyle w:val="ng-star-inserted1"/>
@@ -16255,7 +15934,6 @@
         </w:rPr>
         <w:t>상세내역</w:t>
       </w:r>
-      <w:proofErr w:type="spellEnd"/>
       <w:r>
         <w:rPr>
           <w:rStyle w:val="ng-star-inserted1"/>
@@ -16346,7 +16024,6 @@
         </w:rPr>
         <w:t xml:space="preserve"> </w:t>
       </w:r>
-      <w:proofErr w:type="spellStart"/>
       <w:r>
         <w:rPr>
           <w:rStyle w:val="ng-star-inserted1"/>
@@ -16367,7 +16044,6 @@
         </w:rPr>
         <w:t>를</w:t>
       </w:r>
-      <w:proofErr w:type="spellEnd"/>
       <w:r>
         <w:rPr>
           <w:rStyle w:val="ng-star-inserted1"/>
@@ -16436,17 +16112,7 @@
           <w:sz w:val="21"/>
           <w:szCs w:val="21"/>
         </w:rPr>
-        <w:t>.</w:t>
-      </w:r>
-      <w:r>
-        <w:rPr>
-          <w:rStyle w:val="ng-star-inserted1"/>
-          <w:rFonts w:ascii="Arial" w:hAnsi="Arial" w:cs="Arial"/>
-          <w:color w:val="2B2D31"/>
-          <w:sz w:val="21"/>
-          <w:szCs w:val="21"/>
-        </w:rPr>
-        <w:t xml:space="preserve"> </w:t>
+        <w:t xml:space="preserve">. </w:t>
       </w:r>
     </w:p>
     <w:p>
@@ -16599,7 +16265,6 @@
         </w:rPr>
         <w:t xml:space="preserve"> '</w:t>
       </w:r>
-      <w:proofErr w:type="spellStart"/>
       <w:r>
         <w:rPr>
           <w:rStyle w:val="ng-star-inserted1"/>
@@ -16610,7 +16275,6 @@
         </w:rPr>
         <w:t>재무본부장</w:t>
       </w:r>
-      <w:proofErr w:type="spellEnd"/>
       <w:r>
         <w:rPr>
           <w:rStyle w:val="ng-star-inserted1"/>
@@ -16758,7 +16422,6 @@
         </w:rPr>
         <w:t xml:space="preserve"> (</w:t>
       </w:r>
-      <w:proofErr w:type="spellStart"/>
       <w:r>
         <w:rPr>
           <w:rStyle w:val="ng-star-inserted1"/>
@@ -16771,7 +16434,6 @@
         </w:rPr>
         <w:t>재무본부장</w:t>
       </w:r>
-      <w:proofErr w:type="spellEnd"/>
       <w:r>
         <w:rPr>
           <w:rStyle w:val="ng-star-inserted1"/>
@@ -17110,7 +16772,6 @@
           <w:szCs w:val="21"/>
         </w:rPr>
       </w:pPr>
-      <w:proofErr w:type="spellStart"/>
       <w:r>
         <w:rPr>
           <w:rStyle w:val="ng-star-inserted1"/>
@@ -17123,7 +16784,6 @@
         </w:rPr>
         <w:t>지출결의</w:t>
       </w:r>
-      <w:proofErr w:type="spellEnd"/>
       <w:r>
         <w:rPr>
           <w:rStyle w:val="ng-star-inserted1"/>
@@ -17331,7 +16991,6 @@
         </w:rPr>
         <w:t>'</w:t>
       </w:r>
-      <w:proofErr w:type="spellStart"/>
       <w:r>
         <w:rPr>
           <w:rStyle w:val="ng-star-inserted1"/>
@@ -17344,7 +17003,6 @@
         </w:rPr>
         <w:t>지출결의</w:t>
       </w:r>
-      <w:proofErr w:type="spellEnd"/>
       <w:r>
         <w:rPr>
           <w:rStyle w:val="ng-star-inserted1"/>
@@ -17496,7 +17154,6 @@
         </w:rPr>
         <w:t xml:space="preserve"> </w:t>
       </w:r>
-      <w:proofErr w:type="spellStart"/>
       <w:r>
         <w:rPr>
           <w:rStyle w:val="ng-star-inserted1"/>
@@ -17509,7 +17166,6 @@
         </w:rPr>
         <w:t>필터링</w:t>
       </w:r>
-      <w:proofErr w:type="spellEnd"/>
       <w:r>
         <w:rPr>
           <w:rStyle w:val="ng-star-inserted1"/>
@@ -18131,7 +17787,6 @@
           <w:szCs w:val="21"/>
         </w:rPr>
       </w:pPr>
-      <w:proofErr w:type="spellStart"/>
       <w:r>
         <w:rPr>
           <w:rStyle w:val="inline-code"/>
@@ -18143,7 +17798,6 @@
         </w:rPr>
         <w:t>firestore.rules</w:t>
       </w:r>
-      <w:proofErr w:type="spellEnd"/>
       <w:r>
         <w:rPr>
           <w:rStyle w:val="ng-star-inserted1"/>
@@ -18350,9 +18004,28 @@
           <w:szCs w:val="21"/>
           <w:bdr w:val="none" w:sz="0" w:space="0" w:color="auto" w:frame="1"/>
         </w:rPr>
-        <w:t>firebase-</w:t>
-      </w:r>
-      <w:proofErr w:type="spellStart"/>
+        <w:t>firebase-blueprint.json</w:t>
+      </w:r>
+      <w:r>
+        <w:rPr>
+          <w:rStyle w:val="ng-star-inserted1"/>
+          <w:rFonts w:ascii="Arial" w:hAnsi="Arial" w:cs="Arial"/>
+          <w:color w:val="2B2D31"/>
+          <w:sz w:val="21"/>
+          <w:szCs w:val="21"/>
+        </w:rPr>
+        <w:t>에</w:t>
+      </w:r>
+      <w:r>
+        <w:rPr>
+          <w:rStyle w:val="ng-star-inserted1"/>
+          <w:rFonts w:ascii="Arial" w:hAnsi="Arial" w:cs="Arial"/>
+          <w:color w:val="2B2D31"/>
+          <w:sz w:val="21"/>
+          <w:szCs w:val="21"/>
+        </w:rPr>
+        <w:t> </w:t>
+      </w:r>
       <w:r>
         <w:rPr>
           <w:rStyle w:val="inline-code"/>
@@ -18362,18 +18035,7 @@
           <w:szCs w:val="21"/>
           <w:bdr w:val="none" w:sz="0" w:space="0" w:color="auto" w:frame="1"/>
         </w:rPr>
-        <w:t>blueprint.json</w:t>
-      </w:r>
-      <w:proofErr w:type="spellEnd"/>
-      <w:r>
-        <w:rPr>
-          <w:rStyle w:val="ng-star-inserted1"/>
-          <w:rFonts w:ascii="Arial" w:hAnsi="Arial" w:cs="Arial"/>
-          <w:color w:val="2B2D31"/>
-          <w:sz w:val="21"/>
-          <w:szCs w:val="21"/>
-        </w:rPr>
-        <w:t>에</w:t>
+        <w:t>ExpenseRequest</w:t>
       </w:r>
       <w:r>
         <w:rPr>
@@ -18385,30 +18047,6 @@
         </w:rPr>
         <w:t> </w:t>
       </w:r>
-      <w:proofErr w:type="spellStart"/>
-      <w:r>
-        <w:rPr>
-          <w:rStyle w:val="inline-code"/>
-          <w:rFonts w:ascii="Courier New" w:hAnsi="Courier New" w:cs="Courier New"/>
-          <w:color w:val="2B2D31"/>
-          <w:sz w:val="21"/>
-          <w:szCs w:val="21"/>
-          <w:bdr w:val="none" w:sz="0" w:space="0" w:color="auto" w:frame="1"/>
-        </w:rPr>
-        <w:t>ExpenseRequest</w:t>
-      </w:r>
-      <w:proofErr w:type="spellEnd"/>
-      <w:r>
-        <w:rPr>
-          <w:rStyle w:val="ng-star-inserted1"/>
-          <w:rFonts w:ascii="Arial" w:hAnsi="Arial" w:cs="Arial"/>
-          <w:color w:val="2B2D31"/>
-          <w:sz w:val="21"/>
-          <w:szCs w:val="21"/>
-        </w:rPr>
-        <w:t> </w:t>
-      </w:r>
-      <w:proofErr w:type="spellStart"/>
       <w:r>
         <w:rPr>
           <w:rStyle w:val="ng-star-inserted1"/>
@@ -18419,7 +18057,6 @@
         </w:rPr>
         <w:t>엔티티를</w:t>
       </w:r>
-      <w:proofErr w:type="spellEnd"/>
       <w:r>
         <w:rPr>
           <w:rStyle w:val="ng-star-inserted1"/>
@@ -18484,7 +18121,6 @@
         </w:rPr>
         <w:t xml:space="preserve"> </w:t>
       </w:r>
-      <w:proofErr w:type="spellStart"/>
       <w:r>
         <w:rPr>
           <w:rStyle w:val="ng-star-inserted1"/>
@@ -18495,7 +18131,6 @@
         </w:rPr>
         <w:t>사이드바의</w:t>
       </w:r>
-      <w:proofErr w:type="spellEnd"/>
       <w:r>
         <w:rPr>
           <w:rStyle w:val="ng-star-inserted1"/>
@@ -18518,7 +18153,6 @@
         </w:rPr>
         <w:t>'</w:t>
       </w:r>
-      <w:proofErr w:type="spellStart"/>
       <w:r>
         <w:rPr>
           <w:rStyle w:val="ng-star-inserted1"/>
@@ -18531,7 +18165,6 @@
         </w:rPr>
         <w:t>지출결의</w:t>
       </w:r>
-      <w:proofErr w:type="spellEnd"/>
       <w:r>
         <w:rPr>
           <w:rStyle w:val="ng-star-inserted1"/>
@@ -19345,7 +18978,6 @@
         </w:rPr>
         <w:t xml:space="preserve"> </w:t>
       </w:r>
-      <w:proofErr w:type="spellStart"/>
       <w:r>
         <w:rPr>
           <w:rFonts w:ascii="Segoe UI" w:hAnsi="Segoe UI" w:cs="Segoe UI"/>
@@ -19354,7 +18986,6 @@
         </w:rPr>
         <w:t>지출결의</w:t>
       </w:r>
-      <w:proofErr w:type="spellEnd"/>
       <w:r>
         <w:rPr>
           <w:rFonts w:ascii="Segoe UI" w:hAnsi="Segoe UI" w:cs="Segoe UI"/>
@@ -19606,7 +19237,6 @@
         </w:rPr>
         <w:t xml:space="preserve"> (</w:t>
       </w:r>
-      <w:proofErr w:type="spellStart"/>
       <w:r>
         <w:rPr>
           <w:rFonts w:ascii="Consolas" w:eastAsia="굴림체" w:hAnsi="Consolas" w:cs="굴림체"/>
@@ -19620,7 +19250,6 @@
         </w:rPr>
         <w:t>firebase.json</w:t>
       </w:r>
-      <w:proofErr w:type="spellEnd"/>
       <w:r>
         <w:rPr>
           <w:rFonts w:ascii="Segoe UI" w:eastAsia="굴림" w:hAnsi="Segoe UI" w:cs="Segoe UI"/>
@@ -19851,31 +19480,7 @@
           <w:szCs w:val="18"/>
           <w:bdr w:val="single" w:sz="2" w:space="0" w:color="E5E7EB" w:frame="1"/>
         </w:rPr>
-        <w:t>/</w:t>
-      </w:r>
-      <w:proofErr w:type="spellStart"/>
-      <w:r>
-        <w:rPr>
-          <w:rFonts w:ascii="Consolas" w:eastAsia="굴림체" w:hAnsi="Consolas" w:cs="굴림체"/>
-          <w:color w:val="A31515"/>
-          <w:kern w:val="0"/>
-          <w:sz w:val="18"/>
-          <w:szCs w:val="18"/>
-          <w:bdr w:val="single" w:sz="2" w:space="0" w:color="E5E7EB" w:frame="1"/>
-        </w:rPr>
-        <w:t>hr</w:t>
-      </w:r>
-      <w:proofErr w:type="spellEnd"/>
-      <w:r>
-        <w:rPr>
-          <w:rFonts w:ascii="Consolas" w:eastAsia="굴림체" w:hAnsi="Consolas" w:cs="굴림체"/>
-          <w:color w:val="A31515"/>
-          <w:kern w:val="0"/>
-          <w:sz w:val="18"/>
-          <w:szCs w:val="18"/>
-          <w:bdr w:val="single" w:sz="2" w:space="0" w:color="E5E7EB" w:frame="1"/>
-        </w:rPr>
-        <w:t>/**</w:t>
+        <w:t>/hr/**</w:t>
       </w:r>
       <w:r>
         <w:rPr>
@@ -20030,7 +19635,6 @@
         </w:rPr>
         <w:t xml:space="preserve"> </w:t>
       </w:r>
-      <w:proofErr w:type="spellStart"/>
       <w:r>
         <w:rPr>
           <w:rFonts w:ascii="Segoe UI" w:eastAsia="굴림" w:hAnsi="Segoe UI" w:cs="Segoe UI"/>
@@ -20040,17 +19644,15 @@
         </w:rPr>
         <w:t>통신되도록</w:t>
       </w:r>
-      <w:proofErr w:type="spellEnd"/>
-      <w:r>
-        <w:rPr>
-          <w:rFonts w:ascii="Segoe UI" w:eastAsia="굴림" w:hAnsi="Segoe UI" w:cs="Segoe UI"/>
-          <w:color w:val="616161"/>
-          <w:kern w:val="0"/>
-          <w:szCs w:val="20"/>
-        </w:rPr>
-        <w:t xml:space="preserve"> </w:t>
-      </w:r>
-      <w:proofErr w:type="spellStart"/>
+      <w:r>
+        <w:rPr>
+          <w:rFonts w:ascii="Segoe UI" w:eastAsia="굴림" w:hAnsi="Segoe UI" w:cs="Segoe UI"/>
+          <w:color w:val="616161"/>
+          <w:kern w:val="0"/>
+          <w:szCs w:val="20"/>
+        </w:rPr>
+        <w:t xml:space="preserve"> </w:t>
+      </w:r>
       <w:r>
         <w:rPr>
           <w:rFonts w:ascii="Segoe UI" w:eastAsia="굴림" w:hAnsi="Segoe UI" w:cs="Segoe UI"/>
@@ -20060,7 +19662,6 @@
         </w:rPr>
         <w:t>클라우드용</w:t>
       </w:r>
-      <w:proofErr w:type="spellEnd"/>
       <w:r>
         <w:rPr>
           <w:rFonts w:ascii="Segoe UI" w:eastAsia="굴림" w:hAnsi="Segoe UI" w:cs="Segoe UI"/>
@@ -20171,7 +19772,6 @@
           <w:szCs w:val="20"/>
         </w:rPr>
       </w:pPr>
-      <w:proofErr w:type="spellStart"/>
       <w:r>
         <w:rPr>
           <w:rFonts w:ascii="Segoe UI" w:eastAsia="굴림" w:hAnsi="Segoe UI" w:cs="Segoe UI"/>
@@ -20184,7 +19784,6 @@
         </w:rPr>
         <w:t>리액트</w:t>
       </w:r>
-      <w:proofErr w:type="spellEnd"/>
       <w:r>
         <w:rPr>
           <w:rFonts w:ascii="Segoe UI" w:eastAsia="굴림" w:hAnsi="Segoe UI" w:cs="Segoe UI"/>
@@ -20245,7 +19844,6 @@
         </w:rPr>
         <w:t>(</w:t>
       </w:r>
-      <w:proofErr w:type="spellStart"/>
       <w:r>
         <w:rPr>
           <w:rFonts w:ascii="Consolas" w:eastAsia="굴림체" w:hAnsi="Consolas" w:cs="굴림체"/>
@@ -20259,7 +19857,6 @@
         </w:rPr>
         <w:t>App.tsx</w:t>
       </w:r>
-      <w:proofErr w:type="spellEnd"/>
       <w:r>
         <w:rPr>
           <w:rFonts w:ascii="Segoe UI" w:eastAsia="굴림" w:hAnsi="Segoe UI" w:cs="Segoe UI"/>
@@ -20380,9 +19977,107 @@
           <w:szCs w:val="18"/>
           <w:bdr w:val="single" w:sz="2" w:space="0" w:color="E5E7EB" w:frame="1"/>
         </w:rPr>
-        <w:t>&lt;</w:t>
-      </w:r>
-      <w:proofErr w:type="spellStart"/>
+        <w:t>&lt;BrowserRouter basename="/hr"&gt;</w:t>
+      </w:r>
+      <w:r>
+        <w:rPr>
+          <w:rFonts w:ascii="Segoe UI" w:eastAsia="굴림" w:hAnsi="Segoe UI" w:cs="Segoe UI"/>
+          <w:color w:val="616161"/>
+          <w:kern w:val="0"/>
+          <w:szCs w:val="20"/>
+        </w:rPr>
+        <w:t> </w:t>
+      </w:r>
+      <w:r>
+        <w:rPr>
+          <w:rFonts w:ascii="Segoe UI" w:eastAsia="굴림" w:hAnsi="Segoe UI" w:cs="Segoe UI"/>
+          <w:color w:val="616161"/>
+          <w:kern w:val="0"/>
+          <w:szCs w:val="20"/>
+        </w:rPr>
+        <w:t>값을</w:t>
+      </w:r>
+      <w:r>
+        <w:rPr>
+          <w:rFonts w:ascii="Segoe UI" w:eastAsia="굴림" w:hAnsi="Segoe UI" w:cs="Segoe UI"/>
+          <w:color w:val="616161"/>
+          <w:kern w:val="0"/>
+          <w:szCs w:val="20"/>
+        </w:rPr>
+        <w:t xml:space="preserve"> </w:t>
+      </w:r>
+      <w:r>
+        <w:rPr>
+          <w:rFonts w:ascii="Segoe UI" w:eastAsia="굴림" w:hAnsi="Segoe UI" w:cs="Segoe UI"/>
+          <w:color w:val="616161"/>
+          <w:kern w:val="0"/>
+          <w:szCs w:val="20"/>
+        </w:rPr>
+        <w:t>반영하여</w:t>
+      </w:r>
+      <w:r>
+        <w:rPr>
+          <w:rFonts w:ascii="Segoe UI" w:eastAsia="굴림" w:hAnsi="Segoe UI" w:cs="Segoe UI"/>
+          <w:color w:val="616161"/>
+          <w:kern w:val="0"/>
+          <w:szCs w:val="20"/>
+        </w:rPr>
+        <w:t xml:space="preserve">, </w:t>
+      </w:r>
+      <w:r>
+        <w:rPr>
+          <w:rFonts w:ascii="Segoe UI" w:eastAsia="굴림" w:hAnsi="Segoe UI" w:cs="Segoe UI"/>
+          <w:color w:val="616161"/>
+          <w:kern w:val="0"/>
+          <w:szCs w:val="20"/>
+        </w:rPr>
+        <w:t>실제</w:t>
+      </w:r>
+      <w:r>
+        <w:rPr>
+          <w:rFonts w:ascii="Segoe UI" w:eastAsia="굴림" w:hAnsi="Segoe UI" w:cs="Segoe UI"/>
+          <w:color w:val="616161"/>
+          <w:kern w:val="0"/>
+          <w:szCs w:val="20"/>
+        </w:rPr>
+        <w:t xml:space="preserve"> </w:t>
+      </w:r>
+      <w:r>
+        <w:rPr>
+          <w:rFonts w:ascii="Segoe UI" w:eastAsia="굴림" w:hAnsi="Segoe UI" w:cs="Segoe UI"/>
+          <w:color w:val="616161"/>
+          <w:kern w:val="0"/>
+          <w:szCs w:val="20"/>
+        </w:rPr>
+        <w:t>브라우저</w:t>
+      </w:r>
+      <w:r>
+        <w:rPr>
+          <w:rFonts w:ascii="Segoe UI" w:eastAsia="굴림" w:hAnsi="Segoe UI" w:cs="Segoe UI"/>
+          <w:color w:val="616161"/>
+          <w:kern w:val="0"/>
+          <w:szCs w:val="20"/>
+        </w:rPr>
+        <w:t xml:space="preserve"> </w:t>
+      </w:r>
+      <w:r>
+        <w:rPr>
+          <w:rFonts w:ascii="Segoe UI" w:eastAsia="굴림" w:hAnsi="Segoe UI" w:cs="Segoe UI"/>
+          <w:color w:val="616161"/>
+          <w:kern w:val="0"/>
+          <w:szCs w:val="20"/>
+        </w:rPr>
+        <w:t>주소창에</w:t>
+      </w:r>
+      <w:r>
+        <w:rPr>
+          <w:rFonts w:ascii="Segoe UI" w:eastAsia="굴림" w:hAnsi="Segoe UI" w:cs="Segoe UI"/>
+          <w:color w:val="616161"/>
+          <w:kern w:val="0"/>
+          <w:szCs w:val="20"/>
+        </w:rPr>
+        <w:t> </w:t>
+      </w:r>
       <w:r>
         <w:rPr>
           <w:rFonts w:ascii="Consolas" w:eastAsia="굴림체" w:hAnsi="Consolas" w:cs="굴림체"/>
@@ -20392,9 +20087,143 @@
           <w:szCs w:val="18"/>
           <w:bdr w:val="single" w:sz="2" w:space="0" w:color="E5E7EB" w:frame="1"/>
         </w:rPr>
-        <w:t>BrowserRouter</w:t>
-      </w:r>
-      <w:proofErr w:type="spellEnd"/>
+        <w:t>/hr/dashboard</w:t>
+      </w:r>
+      <w:r>
+        <w:rPr>
+          <w:rFonts w:ascii="Segoe UI" w:eastAsia="굴림" w:hAnsi="Segoe UI" w:cs="Segoe UI"/>
+          <w:color w:val="616161"/>
+          <w:kern w:val="0"/>
+          <w:szCs w:val="20"/>
+        </w:rPr>
+        <w:t> </w:t>
+      </w:r>
+      <w:r>
+        <w:rPr>
+          <w:rFonts w:ascii="Segoe UI" w:eastAsia="굴림" w:hAnsi="Segoe UI" w:cs="Segoe UI"/>
+          <w:color w:val="616161"/>
+          <w:kern w:val="0"/>
+          <w:szCs w:val="20"/>
+        </w:rPr>
+        <w:t>처럼</w:t>
+      </w:r>
+      <w:r>
+        <w:rPr>
+          <w:rFonts w:ascii="Segoe UI" w:eastAsia="굴림" w:hAnsi="Segoe UI" w:cs="Segoe UI"/>
+          <w:color w:val="616161"/>
+          <w:kern w:val="0"/>
+          <w:szCs w:val="20"/>
+        </w:rPr>
+        <w:t xml:space="preserve"> </w:t>
+      </w:r>
+      <w:r>
+        <w:rPr>
+          <w:rFonts w:ascii="Segoe UI" w:eastAsia="굴림" w:hAnsi="Segoe UI" w:cs="Segoe UI"/>
+          <w:color w:val="616161"/>
+          <w:kern w:val="0"/>
+          <w:szCs w:val="20"/>
+        </w:rPr>
+        <w:t>찍히더라도</w:t>
+      </w:r>
+      <w:r>
+        <w:rPr>
+          <w:rFonts w:ascii="Segoe UI" w:eastAsia="굴림" w:hAnsi="Segoe UI" w:cs="Segoe UI"/>
+          <w:color w:val="616161"/>
+          <w:kern w:val="0"/>
+          <w:szCs w:val="20"/>
+        </w:rPr>
+        <w:t xml:space="preserve"> </w:t>
+      </w:r>
+      <w:r>
+        <w:rPr>
+          <w:rFonts w:ascii="Segoe UI" w:eastAsia="굴림" w:hAnsi="Segoe UI" w:cs="Segoe UI"/>
+          <w:color w:val="616161"/>
+          <w:kern w:val="0"/>
+          <w:szCs w:val="20"/>
+        </w:rPr>
+        <w:t>내부에선</w:t>
+      </w:r>
+      <w:r>
+        <w:rPr>
+          <w:rFonts w:ascii="Segoe UI" w:eastAsia="굴림" w:hAnsi="Segoe UI" w:cs="Segoe UI"/>
+          <w:color w:val="616161"/>
+          <w:kern w:val="0"/>
+          <w:szCs w:val="20"/>
+        </w:rPr>
+        <w:t xml:space="preserve"> </w:t>
+      </w:r>
+      <w:r>
+        <w:rPr>
+          <w:rFonts w:ascii="Segoe UI" w:eastAsia="굴림" w:hAnsi="Segoe UI" w:cs="Segoe UI"/>
+          <w:color w:val="616161"/>
+          <w:kern w:val="0"/>
+          <w:szCs w:val="20"/>
+        </w:rPr>
+        <w:t>충돌</w:t>
+      </w:r>
+      <w:r>
+        <w:rPr>
+          <w:rFonts w:ascii="Segoe UI" w:eastAsia="굴림" w:hAnsi="Segoe UI" w:cs="Segoe UI"/>
+          <w:color w:val="616161"/>
+          <w:kern w:val="0"/>
+          <w:szCs w:val="20"/>
+        </w:rPr>
+        <w:t xml:space="preserve"> </w:t>
+      </w:r>
+      <w:r>
+        <w:rPr>
+          <w:rFonts w:ascii="Segoe UI" w:eastAsia="굴림" w:hAnsi="Segoe UI" w:cs="Segoe UI"/>
+          <w:color w:val="616161"/>
+          <w:kern w:val="0"/>
+          <w:szCs w:val="20"/>
+        </w:rPr>
+        <w:t>없이</w:t>
+      </w:r>
+      <w:r>
+        <w:rPr>
+          <w:rFonts w:ascii="Segoe UI" w:eastAsia="굴림" w:hAnsi="Segoe UI" w:cs="Segoe UI"/>
+          <w:color w:val="616161"/>
+          <w:kern w:val="0"/>
+          <w:szCs w:val="20"/>
+        </w:rPr>
+        <w:t xml:space="preserve"> </w:t>
+      </w:r>
+      <w:r>
+        <w:rPr>
+          <w:rFonts w:ascii="Segoe UI" w:eastAsia="굴림" w:hAnsi="Segoe UI" w:cs="Segoe UI"/>
+          <w:color w:val="616161"/>
+          <w:kern w:val="0"/>
+          <w:szCs w:val="20"/>
+        </w:rPr>
+        <w:t>개발자가</w:t>
+      </w:r>
+      <w:r>
+        <w:rPr>
+          <w:rFonts w:ascii="Segoe UI" w:eastAsia="굴림" w:hAnsi="Segoe UI" w:cs="Segoe UI"/>
+          <w:color w:val="616161"/>
+          <w:kern w:val="0"/>
+          <w:szCs w:val="20"/>
+        </w:rPr>
+        <w:t xml:space="preserve"> </w:t>
+      </w:r>
+      <w:r>
+        <w:rPr>
+          <w:rFonts w:ascii="Segoe UI" w:eastAsia="굴림" w:hAnsi="Segoe UI" w:cs="Segoe UI"/>
+          <w:color w:val="616161"/>
+          <w:kern w:val="0"/>
+          <w:szCs w:val="20"/>
+        </w:rPr>
+        <w:t>작성한</w:t>
+      </w:r>
+      <w:r>
+        <w:rPr>
+          <w:rFonts w:ascii="Segoe UI" w:eastAsia="굴림" w:hAnsi="Segoe UI" w:cs="Segoe UI"/>
+          <w:color w:val="616161"/>
+          <w:kern w:val="0"/>
+          <w:szCs w:val="20"/>
+        </w:rPr>
+        <w:t> </w:t>
+      </w:r>
       <w:r>
         <w:rPr>
           <w:rFonts w:ascii="Consolas" w:eastAsia="굴림체" w:hAnsi="Consolas" w:cs="굴림체"/>
@@ -20404,55 +20233,7 @@
           <w:szCs w:val="18"/>
           <w:bdr w:val="single" w:sz="2" w:space="0" w:color="E5E7EB" w:frame="1"/>
         </w:rPr>
-        <w:t xml:space="preserve"> </w:t>
-      </w:r>
-      <w:proofErr w:type="spellStart"/>
-      <w:r>
-        <w:rPr>
-          <w:rFonts w:ascii="Consolas" w:eastAsia="굴림체" w:hAnsi="Consolas" w:cs="굴림체"/>
-          <w:color w:val="A31515"/>
-          <w:kern w:val="0"/>
-          <w:sz w:val="18"/>
-          <w:szCs w:val="18"/>
-          <w:bdr w:val="single" w:sz="2" w:space="0" w:color="E5E7EB" w:frame="1"/>
-        </w:rPr>
-        <w:t>basename</w:t>
-      </w:r>
-      <w:proofErr w:type="spellEnd"/>
-      <w:r>
-        <w:rPr>
-          <w:rFonts w:ascii="Consolas" w:eastAsia="굴림체" w:hAnsi="Consolas" w:cs="굴림체"/>
-          <w:color w:val="A31515"/>
-          <w:kern w:val="0"/>
-          <w:sz w:val="18"/>
-          <w:szCs w:val="18"/>
-          <w:bdr w:val="single" w:sz="2" w:space="0" w:color="E5E7EB" w:frame="1"/>
-        </w:rPr>
-        <w:t>="/</w:t>
-      </w:r>
-      <w:proofErr w:type="spellStart"/>
-      <w:r>
-        <w:rPr>
-          <w:rFonts w:ascii="Consolas" w:eastAsia="굴림체" w:hAnsi="Consolas" w:cs="굴림체"/>
-          <w:color w:val="A31515"/>
-          <w:kern w:val="0"/>
-          <w:sz w:val="18"/>
-          <w:szCs w:val="18"/>
-          <w:bdr w:val="single" w:sz="2" w:space="0" w:color="E5E7EB" w:frame="1"/>
-        </w:rPr>
-        <w:t>hr</w:t>
-      </w:r>
-      <w:proofErr w:type="spellEnd"/>
-      <w:r>
-        <w:rPr>
-          <w:rFonts w:ascii="Consolas" w:eastAsia="굴림체" w:hAnsi="Consolas" w:cs="굴림체"/>
-          <w:color w:val="A31515"/>
-          <w:kern w:val="0"/>
-          <w:sz w:val="18"/>
-          <w:szCs w:val="18"/>
-          <w:bdr w:val="single" w:sz="2" w:space="0" w:color="E5E7EB" w:frame="1"/>
-        </w:rPr>
-        <w:t>"&gt;</w:t>
+        <w:t>/dashboard</w:t>
       </w:r>
       <w:r>
         <w:rPr>
@@ -20470,294 +20251,8 @@
           <w:kern w:val="0"/>
           <w:szCs w:val="20"/>
         </w:rPr>
-        <w:t>값을</w:t>
-      </w:r>
-      <w:r>
-        <w:rPr>
-          <w:rFonts w:ascii="Segoe UI" w:eastAsia="굴림" w:hAnsi="Segoe UI" w:cs="Segoe UI"/>
-          <w:color w:val="616161"/>
-          <w:kern w:val="0"/>
-          <w:szCs w:val="20"/>
-        </w:rPr>
-        <w:t xml:space="preserve"> </w:t>
-      </w:r>
-      <w:r>
-        <w:rPr>
-          <w:rFonts w:ascii="Segoe UI" w:eastAsia="굴림" w:hAnsi="Segoe UI" w:cs="Segoe UI"/>
-          <w:color w:val="616161"/>
-          <w:kern w:val="0"/>
-          <w:szCs w:val="20"/>
-        </w:rPr>
-        <w:t>반영하여</w:t>
-      </w:r>
-      <w:r>
-        <w:rPr>
-          <w:rFonts w:ascii="Segoe UI" w:eastAsia="굴림" w:hAnsi="Segoe UI" w:cs="Segoe UI"/>
-          <w:color w:val="616161"/>
-          <w:kern w:val="0"/>
-          <w:szCs w:val="20"/>
-        </w:rPr>
-        <w:t xml:space="preserve">, </w:t>
-      </w:r>
-      <w:r>
-        <w:rPr>
-          <w:rFonts w:ascii="Segoe UI" w:eastAsia="굴림" w:hAnsi="Segoe UI" w:cs="Segoe UI"/>
-          <w:color w:val="616161"/>
-          <w:kern w:val="0"/>
-          <w:szCs w:val="20"/>
-        </w:rPr>
-        <w:t>실제</w:t>
-      </w:r>
-      <w:r>
-        <w:rPr>
-          <w:rFonts w:ascii="Segoe UI" w:eastAsia="굴림" w:hAnsi="Segoe UI" w:cs="Segoe UI"/>
-          <w:color w:val="616161"/>
-          <w:kern w:val="0"/>
-          <w:szCs w:val="20"/>
-        </w:rPr>
-        <w:t xml:space="preserve"> </w:t>
-      </w:r>
-      <w:r>
-        <w:rPr>
-          <w:rFonts w:ascii="Segoe UI" w:eastAsia="굴림" w:hAnsi="Segoe UI" w:cs="Segoe UI"/>
-          <w:color w:val="616161"/>
-          <w:kern w:val="0"/>
-          <w:szCs w:val="20"/>
-        </w:rPr>
-        <w:t>브라우저</w:t>
-      </w:r>
-      <w:r>
-        <w:rPr>
-          <w:rFonts w:ascii="Segoe UI" w:eastAsia="굴림" w:hAnsi="Segoe UI" w:cs="Segoe UI"/>
-          <w:color w:val="616161"/>
-          <w:kern w:val="0"/>
-          <w:szCs w:val="20"/>
-        </w:rPr>
-        <w:t xml:space="preserve"> </w:t>
-      </w:r>
-      <w:proofErr w:type="spellStart"/>
-      <w:r>
-        <w:rPr>
-          <w:rFonts w:ascii="Segoe UI" w:eastAsia="굴림" w:hAnsi="Segoe UI" w:cs="Segoe UI"/>
-          <w:color w:val="616161"/>
-          <w:kern w:val="0"/>
-          <w:szCs w:val="20"/>
-        </w:rPr>
-        <w:t>주소창에</w:t>
-      </w:r>
-      <w:proofErr w:type="spellEnd"/>
-      <w:r>
-        <w:rPr>
-          <w:rFonts w:ascii="Segoe UI" w:eastAsia="굴림" w:hAnsi="Segoe UI" w:cs="Segoe UI"/>
-          <w:color w:val="616161"/>
-          <w:kern w:val="0"/>
-          <w:szCs w:val="20"/>
-        </w:rPr>
-        <w:t> </w:t>
-      </w:r>
-      <w:r>
-        <w:rPr>
-          <w:rFonts w:ascii="Consolas" w:eastAsia="굴림체" w:hAnsi="Consolas" w:cs="굴림체"/>
-          <w:color w:val="A31515"/>
-          <w:kern w:val="0"/>
-          <w:sz w:val="18"/>
-          <w:szCs w:val="18"/>
-          <w:bdr w:val="single" w:sz="2" w:space="0" w:color="E5E7EB" w:frame="1"/>
-        </w:rPr>
-        <w:t>/</w:t>
-      </w:r>
-      <w:proofErr w:type="spellStart"/>
-      <w:r>
-        <w:rPr>
-          <w:rFonts w:ascii="Consolas" w:eastAsia="굴림체" w:hAnsi="Consolas" w:cs="굴림체"/>
-          <w:color w:val="A31515"/>
-          <w:kern w:val="0"/>
-          <w:sz w:val="18"/>
-          <w:szCs w:val="18"/>
-          <w:bdr w:val="single" w:sz="2" w:space="0" w:color="E5E7EB" w:frame="1"/>
-        </w:rPr>
-        <w:t>hr</w:t>
-      </w:r>
-      <w:proofErr w:type="spellEnd"/>
-      <w:r>
-        <w:rPr>
-          <w:rFonts w:ascii="Consolas" w:eastAsia="굴림체" w:hAnsi="Consolas" w:cs="굴림체"/>
-          <w:color w:val="A31515"/>
-          <w:kern w:val="0"/>
-          <w:sz w:val="18"/>
-          <w:szCs w:val="18"/>
-          <w:bdr w:val="single" w:sz="2" w:space="0" w:color="E5E7EB" w:frame="1"/>
-        </w:rPr>
-        <w:t>/dashboard</w:t>
-      </w:r>
-      <w:r>
-        <w:rPr>
-          <w:rFonts w:ascii="Segoe UI" w:eastAsia="굴림" w:hAnsi="Segoe UI" w:cs="Segoe UI"/>
-          <w:color w:val="616161"/>
-          <w:kern w:val="0"/>
-          <w:szCs w:val="20"/>
-        </w:rPr>
-        <w:t> </w:t>
-      </w:r>
-      <w:proofErr w:type="spellStart"/>
-      <w:r>
-        <w:rPr>
-          <w:rFonts w:ascii="Segoe UI" w:eastAsia="굴림" w:hAnsi="Segoe UI" w:cs="Segoe UI"/>
-          <w:color w:val="616161"/>
-          <w:kern w:val="0"/>
-          <w:szCs w:val="20"/>
-        </w:rPr>
-        <w:t>처럼</w:t>
-      </w:r>
-      <w:proofErr w:type="spellEnd"/>
-      <w:r>
-        <w:rPr>
-          <w:rFonts w:ascii="Segoe UI" w:eastAsia="굴림" w:hAnsi="Segoe UI" w:cs="Segoe UI"/>
-          <w:color w:val="616161"/>
-          <w:kern w:val="0"/>
-          <w:szCs w:val="20"/>
-        </w:rPr>
-        <w:t xml:space="preserve"> </w:t>
-      </w:r>
-      <w:r>
-        <w:rPr>
-          <w:rFonts w:ascii="Segoe UI" w:eastAsia="굴림" w:hAnsi="Segoe UI" w:cs="Segoe UI"/>
-          <w:color w:val="616161"/>
-          <w:kern w:val="0"/>
-          <w:szCs w:val="20"/>
-        </w:rPr>
-        <w:t>찍히더라도</w:t>
-      </w:r>
-      <w:r>
-        <w:rPr>
-          <w:rFonts w:ascii="Segoe UI" w:eastAsia="굴림" w:hAnsi="Segoe UI" w:cs="Segoe UI"/>
-          <w:color w:val="616161"/>
-          <w:kern w:val="0"/>
-          <w:szCs w:val="20"/>
-        </w:rPr>
-        <w:t xml:space="preserve"> </w:t>
-      </w:r>
-      <w:r>
-        <w:rPr>
-          <w:rFonts w:ascii="Segoe UI" w:eastAsia="굴림" w:hAnsi="Segoe UI" w:cs="Segoe UI"/>
-          <w:color w:val="616161"/>
-          <w:kern w:val="0"/>
-          <w:szCs w:val="20"/>
-        </w:rPr>
-        <w:t>내부에선</w:t>
-      </w:r>
-      <w:r>
-        <w:rPr>
-          <w:rFonts w:ascii="Segoe UI" w:eastAsia="굴림" w:hAnsi="Segoe UI" w:cs="Segoe UI"/>
-          <w:color w:val="616161"/>
-          <w:kern w:val="0"/>
-          <w:szCs w:val="20"/>
-        </w:rPr>
-        <w:t xml:space="preserve"> </w:t>
-      </w:r>
-      <w:r>
-        <w:rPr>
-          <w:rFonts w:ascii="Segoe UI" w:eastAsia="굴림" w:hAnsi="Segoe UI" w:cs="Segoe UI"/>
-          <w:color w:val="616161"/>
-          <w:kern w:val="0"/>
-          <w:szCs w:val="20"/>
-        </w:rPr>
-        <w:t>충돌</w:t>
-      </w:r>
-      <w:r>
-        <w:rPr>
-          <w:rFonts w:ascii="Segoe UI" w:eastAsia="굴림" w:hAnsi="Segoe UI" w:cs="Segoe UI"/>
-          <w:color w:val="616161"/>
-          <w:kern w:val="0"/>
-          <w:szCs w:val="20"/>
-        </w:rPr>
-        <w:t xml:space="preserve"> </w:t>
-      </w:r>
-      <w:r>
-        <w:rPr>
-          <w:rFonts w:ascii="Segoe UI" w:eastAsia="굴림" w:hAnsi="Segoe UI" w:cs="Segoe UI"/>
-          <w:color w:val="616161"/>
-          <w:kern w:val="0"/>
-          <w:szCs w:val="20"/>
-        </w:rPr>
-        <w:t>없이</w:t>
-      </w:r>
-      <w:r>
-        <w:rPr>
-          <w:rFonts w:ascii="Segoe UI" w:eastAsia="굴림" w:hAnsi="Segoe UI" w:cs="Segoe UI"/>
-          <w:color w:val="616161"/>
-          <w:kern w:val="0"/>
-          <w:szCs w:val="20"/>
-        </w:rPr>
-        <w:t xml:space="preserve"> </w:t>
-      </w:r>
-      <w:r>
-        <w:rPr>
-          <w:rFonts w:ascii="Segoe UI" w:eastAsia="굴림" w:hAnsi="Segoe UI" w:cs="Segoe UI"/>
-          <w:color w:val="616161"/>
-          <w:kern w:val="0"/>
-          <w:szCs w:val="20"/>
-        </w:rPr>
-        <w:t>개발자가</w:t>
-      </w:r>
-      <w:r>
-        <w:rPr>
-          <w:rFonts w:ascii="Segoe UI" w:eastAsia="굴림" w:hAnsi="Segoe UI" w:cs="Segoe UI"/>
-          <w:color w:val="616161"/>
-          <w:kern w:val="0"/>
-          <w:szCs w:val="20"/>
-        </w:rPr>
-        <w:t xml:space="preserve"> </w:t>
-      </w:r>
-      <w:r>
-        <w:rPr>
-          <w:rFonts w:ascii="Segoe UI" w:eastAsia="굴림" w:hAnsi="Segoe UI" w:cs="Segoe UI"/>
-          <w:color w:val="616161"/>
-          <w:kern w:val="0"/>
-          <w:szCs w:val="20"/>
-        </w:rPr>
-        <w:t>작성한</w:t>
-      </w:r>
-      <w:r>
-        <w:rPr>
-          <w:rFonts w:ascii="Segoe UI" w:eastAsia="굴림" w:hAnsi="Segoe UI" w:cs="Segoe UI"/>
-          <w:color w:val="616161"/>
-          <w:kern w:val="0"/>
-          <w:szCs w:val="20"/>
-        </w:rPr>
-        <w:t> </w:t>
-      </w:r>
-      <w:r>
-        <w:rPr>
-          <w:rFonts w:ascii="Consolas" w:eastAsia="굴림체" w:hAnsi="Consolas" w:cs="굴림체"/>
-          <w:color w:val="A31515"/>
-          <w:kern w:val="0"/>
-          <w:sz w:val="18"/>
-          <w:szCs w:val="18"/>
-          <w:bdr w:val="single" w:sz="2" w:space="0" w:color="E5E7EB" w:frame="1"/>
-        </w:rPr>
-        <w:t>/dashboard</w:t>
-      </w:r>
-      <w:r>
-        <w:rPr>
-          <w:rFonts w:ascii="Segoe UI" w:eastAsia="굴림" w:hAnsi="Segoe UI" w:cs="Segoe UI"/>
-          <w:color w:val="616161"/>
-          <w:kern w:val="0"/>
-          <w:szCs w:val="20"/>
-        </w:rPr>
-        <w:t> </w:t>
-      </w:r>
-      <w:proofErr w:type="spellStart"/>
-      <w:r>
-        <w:rPr>
-          <w:rFonts w:ascii="Segoe UI" w:eastAsia="굴림" w:hAnsi="Segoe UI" w:cs="Segoe UI"/>
-          <w:color w:val="616161"/>
-          <w:kern w:val="0"/>
-          <w:szCs w:val="20"/>
-        </w:rPr>
         <w:t>로직을</w:t>
       </w:r>
-      <w:proofErr w:type="spellEnd"/>
       <w:r>
         <w:rPr>
           <w:rFonts w:ascii="Segoe UI" w:eastAsia="굴림" w:hAnsi="Segoe UI" w:cs="Segoe UI"/>
@@ -20848,7 +20343,6 @@
           <w:szCs w:val="20"/>
         </w:rPr>
       </w:pPr>
-      <w:proofErr w:type="spellStart"/>
       <w:r>
         <w:rPr>
           <w:rFonts w:ascii="Segoe UI" w:eastAsia="굴림" w:hAnsi="Segoe UI" w:cs="Segoe UI"/>
@@ -20859,9 +20353,8 @@
           <w:szCs w:val="20"/>
           <w:bdr w:val="single" w:sz="2" w:space="0" w:color="E5E7EB" w:frame="1"/>
         </w:rPr>
-        <w:t>Vite</w:t>
-      </w:r>
-      <w:proofErr w:type="spellEnd"/>
+        <w:t xml:space="preserve">Vite </w:t>
+      </w:r>
       <w:r>
         <w:rPr>
           <w:rFonts w:ascii="Segoe UI" w:eastAsia="굴림" w:hAnsi="Segoe UI" w:cs="Segoe UI"/>
@@ -20872,9 +20365,8 @@
           <w:szCs w:val="20"/>
           <w:bdr w:val="single" w:sz="2" w:space="0" w:color="E5E7EB" w:frame="1"/>
         </w:rPr>
-        <w:t xml:space="preserve"> </w:t>
-      </w:r>
-      <w:proofErr w:type="spellStart"/>
+        <w:t>빌더</w:t>
+      </w:r>
       <w:r>
         <w:rPr>
           <w:rFonts w:ascii="Segoe UI" w:eastAsia="굴림" w:hAnsi="Segoe UI" w:cs="Segoe UI"/>
@@ -20885,9 +20377,8 @@
           <w:szCs w:val="20"/>
           <w:bdr w:val="single" w:sz="2" w:space="0" w:color="E5E7EB" w:frame="1"/>
         </w:rPr>
-        <w:t>빌더</w:t>
-      </w:r>
-      <w:proofErr w:type="spellEnd"/>
+        <w:t xml:space="preserve"> </w:t>
+      </w:r>
       <w:r>
         <w:rPr>
           <w:rFonts w:ascii="Segoe UI" w:eastAsia="굴림" w:hAnsi="Segoe UI" w:cs="Segoe UI"/>
@@ -20898,7 +20389,7 @@
           <w:szCs w:val="20"/>
           <w:bdr w:val="single" w:sz="2" w:space="0" w:color="E5E7EB" w:frame="1"/>
         </w:rPr>
-        <w:t xml:space="preserve"> </w:t>
+        <w:t>베이스</w:t>
       </w:r>
       <w:r>
         <w:rPr>
@@ -20910,7 +20401,7 @@
           <w:szCs w:val="20"/>
           <w:bdr w:val="single" w:sz="2" w:space="0" w:color="E5E7EB" w:frame="1"/>
         </w:rPr>
-        <w:t>베이스</w:t>
+        <w:t xml:space="preserve"> </w:t>
       </w:r>
       <w:r>
         <w:rPr>
@@ -20922,7 +20413,7 @@
           <w:szCs w:val="20"/>
           <w:bdr w:val="single" w:sz="2" w:space="0" w:color="E5E7EB" w:frame="1"/>
         </w:rPr>
-        <w:t xml:space="preserve"> </w:t>
+        <w:t>주소</w:t>
       </w:r>
       <w:r>
         <w:rPr>
@@ -20934,7 +20425,7 @@
           <w:szCs w:val="20"/>
           <w:bdr w:val="single" w:sz="2" w:space="0" w:color="E5E7EB" w:frame="1"/>
         </w:rPr>
-        <w:t>주소</w:t>
+        <w:t xml:space="preserve"> </w:t>
       </w:r>
       <w:r>
         <w:rPr>
@@ -20946,7 +20437,7 @@
           <w:szCs w:val="20"/>
           <w:bdr w:val="single" w:sz="2" w:space="0" w:color="E5E7EB" w:frame="1"/>
         </w:rPr>
-        <w:t xml:space="preserve"> </w:t>
+        <w:t>설정</w:t>
       </w:r>
       <w:r>
         <w:rPr>
@@ -20958,21 +20449,8 @@
           <w:szCs w:val="20"/>
           <w:bdr w:val="single" w:sz="2" w:space="0" w:color="E5E7EB" w:frame="1"/>
         </w:rPr>
-        <w:t>설정</w:t>
-      </w:r>
-      <w:r>
-        <w:rPr>
-          <w:rFonts w:ascii="Segoe UI" w:eastAsia="굴림" w:hAnsi="Segoe UI" w:cs="Segoe UI"/>
-          <w:b/>
-          <w:bCs/>
-          <w:color w:val="616161"/>
-          <w:kern w:val="0"/>
-          <w:szCs w:val="20"/>
-          <w:bdr w:val="single" w:sz="2" w:space="0" w:color="E5E7EB" w:frame="1"/>
-        </w:rPr>
         <w:t xml:space="preserve"> (</w:t>
       </w:r>
-      <w:proofErr w:type="spellStart"/>
       <w:r>
         <w:rPr>
           <w:rFonts w:ascii="Consolas" w:eastAsia="굴림체" w:hAnsi="Consolas" w:cs="굴림체"/>
@@ -20986,7 +20464,6 @@
         </w:rPr>
         <w:t>vite.config.ts</w:t>
       </w:r>
-      <w:proofErr w:type="spellEnd"/>
       <w:r>
         <w:rPr>
           <w:rFonts w:ascii="Segoe UI" w:eastAsia="굴림" w:hAnsi="Segoe UI" w:cs="Segoe UI"/>
@@ -21127,21 +20604,8 @@
           <w:szCs w:val="18"/>
           <w:bdr w:val="single" w:sz="2" w:space="0" w:color="E5E7EB" w:frame="1"/>
         </w:rPr>
-        <w:t>domain.com/</w:t>
-      </w:r>
-      <w:proofErr w:type="spellStart"/>
-      <w:r>
-        <w:rPr>
-          <w:rFonts w:ascii="Consolas" w:eastAsia="굴림체" w:hAnsi="Consolas" w:cs="굴림체"/>
-          <w:color w:val="A31515"/>
-          <w:kern w:val="0"/>
-          <w:sz w:val="18"/>
-          <w:szCs w:val="18"/>
-          <w:bdr w:val="single" w:sz="2" w:space="0" w:color="E5E7EB" w:frame="1"/>
-        </w:rPr>
-        <w:t>hr</w:t>
-      </w:r>
-      <w:proofErr w:type="spellEnd"/>
+        <w:t>domain.com/hr</w:t>
+      </w:r>
       <w:r>
         <w:rPr>
           <w:rFonts w:ascii="Segoe UI" w:eastAsia="굴림" w:hAnsi="Segoe UI" w:cs="Segoe UI"/>
@@ -21169,7 +20633,6 @@
         </w:rPr>
         <w:t xml:space="preserve"> </w:t>
       </w:r>
-      <w:proofErr w:type="spellStart"/>
       <w:r>
         <w:rPr>
           <w:rFonts w:ascii="Segoe UI" w:eastAsia="굴림" w:hAnsi="Segoe UI" w:cs="Segoe UI"/>
@@ -21179,7 +20642,6 @@
         </w:rPr>
         <w:t>에셋</w:t>
       </w:r>
-      <w:proofErr w:type="spellEnd"/>
       <w:r>
         <w:rPr>
           <w:rFonts w:ascii="Segoe UI" w:eastAsia="굴림" w:hAnsi="Segoe UI" w:cs="Segoe UI"/>
@@ -22157,7 +21619,6 @@
         </w:rPr>
         <w:t xml:space="preserve"> </w:t>
       </w:r>
-      <w:proofErr w:type="spellStart"/>
       <w:r>
         <w:rPr>
           <w:rFonts w:ascii="Segoe UI" w:eastAsia="굴림" w:hAnsi="Segoe UI" w:cs="Segoe UI"/>
@@ -22179,7 +21640,6 @@
         </w:rPr>
         <w:t>이나</w:t>
       </w:r>
-      <w:proofErr w:type="spellEnd"/>
       <w:r>
         <w:rPr>
           <w:rFonts w:ascii="Segoe UI" w:eastAsia="굴림" w:hAnsi="Segoe UI" w:cs="Segoe UI"/>
@@ -22519,27 +21979,15 @@
         </w:rPr>
         <w:t>네</w:t>
       </w:r>
-      <w:proofErr w:type="gramStart"/>
-      <w:r>
-        <w:rPr>
-          <w:rFonts w:ascii="Segoe UI" w:eastAsia="굴림" w:hAnsi="Segoe UI" w:cs="Segoe UI"/>
-          <w:b/>
-          <w:color w:val="616161"/>
-          <w:kern w:val="0"/>
-          <w:szCs w:val="20"/>
-        </w:rPr>
-        <w:t>..</w:t>
-      </w:r>
-      <w:proofErr w:type="gramEnd"/>
-      <w:r>
-        <w:rPr>
-          <w:rFonts w:ascii="Segoe UI" w:eastAsia="굴림" w:hAnsi="Segoe UI" w:cs="Segoe UI"/>
-          <w:b/>
-          <w:color w:val="616161"/>
-          <w:kern w:val="0"/>
-          <w:szCs w:val="20"/>
-        </w:rPr>
-        <w:t xml:space="preserve"> </w:t>
+      <w:r>
+        <w:rPr>
+          <w:rFonts w:ascii="Segoe UI" w:eastAsia="굴림" w:hAnsi="Segoe UI" w:cs="Segoe UI"/>
+          <w:b/>
+          <w:color w:val="616161"/>
+          <w:kern w:val="0"/>
+          <w:szCs w:val="20"/>
+        </w:rPr>
+        <w:t xml:space="preserve">.. </w:t>
       </w:r>
       <w:r>
         <w:rPr>
@@ -22591,23 +22039,7 @@
     </w:p>
     <w:p>
       <w:r>
-        <w:t xml:space="preserve">관리자는 전체 직원들에 대한 Notification 기능을 생성하고 직원들이 </w:t>
-      </w:r>
-      <w:proofErr w:type="spellStart"/>
-      <w:r>
-        <w:t>접속시</w:t>
-      </w:r>
-      <w:proofErr w:type="spellEnd"/>
-      <w:r>
-        <w:t xml:space="preserve"> </w:t>
-      </w:r>
-      <w:proofErr w:type="spellStart"/>
-      <w:r>
-        <w:t>알람을</w:t>
-      </w:r>
-      <w:proofErr w:type="spellEnd"/>
-      <w:r>
-        <w:t xml:space="preserve"> 통해 내용을 확인할 수 있도록 합니다. 모든 Notification은 게시판을 통해 내용을 확인할 수 있도록 합니다.</w:t>
+        <w:t>관리자는 전체 직원들에 대한 Notification 기능을 생성하고 직원들이 접속시 알람을 통해 내용을 확인할 수 있도록 합니다. 모든 Notification은 게시판을 통해 내용을 확인할 수 있도록 합니다.</w:t>
       </w:r>
     </w:p>
     <w:p/>
@@ -22642,7 +22074,6 @@
         </w:rPr>
         <w:t>/</w:t>
       </w:r>
-      <w:proofErr w:type="spellStart"/>
       <w:r>
         <w:rPr>
           <w:rFonts w:ascii="Segoe UI" w:hAnsi="Segoe UI" w:cs="Segoe UI"/>
@@ -22652,7 +22083,6 @@
         </w:rPr>
         <w:t>반응형</w:t>
       </w:r>
-      <w:proofErr w:type="spellEnd"/>
       <w:r>
         <w:rPr>
           <w:rFonts w:ascii="Segoe UI" w:hAnsi="Segoe UI" w:cs="Segoe UI"/>
@@ -22860,27 +22290,64 @@
     </w:p>
     <w:p>
       <w:pPr>
+        <w:pBdr>
+          <w:bottom w:val="single" w:sz="6" w:space="1" w:color="auto"/>
+        </w:pBdr>
         <w:rPr>
           <w:rFonts w:ascii="Segoe UI" w:hAnsi="Segoe UI" w:cs="Segoe UI"/>
           <w:color w:val="616161"/>
           <w:szCs w:val="20"/>
-          <w:shd w:val="clear" w:color="auto" w:fill="F3F3F3"/>
         </w:rPr>
       </w:pPr>
+      <w:r>
+        <w:rPr>
+          <w:rFonts w:ascii="Segoe UI" w:hAnsi="Segoe UI" w:cs="Segoe UI"/>
+          <w:color w:val="616161"/>
+          <w:szCs w:val="20"/>
+        </w:rPr>
+        <w:t>https://github.com/bizpeer/HR_Spending main</w:t>
+      </w:r>
+      <w:r>
+        <w:rPr>
+          <w:rFonts w:ascii="Segoe UI" w:hAnsi="Segoe UI" w:cs="Segoe UI"/>
+          <w:color w:val="616161"/>
+          <w:szCs w:val="20"/>
+        </w:rPr>
+        <w:t>에</w:t>
+      </w:r>
+      <w:r>
+        <w:rPr>
+          <w:rFonts w:ascii="Segoe UI" w:hAnsi="Segoe UI" w:cs="Segoe UI"/>
+          <w:color w:val="616161"/>
+          <w:szCs w:val="20"/>
+        </w:rPr>
+        <w:t xml:space="preserve"> Push</w:t>
+      </w:r>
+      <w:r>
+        <w:rPr>
+          <w:rFonts w:ascii="Segoe UI" w:hAnsi="Segoe UI" w:cs="Segoe UI"/>
+          <w:color w:val="616161"/>
+          <w:szCs w:val="20"/>
+        </w:rPr>
+        <w:t>해주세요</w:t>
+      </w:r>
     </w:p>
     <w:p>
+      <w:pPr>
+        <w:rPr>
+          <w:rFonts w:ascii="Segoe UI" w:hAnsi="Segoe UI" w:cs="Segoe UI" w:hint="eastAsia"/>
+          <w:color w:val="616161"/>
+          <w:szCs w:val="20"/>
+          <w:shd w:val="clear" w:color="auto" w:fill="F3F3F3"/>
+        </w:rPr>
+      </w:pPr>
       <w:bookmarkStart w:id="0" w:name="_GoBack"/>
       <w:bookmarkEnd w:id="0"/>
     </w:p>
     <w:p/>
     <w:p/>
-    <w:p>
-      <w:pPr>
-        <w:rPr>
-          <w:rFonts w:hint="eastAsia"/>
-        </w:rPr>
-      </w:pPr>
-    </w:p>
+    <w:p/>
+    <w:p/>
     <w:sectPr>
       <w:pgSz w:w="11906" w:h="16838"/>
       <w:pgMar w:top="1701" w:right="1440" w:bottom="1440" w:left="1440" w:header="851" w:footer="992" w:gutter="0"/>
@@ -22889,6 +22356,56 @@
     </w:sectPr>
   </w:body>
 </w:document>
+</file>
+
+<file path=word/endnotes.xml><?xml version="1.0" encoding="utf-8"?>
+<w:endnotes xmlns:wpc="http://schemas.microsoft.com/office/word/2010/wordprocessingCanvas" xmlns:cx="http://schemas.microsoft.com/office/drawing/2014/chartex" xmlns:mc="http://schemas.openxmlformats.org/markup-compatibility/2006" xmlns:o="urn:schemas-microsoft-com:office:office" xmlns:r="http://schemas.openxmlformats.org/officeDocument/2006/relationships" xmlns:m="http://schemas.openxmlformats.org/officeDocument/2006/math" xmlns:v="urn:schemas-microsoft-com:vml" xmlns:wp14="http://schemas.microsoft.com/office/word/2010/wordprocessingDrawing" xmlns:wp="http://schemas.openxmlformats.org/drawingml/2006/wordprocessingDrawing" xmlns:w10="urn:schemas-microsoft-com:office:word" xmlns:w="http://schemas.openxmlformats.org/wordprocessingml/2006/main" xmlns:w14="http://schemas.microsoft.com/office/word/2010/wordml" xmlns:w15="http://schemas.microsoft.com/office/word/2012/wordml" xmlns:w16se="http://schemas.microsoft.com/office/word/2015/wordml/symex" xmlns:wpg="http://schemas.microsoft.com/office/word/2010/wordprocessingGroup" xmlns:wpi="http://schemas.microsoft.com/office/word/2010/wordprocessingInk" xmlns:wne="http://schemas.microsoft.com/office/word/2006/wordml" xmlns:wps="http://schemas.microsoft.com/office/word/2010/wordprocessingShape" mc:Ignorable="w14 w15 w16se wp14">
+  <w:endnote w:type="separator" w:id="-1">
+    <w:p>
+      <w:pPr>
+        <w:spacing w:after="0" w:line="240" w:lineRule="auto"/>
+      </w:pPr>
+      <w:r>
+        <w:separator/>
+      </w:r>
+    </w:p>
+  </w:endnote>
+  <w:endnote w:type="continuationSeparator" w:id="0">
+    <w:p>
+      <w:pPr>
+        <w:spacing w:after="0" w:line="240" w:lineRule="auto"/>
+      </w:pPr>
+      <w:r>
+        <w:continuationSeparator/>
+      </w:r>
+    </w:p>
+  </w:endnote>
+</w:endnotes>
+</file>
+
+<file path=word/footnotes.xml><?xml version="1.0" encoding="utf-8"?>
+<w:footnotes xmlns:wpc="http://schemas.microsoft.com/office/word/2010/wordprocessingCanvas" xmlns:cx="http://schemas.microsoft.com/office/drawing/2014/chartex" xmlns:mc="http://schemas.openxmlformats.org/markup-compatibility/2006" xmlns:o="urn:schemas-microsoft-com:office:office" xmlns:r="http://schemas.openxmlformats.org/officeDocument/2006/relationships" xmlns:m="http://schemas.openxmlformats.org/officeDocument/2006/math" xmlns:v="urn:schemas-microsoft-com:vml" xmlns:wp14="http://schemas.microsoft.com/office/word/2010/wordprocessingDrawing" xmlns:wp="http://schemas.openxmlformats.org/drawingml/2006/wordprocessingDrawing" xmlns:w10="urn:schemas-microsoft-com:office:word" xmlns:w="http://schemas.openxmlformats.org/wordprocessingml/2006/main" xmlns:w14="http://schemas.microsoft.com/office/word/2010/wordml" xmlns:w15="http://schemas.microsoft.com/office/word/2012/wordml" xmlns:w16se="http://schemas.microsoft.com/office/word/2015/wordml/symex" xmlns:wpg="http://schemas.microsoft.com/office/word/2010/wordprocessingGroup" xmlns:wpi="http://schemas.microsoft.com/office/word/2010/wordprocessingInk" xmlns:wne="http://schemas.microsoft.com/office/word/2006/wordml" xmlns:wps="http://schemas.microsoft.com/office/word/2010/wordprocessingShape" mc:Ignorable="w14 w15 w16se wp14">
+  <w:footnote w:type="separator" w:id="-1">
+    <w:p>
+      <w:pPr>
+        <w:spacing w:after="0" w:line="240" w:lineRule="auto"/>
+      </w:pPr>
+      <w:r>
+        <w:separator/>
+      </w:r>
+    </w:p>
+  </w:footnote>
+  <w:footnote w:type="continuationSeparator" w:id="0">
+    <w:p>
+      <w:pPr>
+        <w:spacing w:after="0" w:line="240" w:lineRule="auto"/>
+      </w:pPr>
+      <w:r>
+        <w:continuationSeparator/>
+      </w:r>
+    </w:p>
+  </w:footnote>
+</w:footnotes>
 </file>
 
 <file path=word/numbering.xml><?xml version="1.0" encoding="utf-8"?>
@@ -24427,6 +23944,50 @@
       <w:szCs w:val="24"/>
     </w:rPr>
   </w:style>
+  <w:style w:type="paragraph" w:styleId="a5">
+    <w:name w:val="header"/>
+    <w:basedOn w:val="a"/>
+    <w:link w:val="Char"/>
+    <w:uiPriority w:val="99"/>
+    <w:unhideWhenUsed/>
+    <w:rsid w:val="003935FA"/>
+    <w:pPr>
+      <w:tabs>
+        <w:tab w:val="center" w:pos="4513"/>
+        <w:tab w:val="right" w:pos="9026"/>
+      </w:tabs>
+      <w:snapToGrid w:val="0"/>
+    </w:pPr>
+  </w:style>
+  <w:style w:type="character" w:customStyle="1" w:styleId="Char">
+    <w:name w:val="머리글 Char"/>
+    <w:basedOn w:val="a0"/>
+    <w:link w:val="a5"/>
+    <w:uiPriority w:val="99"/>
+    <w:rsid w:val="003935FA"/>
+  </w:style>
+  <w:style w:type="paragraph" w:styleId="a6">
+    <w:name w:val="footer"/>
+    <w:basedOn w:val="a"/>
+    <w:link w:val="Char0"/>
+    <w:uiPriority w:val="99"/>
+    <w:unhideWhenUsed/>
+    <w:rsid w:val="003935FA"/>
+    <w:pPr>
+      <w:tabs>
+        <w:tab w:val="center" w:pos="4513"/>
+        <w:tab w:val="right" w:pos="9026"/>
+      </w:tabs>
+      <w:snapToGrid w:val="0"/>
+    </w:pPr>
+  </w:style>
+  <w:style w:type="character" w:customStyle="1" w:styleId="Char0">
+    <w:name w:val="바닥글 Char"/>
+    <w:basedOn w:val="a0"/>
+    <w:link w:val="a6"/>
+    <w:uiPriority w:val="99"/>
+    <w:rsid w:val="003935FA"/>
+  </w:style>
 </w:styles>
 </file>
 

</xml_diff>

<commit_message>
feat: Implement Auth context, ProtectedRoutes, Login, and Organization Employee roles
</commit_message>
<xml_diff>
--- a/자료/시스템 아키텍처.docx
+++ b/자료/시스템 아키텍처.docx
@@ -22335,12 +22335,705 @@
     <w:p>
       <w:pPr>
         <w:rPr>
-          <w:rFonts w:ascii="Segoe UI" w:hAnsi="Segoe UI" w:cs="Segoe UI" w:hint="eastAsia"/>
+          <w:rFonts w:ascii="Segoe UI" w:hAnsi="Segoe UI" w:cs="Segoe UI"/>
           <w:color w:val="616161"/>
           <w:szCs w:val="20"/>
           <w:shd w:val="clear" w:color="auto" w:fill="F3F3F3"/>
         </w:rPr>
       </w:pPr>
+    </w:p>
+    <w:p>
+      <w:r>
+        <w:lastRenderedPageBreak/>
+        <w:drawing>
+          <wp:inline distT="0" distB="0" distL="0" distR="0" wp14:anchorId="08DE0317" wp14:editId="46491723">
+            <wp:extent cx="4209122" cy="2355448"/>
+            <wp:effectExtent l="0" t="0" r="1270" b="6985"/>
+            <wp:docPr id="1" name="그림 1"/>
+            <wp:cNvGraphicFramePr>
+              <a:graphicFrameLocks xmlns:a="http://schemas.openxmlformats.org/drawingml/2006/main" noChangeAspect="1"/>
+            </wp:cNvGraphicFramePr>
+            <a:graphic xmlns:a="http://schemas.openxmlformats.org/drawingml/2006/main">
+              <a:graphicData uri="http://schemas.openxmlformats.org/drawingml/2006/picture">
+                <pic:pic xmlns:pic="http://schemas.openxmlformats.org/drawingml/2006/picture">
+                  <pic:nvPicPr>
+                    <pic:cNvPr id="1" name=""/>
+                    <pic:cNvPicPr/>
+                  </pic:nvPicPr>
+                  <pic:blipFill>
+                    <a:blip r:embed="rId7"/>
+                    <a:stretch>
+                      <a:fillRect/>
+                    </a:stretch>
+                  </pic:blipFill>
+                  <pic:spPr>
+                    <a:xfrm>
+                      <a:off x="0" y="0"/>
+                      <a:ext cx="4212742" cy="2357474"/>
+                    </a:xfrm>
+                    <a:prstGeom prst="rect">
+                      <a:avLst/>
+                    </a:prstGeom>
+                  </pic:spPr>
+                </pic:pic>
+              </a:graphicData>
+            </a:graphic>
+          </wp:inline>
+        </w:drawing>
+      </w:r>
+    </w:p>
+    <w:p>
+      <w:pPr>
+        <w:pBdr>
+          <w:bottom w:val="single" w:sz="6" w:space="1" w:color="auto"/>
+        </w:pBdr>
+      </w:pPr>
+      <w:r>
+        <w:br/>
+      </w:r>
+      <w:r>
+        <w:rPr>
+          <w:rFonts w:ascii="Segoe UI" w:hAnsi="Segoe UI" w:cs="Segoe UI"/>
+          <w:color w:val="616161"/>
+          <w:szCs w:val="20"/>
+        </w:rPr>
+        <w:t>모든</w:t>
+      </w:r>
+      <w:r>
+        <w:rPr>
+          <w:rFonts w:ascii="Segoe UI" w:hAnsi="Segoe UI" w:cs="Segoe UI"/>
+          <w:color w:val="616161"/>
+          <w:szCs w:val="20"/>
+        </w:rPr>
+        <w:t xml:space="preserve"> </w:t>
+      </w:r>
+      <w:r>
+        <w:rPr>
+          <w:rFonts w:ascii="Segoe UI" w:hAnsi="Segoe UI" w:cs="Segoe UI"/>
+          <w:color w:val="616161"/>
+          <w:szCs w:val="20"/>
+        </w:rPr>
+        <w:t>사용자의</w:t>
+      </w:r>
+      <w:r>
+        <w:rPr>
+          <w:rFonts w:ascii="Segoe UI" w:hAnsi="Segoe UI" w:cs="Segoe UI"/>
+          <w:color w:val="616161"/>
+          <w:szCs w:val="20"/>
+        </w:rPr>
+        <w:t xml:space="preserve"> </w:t>
+      </w:r>
+      <w:r>
+        <w:rPr>
+          <w:rFonts w:ascii="Segoe UI" w:hAnsi="Segoe UI" w:cs="Segoe UI"/>
+          <w:color w:val="616161"/>
+          <w:szCs w:val="20"/>
+        </w:rPr>
+        <w:t>첫화면은</w:t>
+      </w:r>
+      <w:r>
+        <w:rPr>
+          <w:rFonts w:ascii="Segoe UI" w:hAnsi="Segoe UI" w:cs="Segoe UI"/>
+          <w:color w:val="616161"/>
+          <w:szCs w:val="20"/>
+        </w:rPr>
+        <w:t xml:space="preserve"> </w:t>
+      </w:r>
+      <w:r>
+        <w:rPr>
+          <w:rFonts w:ascii="Segoe UI" w:hAnsi="Segoe UI" w:cs="Segoe UI"/>
+          <w:color w:val="616161"/>
+          <w:szCs w:val="20"/>
+        </w:rPr>
+        <w:t>로그인</w:t>
+      </w:r>
+      <w:r>
+        <w:rPr>
+          <w:rFonts w:ascii="Segoe UI" w:hAnsi="Segoe UI" w:cs="Segoe UI"/>
+          <w:color w:val="616161"/>
+          <w:szCs w:val="20"/>
+        </w:rPr>
+        <w:t xml:space="preserve"> </w:t>
+      </w:r>
+      <w:r>
+        <w:rPr>
+          <w:rFonts w:ascii="Segoe UI" w:hAnsi="Segoe UI" w:cs="Segoe UI"/>
+          <w:color w:val="616161"/>
+          <w:szCs w:val="20"/>
+        </w:rPr>
+        <w:t>화면이</w:t>
+      </w:r>
+      <w:r>
+        <w:rPr>
+          <w:rFonts w:ascii="Segoe UI" w:hAnsi="Segoe UI" w:cs="Segoe UI"/>
+          <w:color w:val="616161"/>
+          <w:szCs w:val="20"/>
+        </w:rPr>
+        <w:t xml:space="preserve"> </w:t>
+      </w:r>
+      <w:r>
+        <w:rPr>
+          <w:rFonts w:ascii="Segoe UI" w:hAnsi="Segoe UI" w:cs="Segoe UI"/>
+          <w:color w:val="616161"/>
+          <w:szCs w:val="20"/>
+        </w:rPr>
+        <w:t>나오도록</w:t>
+      </w:r>
+      <w:r>
+        <w:rPr>
+          <w:rFonts w:ascii="Segoe UI" w:hAnsi="Segoe UI" w:cs="Segoe UI"/>
+          <w:color w:val="616161"/>
+          <w:szCs w:val="20"/>
+        </w:rPr>
+        <w:t xml:space="preserve"> </w:t>
+      </w:r>
+      <w:r>
+        <w:rPr>
+          <w:rFonts w:ascii="Segoe UI" w:hAnsi="Segoe UI" w:cs="Segoe UI"/>
+          <w:color w:val="616161"/>
+          <w:szCs w:val="20"/>
+        </w:rPr>
+        <w:t>해주세요</w:t>
+      </w:r>
+      <w:r>
+        <w:rPr>
+          <w:rFonts w:ascii="Segoe UI" w:hAnsi="Segoe UI" w:cs="Segoe UI"/>
+          <w:color w:val="616161"/>
+          <w:szCs w:val="20"/>
+        </w:rPr>
+        <w:t xml:space="preserve">. </w:t>
+      </w:r>
+      <w:r>
+        <w:rPr>
+          <w:rFonts w:ascii="Segoe UI" w:hAnsi="Segoe UI" w:cs="Segoe UI"/>
+          <w:color w:val="616161"/>
+          <w:szCs w:val="20"/>
+        </w:rPr>
+        <w:t>관리자는</w:t>
+      </w:r>
+      <w:r>
+        <w:rPr>
+          <w:rFonts w:ascii="Segoe UI" w:hAnsi="Segoe UI" w:cs="Segoe UI"/>
+          <w:color w:val="616161"/>
+          <w:szCs w:val="20"/>
+        </w:rPr>
+        <w:t xml:space="preserve"> 1</w:t>
+      </w:r>
+      <w:r>
+        <w:rPr>
+          <w:rFonts w:ascii="Segoe UI" w:hAnsi="Segoe UI" w:cs="Segoe UI"/>
+          <w:color w:val="616161"/>
+          <w:szCs w:val="20"/>
+        </w:rPr>
+        <w:t>명의</w:t>
+      </w:r>
+      <w:r>
+        <w:rPr>
+          <w:rFonts w:ascii="Segoe UI" w:hAnsi="Segoe UI" w:cs="Segoe UI"/>
+          <w:color w:val="616161"/>
+          <w:szCs w:val="20"/>
+        </w:rPr>
+        <w:t xml:space="preserve"> </w:t>
+      </w:r>
+      <w:r>
+        <w:rPr>
+          <w:rFonts w:ascii="Segoe UI" w:hAnsi="Segoe UI" w:cs="Segoe UI"/>
+          <w:color w:val="616161"/>
+          <w:szCs w:val="20"/>
+        </w:rPr>
+        <w:t>추가</w:t>
+      </w:r>
+      <w:r>
+        <w:rPr>
+          <w:rFonts w:ascii="Segoe UI" w:hAnsi="Segoe UI" w:cs="Segoe UI"/>
+          <w:color w:val="616161"/>
+          <w:szCs w:val="20"/>
+        </w:rPr>
+        <w:t xml:space="preserve"> sub</w:t>
+      </w:r>
+      <w:r>
+        <w:rPr>
+          <w:rFonts w:ascii="Segoe UI" w:hAnsi="Segoe UI" w:cs="Segoe UI"/>
+          <w:color w:val="616161"/>
+          <w:szCs w:val="20"/>
+        </w:rPr>
+        <w:t>관리자</w:t>
+      </w:r>
+      <w:r>
+        <w:rPr>
+          <w:rFonts w:ascii="Segoe UI" w:hAnsi="Segoe UI" w:cs="Segoe UI"/>
+          <w:color w:val="616161"/>
+          <w:szCs w:val="20"/>
+        </w:rPr>
+        <w:t xml:space="preserve"> </w:t>
+      </w:r>
+      <w:r>
+        <w:rPr>
+          <w:rFonts w:ascii="Segoe UI" w:hAnsi="Segoe UI" w:cs="Segoe UI"/>
+          <w:color w:val="616161"/>
+          <w:szCs w:val="20"/>
+        </w:rPr>
+        <w:t>아이디를</w:t>
+      </w:r>
+      <w:r>
+        <w:rPr>
+          <w:rFonts w:ascii="Segoe UI" w:hAnsi="Segoe UI" w:cs="Segoe UI"/>
+          <w:color w:val="616161"/>
+          <w:szCs w:val="20"/>
+        </w:rPr>
+        <w:t xml:space="preserve"> </w:t>
+      </w:r>
+      <w:r>
+        <w:rPr>
+          <w:rFonts w:ascii="Segoe UI" w:hAnsi="Segoe UI" w:cs="Segoe UI"/>
+          <w:color w:val="616161"/>
+          <w:szCs w:val="20"/>
+        </w:rPr>
+        <w:t>생성</w:t>
+      </w:r>
+      <w:r>
+        <w:rPr>
+          <w:rFonts w:ascii="Segoe UI" w:hAnsi="Segoe UI" w:cs="Segoe UI"/>
+          <w:color w:val="616161"/>
+          <w:szCs w:val="20"/>
+        </w:rPr>
+        <w:t>/</w:t>
+      </w:r>
+      <w:r>
+        <w:rPr>
+          <w:rFonts w:ascii="Segoe UI" w:hAnsi="Segoe UI" w:cs="Segoe UI"/>
+          <w:color w:val="616161"/>
+          <w:szCs w:val="20"/>
+        </w:rPr>
+        <w:t>삭제할</w:t>
+      </w:r>
+      <w:r>
+        <w:rPr>
+          <w:rFonts w:ascii="Segoe UI" w:hAnsi="Segoe UI" w:cs="Segoe UI"/>
+          <w:color w:val="616161"/>
+          <w:szCs w:val="20"/>
+        </w:rPr>
+        <w:t xml:space="preserve"> </w:t>
+      </w:r>
+      <w:r>
+        <w:rPr>
+          <w:rFonts w:ascii="Segoe UI" w:hAnsi="Segoe UI" w:cs="Segoe UI"/>
+          <w:color w:val="616161"/>
+          <w:szCs w:val="20"/>
+        </w:rPr>
+        <w:t>수</w:t>
+      </w:r>
+      <w:r>
+        <w:rPr>
+          <w:rFonts w:ascii="Segoe UI" w:hAnsi="Segoe UI" w:cs="Segoe UI"/>
+          <w:color w:val="616161"/>
+          <w:szCs w:val="20"/>
+        </w:rPr>
+        <w:t xml:space="preserve"> </w:t>
+      </w:r>
+      <w:r>
+        <w:rPr>
+          <w:rFonts w:ascii="Segoe UI" w:hAnsi="Segoe UI" w:cs="Segoe UI"/>
+          <w:color w:val="616161"/>
+          <w:szCs w:val="20"/>
+        </w:rPr>
+        <w:t>있습니다</w:t>
+      </w:r>
+      <w:r>
+        <w:rPr>
+          <w:rFonts w:ascii="Segoe UI" w:hAnsi="Segoe UI" w:cs="Segoe UI"/>
+          <w:color w:val="616161"/>
+          <w:szCs w:val="20"/>
+        </w:rPr>
+        <w:t xml:space="preserve">. </w:t>
+      </w:r>
+      <w:r>
+        <w:rPr>
+          <w:rFonts w:ascii="Segoe UI" w:hAnsi="Segoe UI" w:cs="Segoe UI"/>
+          <w:color w:val="616161"/>
+          <w:szCs w:val="20"/>
+        </w:rPr>
+        <w:t>관리자와</w:t>
+      </w:r>
+      <w:r>
+        <w:rPr>
+          <w:rFonts w:ascii="Segoe UI" w:hAnsi="Segoe UI" w:cs="Segoe UI"/>
+          <w:color w:val="616161"/>
+          <w:szCs w:val="20"/>
+        </w:rPr>
+        <w:t xml:space="preserve"> sub</w:t>
+      </w:r>
+      <w:r>
+        <w:rPr>
+          <w:rFonts w:ascii="Segoe UI" w:hAnsi="Segoe UI" w:cs="Segoe UI"/>
+          <w:color w:val="616161"/>
+          <w:szCs w:val="20"/>
+        </w:rPr>
+        <w:t>관리자만이</w:t>
+      </w:r>
+      <w:r>
+        <w:rPr>
+          <w:rFonts w:ascii="Segoe UI" w:hAnsi="Segoe UI" w:cs="Segoe UI"/>
+          <w:color w:val="616161"/>
+          <w:szCs w:val="20"/>
+        </w:rPr>
+        <w:t xml:space="preserve"> </w:t>
+      </w:r>
+      <w:r>
+        <w:rPr>
+          <w:rFonts w:ascii="Segoe UI" w:hAnsi="Segoe UI" w:cs="Segoe UI"/>
+          <w:color w:val="616161"/>
+          <w:szCs w:val="20"/>
+        </w:rPr>
+        <w:t>관리자</w:t>
+      </w:r>
+      <w:r>
+        <w:rPr>
+          <w:rFonts w:ascii="Segoe UI" w:hAnsi="Segoe UI" w:cs="Segoe UI"/>
+          <w:color w:val="616161"/>
+          <w:szCs w:val="20"/>
+        </w:rPr>
+        <w:t xml:space="preserve"> </w:t>
+      </w:r>
+      <w:r>
+        <w:rPr>
+          <w:rFonts w:ascii="Segoe UI" w:hAnsi="Segoe UI" w:cs="Segoe UI"/>
+          <w:color w:val="616161"/>
+          <w:szCs w:val="20"/>
+        </w:rPr>
+        <w:t>메뉴에</w:t>
+      </w:r>
+      <w:r>
+        <w:rPr>
+          <w:rFonts w:ascii="Segoe UI" w:hAnsi="Segoe UI" w:cs="Segoe UI"/>
+          <w:color w:val="616161"/>
+          <w:szCs w:val="20"/>
+        </w:rPr>
+        <w:t xml:space="preserve"> </w:t>
+      </w:r>
+      <w:r>
+        <w:rPr>
+          <w:rFonts w:ascii="Segoe UI" w:hAnsi="Segoe UI" w:cs="Segoe UI"/>
+          <w:color w:val="616161"/>
+          <w:szCs w:val="20"/>
+        </w:rPr>
+        <w:t>접근할</w:t>
+      </w:r>
+      <w:r>
+        <w:rPr>
+          <w:rFonts w:ascii="Segoe UI" w:hAnsi="Segoe UI" w:cs="Segoe UI"/>
+          <w:color w:val="616161"/>
+          <w:szCs w:val="20"/>
+        </w:rPr>
+        <w:t xml:space="preserve"> </w:t>
+      </w:r>
+      <w:r>
+        <w:rPr>
+          <w:rFonts w:ascii="Segoe UI" w:hAnsi="Segoe UI" w:cs="Segoe UI"/>
+          <w:color w:val="616161"/>
+          <w:szCs w:val="20"/>
+        </w:rPr>
+        <w:t>수</w:t>
+      </w:r>
+      <w:r>
+        <w:rPr>
+          <w:rFonts w:ascii="Segoe UI" w:hAnsi="Segoe UI" w:cs="Segoe UI"/>
+          <w:color w:val="616161"/>
+          <w:szCs w:val="20"/>
+        </w:rPr>
+        <w:t xml:space="preserve"> </w:t>
+      </w:r>
+      <w:r>
+        <w:rPr>
+          <w:rFonts w:ascii="Segoe UI" w:hAnsi="Segoe UI" w:cs="Segoe UI"/>
+          <w:color w:val="616161"/>
+          <w:szCs w:val="20"/>
+        </w:rPr>
+        <w:t>있습니다</w:t>
+      </w:r>
+      <w:r>
+        <w:rPr>
+          <w:rFonts w:ascii="Segoe UI" w:hAnsi="Segoe UI" w:cs="Segoe UI"/>
+          <w:color w:val="616161"/>
+          <w:szCs w:val="20"/>
+        </w:rPr>
+        <w:t xml:space="preserve">. </w:t>
+      </w:r>
+      <w:r>
+        <w:rPr>
+          <w:rFonts w:ascii="Segoe UI" w:hAnsi="Segoe UI" w:cs="Segoe UI"/>
+          <w:color w:val="616161"/>
+          <w:szCs w:val="20"/>
+        </w:rPr>
+        <w:t>조직관리에서</w:t>
+      </w:r>
+      <w:r>
+        <w:rPr>
+          <w:rFonts w:ascii="Segoe UI" w:hAnsi="Segoe UI" w:cs="Segoe UI"/>
+          <w:color w:val="616161"/>
+          <w:szCs w:val="20"/>
+        </w:rPr>
+        <w:t xml:space="preserve"> </w:t>
+      </w:r>
+      <w:r>
+        <w:rPr>
+          <w:rFonts w:ascii="Segoe UI" w:hAnsi="Segoe UI" w:cs="Segoe UI"/>
+          <w:color w:val="616161"/>
+          <w:szCs w:val="20"/>
+        </w:rPr>
+        <w:t>직원생성기능을</w:t>
+      </w:r>
+      <w:r>
+        <w:rPr>
+          <w:rFonts w:ascii="Segoe UI" w:hAnsi="Segoe UI" w:cs="Segoe UI"/>
+          <w:color w:val="616161"/>
+          <w:szCs w:val="20"/>
+        </w:rPr>
+        <w:t xml:space="preserve"> </w:t>
+      </w:r>
+      <w:r>
+        <w:rPr>
+          <w:rFonts w:ascii="Segoe UI" w:hAnsi="Segoe UI" w:cs="Segoe UI"/>
+          <w:color w:val="616161"/>
+          <w:szCs w:val="20"/>
+        </w:rPr>
+        <w:t>추가하고</w:t>
+      </w:r>
+      <w:r>
+        <w:rPr>
+          <w:rFonts w:ascii="Segoe UI" w:hAnsi="Segoe UI" w:cs="Segoe UI"/>
+          <w:color w:val="616161"/>
+          <w:szCs w:val="20"/>
+        </w:rPr>
+        <w:t xml:space="preserve">, </w:t>
+      </w:r>
+      <w:r>
+        <w:rPr>
+          <w:rFonts w:ascii="Segoe UI" w:hAnsi="Segoe UI" w:cs="Segoe UI"/>
+          <w:color w:val="616161"/>
+          <w:szCs w:val="20"/>
+        </w:rPr>
+        <w:t>직원을</w:t>
+      </w:r>
+      <w:r>
+        <w:rPr>
+          <w:rFonts w:ascii="Segoe UI" w:hAnsi="Segoe UI" w:cs="Segoe UI"/>
+          <w:color w:val="616161"/>
+          <w:szCs w:val="20"/>
+        </w:rPr>
+        <w:t xml:space="preserve"> </w:t>
+      </w:r>
+      <w:r>
+        <w:rPr>
+          <w:rFonts w:ascii="Segoe UI" w:hAnsi="Segoe UI" w:cs="Segoe UI"/>
+          <w:color w:val="616161"/>
+          <w:szCs w:val="20"/>
+        </w:rPr>
+        <w:t>해당</w:t>
+      </w:r>
+      <w:r>
+        <w:rPr>
+          <w:rFonts w:ascii="Segoe UI" w:hAnsi="Segoe UI" w:cs="Segoe UI"/>
+          <w:color w:val="616161"/>
+          <w:szCs w:val="20"/>
+        </w:rPr>
+        <w:t xml:space="preserve"> </w:t>
+      </w:r>
+      <w:r>
+        <w:rPr>
+          <w:rFonts w:ascii="Segoe UI" w:hAnsi="Segoe UI" w:cs="Segoe UI"/>
+          <w:color w:val="616161"/>
+          <w:szCs w:val="20"/>
+        </w:rPr>
+        <w:t>팀으로</w:t>
+      </w:r>
+      <w:r>
+        <w:rPr>
+          <w:rFonts w:ascii="Segoe UI" w:hAnsi="Segoe UI" w:cs="Segoe UI"/>
+          <w:color w:val="616161"/>
+          <w:szCs w:val="20"/>
+        </w:rPr>
+        <w:t xml:space="preserve"> </w:t>
+      </w:r>
+      <w:r>
+        <w:rPr>
+          <w:rFonts w:ascii="Segoe UI" w:hAnsi="Segoe UI" w:cs="Segoe UI"/>
+          <w:color w:val="616161"/>
+          <w:szCs w:val="20"/>
+        </w:rPr>
+        <w:t>배정하거나</w:t>
+      </w:r>
+      <w:r>
+        <w:rPr>
+          <w:rFonts w:ascii="Segoe UI" w:hAnsi="Segoe UI" w:cs="Segoe UI"/>
+          <w:color w:val="616161"/>
+          <w:szCs w:val="20"/>
+        </w:rPr>
+        <w:t xml:space="preserve"> </w:t>
+      </w:r>
+      <w:r>
+        <w:rPr>
+          <w:rFonts w:ascii="Segoe UI" w:hAnsi="Segoe UI" w:cs="Segoe UI"/>
+          <w:color w:val="616161"/>
+          <w:szCs w:val="20"/>
+        </w:rPr>
+        <w:t>이동할</w:t>
+      </w:r>
+      <w:r>
+        <w:rPr>
+          <w:rFonts w:ascii="Segoe UI" w:hAnsi="Segoe UI" w:cs="Segoe UI"/>
+          <w:color w:val="616161"/>
+          <w:szCs w:val="20"/>
+        </w:rPr>
+        <w:t xml:space="preserve"> </w:t>
+      </w:r>
+      <w:r>
+        <w:rPr>
+          <w:rFonts w:ascii="Segoe UI" w:hAnsi="Segoe UI" w:cs="Segoe UI"/>
+          <w:color w:val="616161"/>
+          <w:szCs w:val="20"/>
+        </w:rPr>
+        <w:t>수</w:t>
+      </w:r>
+      <w:r>
+        <w:rPr>
+          <w:rFonts w:ascii="Segoe UI" w:hAnsi="Segoe UI" w:cs="Segoe UI"/>
+          <w:color w:val="616161"/>
+          <w:szCs w:val="20"/>
+        </w:rPr>
+        <w:t xml:space="preserve"> </w:t>
+      </w:r>
+      <w:r>
+        <w:rPr>
+          <w:rFonts w:ascii="Segoe UI" w:hAnsi="Segoe UI" w:cs="Segoe UI"/>
+          <w:color w:val="616161"/>
+          <w:szCs w:val="20"/>
+        </w:rPr>
+        <w:t>있도록</w:t>
+      </w:r>
+      <w:r>
+        <w:rPr>
+          <w:rFonts w:ascii="Segoe UI" w:hAnsi="Segoe UI" w:cs="Segoe UI"/>
+          <w:color w:val="616161"/>
+          <w:szCs w:val="20"/>
+        </w:rPr>
+        <w:t xml:space="preserve"> </w:t>
+      </w:r>
+      <w:r>
+        <w:rPr>
+          <w:rFonts w:ascii="Segoe UI" w:hAnsi="Segoe UI" w:cs="Segoe UI"/>
+          <w:color w:val="616161"/>
+          <w:szCs w:val="20"/>
+        </w:rPr>
+        <w:t>합니다</w:t>
+      </w:r>
+      <w:r>
+        <w:rPr>
+          <w:rFonts w:ascii="Segoe UI" w:hAnsi="Segoe UI" w:cs="Segoe UI"/>
+          <w:color w:val="616161"/>
+          <w:szCs w:val="20"/>
+        </w:rPr>
+        <w:t xml:space="preserve">. </w:t>
+      </w:r>
+      <w:r>
+        <w:rPr>
+          <w:rFonts w:ascii="Segoe UI" w:hAnsi="Segoe UI" w:cs="Segoe UI"/>
+          <w:color w:val="616161"/>
+          <w:szCs w:val="20"/>
+        </w:rPr>
+        <w:t>관리자의</w:t>
+      </w:r>
+      <w:r>
+        <w:rPr>
+          <w:rFonts w:ascii="Segoe UI" w:hAnsi="Segoe UI" w:cs="Segoe UI"/>
+          <w:color w:val="616161"/>
+          <w:szCs w:val="20"/>
+        </w:rPr>
+        <w:t xml:space="preserve"> ID</w:t>
+      </w:r>
+      <w:r>
+        <w:rPr>
+          <w:rFonts w:ascii="Segoe UI" w:hAnsi="Segoe UI" w:cs="Segoe UI"/>
+          <w:color w:val="616161"/>
+          <w:szCs w:val="20"/>
+        </w:rPr>
+        <w:t>와</w:t>
+      </w:r>
+      <w:r>
+        <w:rPr>
+          <w:rFonts w:ascii="Segoe UI" w:hAnsi="Segoe UI" w:cs="Segoe UI"/>
+          <w:color w:val="616161"/>
+          <w:szCs w:val="20"/>
+        </w:rPr>
+        <w:t xml:space="preserve"> Password</w:t>
+      </w:r>
+      <w:r>
+        <w:rPr>
+          <w:rFonts w:ascii="Segoe UI" w:hAnsi="Segoe UI" w:cs="Segoe UI"/>
+          <w:color w:val="616161"/>
+          <w:szCs w:val="20"/>
+        </w:rPr>
+        <w:t>를</w:t>
+      </w:r>
+      <w:r>
+        <w:rPr>
+          <w:rFonts w:ascii="Segoe UI" w:hAnsi="Segoe UI" w:cs="Segoe UI"/>
+          <w:color w:val="616161"/>
+          <w:szCs w:val="20"/>
+        </w:rPr>
+        <w:t xml:space="preserve"> .env</w:t>
+      </w:r>
+      <w:r>
+        <w:rPr>
+          <w:rFonts w:ascii="Segoe UI" w:hAnsi="Segoe UI" w:cs="Segoe UI"/>
+          <w:color w:val="616161"/>
+          <w:szCs w:val="20"/>
+        </w:rPr>
+        <w:t>파일로</w:t>
+      </w:r>
+      <w:r>
+        <w:rPr>
+          <w:rFonts w:ascii="Segoe UI" w:hAnsi="Segoe UI" w:cs="Segoe UI"/>
+          <w:color w:val="616161"/>
+          <w:szCs w:val="20"/>
+        </w:rPr>
+        <w:t xml:space="preserve"> </w:t>
+      </w:r>
+      <w:r>
+        <w:rPr>
+          <w:rFonts w:ascii="Segoe UI" w:hAnsi="Segoe UI" w:cs="Segoe UI"/>
+          <w:color w:val="616161"/>
+          <w:szCs w:val="20"/>
+        </w:rPr>
+        <w:t>저장하는게</w:t>
+      </w:r>
+      <w:r>
+        <w:rPr>
+          <w:rFonts w:ascii="Segoe UI" w:hAnsi="Segoe UI" w:cs="Segoe UI"/>
+          <w:color w:val="616161"/>
+          <w:szCs w:val="20"/>
+        </w:rPr>
+        <w:t xml:space="preserve"> </w:t>
+      </w:r>
+      <w:r>
+        <w:rPr>
+          <w:rFonts w:ascii="Segoe UI" w:hAnsi="Segoe UI" w:cs="Segoe UI"/>
+          <w:color w:val="616161"/>
+          <w:szCs w:val="20"/>
+        </w:rPr>
+        <w:t>바랍직할까요</w:t>
+      </w:r>
+      <w:r>
+        <w:rPr>
+          <w:rFonts w:ascii="Segoe UI" w:hAnsi="Segoe UI" w:cs="Segoe UI"/>
+          <w:color w:val="616161"/>
+          <w:szCs w:val="20"/>
+        </w:rPr>
+        <w:t>?</w:t>
+      </w:r>
+    </w:p>
+    <w:p/>
+    <w:p>
       <w:bookmarkStart w:id="0" w:name="_GoBack"/>
       <w:bookmarkEnd w:id="0"/>
     </w:p>

</xml_diff>

<commit_message>
2-stage approval system implementation
</commit_message>
<xml_diff>
--- a/자료/시스템 아키텍처.docx
+++ b/자료/시스템 아키텍처.docx
@@ -27506,6 +27506,29 @@
           <w:szCs w:val="20"/>
         </w:rPr>
         <w:t>.</w:t>
+      </w:r>
+    </w:p>
+    <w:p>
+      <w:pPr>
+        <w:pBdr>
+          <w:top w:val="single" w:sz="6" w:space="1" w:color="auto"/>
+          <w:bottom w:val="single" w:sz="6" w:space="1" w:color="auto"/>
+        </w:pBdr>
+      </w:pPr>
+      <w:r>
+        <w:t xml:space="preserve">결재 승인권한에 있어서 sub admin (부관리자)는 본인 소속 해당 본부의 결재내역을 조회할 수 있다. 또한 휴가신청/지출결의 내역을 승인한다. </w:t>
+      </w:r>
+      <w:r>
+        <w:br/>
+        <w:t xml:space="preserve">이렇게 승인된 내역은 admin (시스템 마스터)가 최종 승인한다. </w:t>
+      </w:r>
+      <w:r>
+        <w:br/>
+        <w:t xml:space="preserve">시스템마스터는 부관리자가 승인 여부와 상관없이 먼저 최종 승인이 가능하다. </w:t>
+      </w:r>
+      <w:r>
+        <w:br/>
+        <w:t>이렇게 결재 승인권한 및 프로세스를 반영하여 주세요.</w:t>
       </w:r>
     </w:p>
     <w:p>

</xml_diff>

<commit_message>
Implement monthly attendance calendar and admin lookup feature in dashboard
</commit_message>
<xml_diff>
--- a/자료/시스템 아키텍처.docx
+++ b/자료/시스템 아키텍처.docx
@@ -27529,6 +27529,459 @@
       <w:r>
         <w:br/>
         <w:t>이렇게 결재 승인권한 및 프로세스를 반영하여 주세요.</w:t>
+      </w:r>
+    </w:p>
+    <w:p>
+      <w:pPr>
+        <w:pBdr>
+          <w:bottom w:val="single" w:sz="6" w:space="1" w:color="auto"/>
+          <w:between w:val="single" w:sz="6" w:space="1" w:color="auto"/>
+        </w:pBdr>
+        <w:rPr>
+          <w:rFonts w:ascii="Segoe UI" w:hAnsi="Segoe UI" w:cs="Segoe UI"/>
+          <w:color w:val="616161"/>
+          <w:szCs w:val="20"/>
+        </w:rPr>
+      </w:pPr>
+      <w:r>
+        <w:rPr>
+          <w:rFonts w:ascii="Segoe UI" w:hAnsi="Segoe UI" w:cs="Segoe UI"/>
+          <w:color w:val="616161"/>
+          <w:szCs w:val="20"/>
+        </w:rPr>
+        <w:t>Red Box</w:t>
+      </w:r>
+      <w:r>
+        <w:rPr>
+          <w:rFonts w:ascii="Segoe UI" w:hAnsi="Segoe UI" w:cs="Segoe UI"/>
+          <w:color w:val="616161"/>
+          <w:szCs w:val="20"/>
+        </w:rPr>
+        <w:t>에</w:t>
+      </w:r>
+      <w:r>
+        <w:rPr>
+          <w:rFonts w:ascii="Segoe UI" w:hAnsi="Segoe UI" w:cs="Segoe UI"/>
+          <w:color w:val="616161"/>
+          <w:szCs w:val="20"/>
+        </w:rPr>
+        <w:t xml:space="preserve"> Calendar</w:t>
+      </w:r>
+      <w:r>
+        <w:rPr>
+          <w:rFonts w:ascii="Segoe UI" w:hAnsi="Segoe UI" w:cs="Segoe UI"/>
+          <w:color w:val="616161"/>
+          <w:szCs w:val="20"/>
+        </w:rPr>
+        <w:t>를</w:t>
+      </w:r>
+      <w:r>
+        <w:rPr>
+          <w:rFonts w:ascii="Segoe UI" w:hAnsi="Segoe UI" w:cs="Segoe UI"/>
+          <w:color w:val="616161"/>
+          <w:szCs w:val="20"/>
+        </w:rPr>
+        <w:t xml:space="preserve"> display</w:t>
+      </w:r>
+      <w:r>
+        <w:rPr>
+          <w:rFonts w:ascii="Segoe UI" w:hAnsi="Segoe UI" w:cs="Segoe UI"/>
+          <w:color w:val="616161"/>
+          <w:szCs w:val="20"/>
+        </w:rPr>
+        <w:t>하고</w:t>
+      </w:r>
+      <w:r>
+        <w:rPr>
+          <w:rFonts w:ascii="Segoe UI" w:hAnsi="Segoe UI" w:cs="Segoe UI"/>
+          <w:color w:val="616161"/>
+          <w:szCs w:val="20"/>
+        </w:rPr>
+        <w:t xml:space="preserve"> </w:t>
+      </w:r>
+      <w:r>
+        <w:rPr>
+          <w:rFonts w:ascii="Segoe UI" w:hAnsi="Segoe UI" w:cs="Segoe UI"/>
+          <w:color w:val="616161"/>
+          <w:szCs w:val="20"/>
+        </w:rPr>
+        <w:t>해당</w:t>
+      </w:r>
+      <w:r>
+        <w:rPr>
+          <w:rFonts w:ascii="Segoe UI" w:hAnsi="Segoe UI" w:cs="Segoe UI"/>
+          <w:color w:val="616161"/>
+          <w:szCs w:val="20"/>
+        </w:rPr>
+        <w:t xml:space="preserve"> </w:t>
+      </w:r>
+      <w:r>
+        <w:rPr>
+          <w:rFonts w:ascii="Segoe UI" w:hAnsi="Segoe UI" w:cs="Segoe UI"/>
+          <w:color w:val="616161"/>
+          <w:szCs w:val="20"/>
+        </w:rPr>
+        <w:t>월의</w:t>
+      </w:r>
+      <w:r>
+        <w:rPr>
+          <w:rFonts w:ascii="Segoe UI" w:hAnsi="Segoe UI" w:cs="Segoe UI"/>
+          <w:color w:val="616161"/>
+          <w:szCs w:val="20"/>
+        </w:rPr>
+        <w:t xml:space="preserve"> </w:t>
+      </w:r>
+      <w:r>
+        <w:rPr>
+          <w:rFonts w:ascii="Segoe UI" w:hAnsi="Segoe UI" w:cs="Segoe UI"/>
+          <w:color w:val="616161"/>
+          <w:szCs w:val="20"/>
+        </w:rPr>
+        <w:t>출근기록을</w:t>
+      </w:r>
+      <w:r>
+        <w:rPr>
+          <w:rFonts w:ascii="Segoe UI" w:hAnsi="Segoe UI" w:cs="Segoe UI"/>
+          <w:color w:val="616161"/>
+          <w:szCs w:val="20"/>
+        </w:rPr>
+        <w:t xml:space="preserve"> </w:t>
+      </w:r>
+      <w:r>
+        <w:rPr>
+          <w:rFonts w:ascii="Segoe UI" w:hAnsi="Segoe UI" w:cs="Segoe UI"/>
+          <w:color w:val="616161"/>
+          <w:szCs w:val="20"/>
+        </w:rPr>
+        <w:t>파란색</w:t>
+      </w:r>
+      <w:r>
+        <w:rPr>
+          <w:rFonts w:ascii="Segoe UI" w:hAnsi="Segoe UI" w:cs="Segoe UI"/>
+          <w:color w:val="616161"/>
+          <w:szCs w:val="20"/>
+        </w:rPr>
+        <w:t xml:space="preserve">, </w:t>
+      </w:r>
+      <w:r>
+        <w:rPr>
+          <w:rFonts w:ascii="Segoe UI" w:hAnsi="Segoe UI" w:cs="Segoe UI"/>
+          <w:color w:val="616161"/>
+          <w:szCs w:val="20"/>
+        </w:rPr>
+        <w:t>출근기록이</w:t>
+      </w:r>
+      <w:r>
+        <w:rPr>
+          <w:rFonts w:ascii="Segoe UI" w:hAnsi="Segoe UI" w:cs="Segoe UI"/>
+          <w:color w:val="616161"/>
+          <w:szCs w:val="20"/>
+        </w:rPr>
+        <w:t xml:space="preserve"> </w:t>
+      </w:r>
+      <w:r>
+        <w:rPr>
+          <w:rFonts w:ascii="Segoe UI" w:hAnsi="Segoe UI" w:cs="Segoe UI"/>
+          <w:color w:val="616161"/>
+          <w:szCs w:val="20"/>
+        </w:rPr>
+        <w:t>없는</w:t>
+      </w:r>
+      <w:r>
+        <w:rPr>
+          <w:rFonts w:ascii="Segoe UI" w:hAnsi="Segoe UI" w:cs="Segoe UI"/>
+          <w:color w:val="616161"/>
+          <w:szCs w:val="20"/>
+        </w:rPr>
+        <w:t xml:space="preserve"> </w:t>
+      </w:r>
+      <w:r>
+        <w:rPr>
+          <w:rFonts w:ascii="Segoe UI" w:hAnsi="Segoe UI" w:cs="Segoe UI"/>
+          <w:color w:val="616161"/>
+          <w:szCs w:val="20"/>
+        </w:rPr>
+        <w:t>날과</w:t>
+      </w:r>
+      <w:r>
+        <w:rPr>
+          <w:rFonts w:ascii="Segoe UI" w:hAnsi="Segoe UI" w:cs="Segoe UI"/>
+          <w:color w:val="616161"/>
+          <w:szCs w:val="20"/>
+        </w:rPr>
+        <w:t xml:space="preserve"> </w:t>
+      </w:r>
+      <w:r>
+        <w:rPr>
+          <w:rFonts w:ascii="Segoe UI" w:hAnsi="Segoe UI" w:cs="Segoe UI"/>
+          <w:color w:val="616161"/>
+          <w:szCs w:val="20"/>
+        </w:rPr>
+        <w:t>구분하여</w:t>
+      </w:r>
+      <w:r>
+        <w:rPr>
+          <w:rFonts w:ascii="Segoe UI" w:hAnsi="Segoe UI" w:cs="Segoe UI"/>
+          <w:color w:val="616161"/>
+          <w:szCs w:val="20"/>
+        </w:rPr>
+        <w:t xml:space="preserve"> </w:t>
+      </w:r>
+      <w:r>
+        <w:rPr>
+          <w:rFonts w:ascii="Segoe UI" w:hAnsi="Segoe UI" w:cs="Segoe UI"/>
+          <w:color w:val="616161"/>
+          <w:szCs w:val="20"/>
+        </w:rPr>
+        <w:t>표시해</w:t>
+      </w:r>
+      <w:r>
+        <w:rPr>
+          <w:rFonts w:ascii="Segoe UI" w:hAnsi="Segoe UI" w:cs="Segoe UI"/>
+          <w:color w:val="616161"/>
+          <w:szCs w:val="20"/>
+        </w:rPr>
+        <w:t xml:space="preserve"> </w:t>
+      </w:r>
+      <w:r>
+        <w:rPr>
+          <w:rFonts w:ascii="Segoe UI" w:hAnsi="Segoe UI" w:cs="Segoe UI"/>
+          <w:color w:val="616161"/>
+          <w:szCs w:val="20"/>
+        </w:rPr>
+        <w:t>주세요</w:t>
+      </w:r>
+      <w:r>
+        <w:rPr>
+          <w:rFonts w:ascii="Segoe UI" w:hAnsi="Segoe UI" w:cs="Segoe UI"/>
+          <w:color w:val="616161"/>
+          <w:szCs w:val="20"/>
+        </w:rPr>
+        <w:t>. ADMIN(</w:t>
+      </w:r>
+      <w:r>
+        <w:rPr>
+          <w:rFonts w:ascii="Segoe UI" w:hAnsi="Segoe UI" w:cs="Segoe UI"/>
+          <w:color w:val="616161"/>
+          <w:szCs w:val="20"/>
+        </w:rPr>
+        <w:t>시스템</w:t>
+      </w:r>
+      <w:r>
+        <w:rPr>
+          <w:rFonts w:ascii="Segoe UI" w:hAnsi="Segoe UI" w:cs="Segoe UI"/>
+          <w:color w:val="616161"/>
+          <w:szCs w:val="20"/>
+        </w:rPr>
+        <w:t xml:space="preserve"> </w:t>
+      </w:r>
+      <w:r>
+        <w:rPr>
+          <w:rFonts w:ascii="Segoe UI" w:hAnsi="Segoe UI" w:cs="Segoe UI"/>
+          <w:color w:val="616161"/>
+          <w:szCs w:val="20"/>
+        </w:rPr>
+        <w:t>마스터</w:t>
+      </w:r>
+      <w:r>
+        <w:rPr>
+          <w:rFonts w:ascii="Segoe UI" w:hAnsi="Segoe UI" w:cs="Segoe UI"/>
+          <w:color w:val="616161"/>
+          <w:szCs w:val="20"/>
+        </w:rPr>
+        <w:t xml:space="preserve">) </w:t>
+      </w:r>
+      <w:r>
+        <w:rPr>
+          <w:rFonts w:ascii="Segoe UI" w:hAnsi="Segoe UI" w:cs="Segoe UI"/>
+          <w:color w:val="616161"/>
+          <w:szCs w:val="20"/>
+        </w:rPr>
+        <w:t>권한을</w:t>
+      </w:r>
+      <w:r>
+        <w:rPr>
+          <w:rFonts w:ascii="Segoe UI" w:hAnsi="Segoe UI" w:cs="Segoe UI"/>
+          <w:color w:val="616161"/>
+          <w:szCs w:val="20"/>
+        </w:rPr>
+        <w:t xml:space="preserve"> </w:t>
+      </w:r>
+      <w:r>
+        <w:rPr>
+          <w:rFonts w:ascii="Segoe UI" w:hAnsi="Segoe UI" w:cs="Segoe UI"/>
+          <w:color w:val="616161"/>
+          <w:szCs w:val="20"/>
+        </w:rPr>
+        <w:t>가진</w:t>
+      </w:r>
+      <w:r>
+        <w:rPr>
+          <w:rFonts w:ascii="Segoe UI" w:hAnsi="Segoe UI" w:cs="Segoe UI"/>
+          <w:color w:val="616161"/>
+          <w:szCs w:val="20"/>
+        </w:rPr>
+        <w:t xml:space="preserve"> </w:t>
+      </w:r>
+      <w:r>
+        <w:rPr>
+          <w:rFonts w:ascii="Segoe UI" w:hAnsi="Segoe UI" w:cs="Segoe UI"/>
+          <w:color w:val="616161"/>
+          <w:szCs w:val="20"/>
+        </w:rPr>
+        <w:t>관리자는</w:t>
+      </w:r>
+      <w:r>
+        <w:rPr>
+          <w:rFonts w:ascii="Segoe UI" w:hAnsi="Segoe UI" w:cs="Segoe UI"/>
+          <w:color w:val="616161"/>
+          <w:szCs w:val="20"/>
+        </w:rPr>
+        <w:t xml:space="preserve"> </w:t>
+      </w:r>
+      <w:r>
+        <w:rPr>
+          <w:rFonts w:ascii="Segoe UI" w:hAnsi="Segoe UI" w:cs="Segoe UI"/>
+          <w:color w:val="616161"/>
+          <w:szCs w:val="20"/>
+        </w:rPr>
+        <w:t>각</w:t>
+      </w:r>
+      <w:r>
+        <w:rPr>
+          <w:rFonts w:ascii="Segoe UI" w:hAnsi="Segoe UI" w:cs="Segoe UI"/>
+          <w:color w:val="616161"/>
+          <w:szCs w:val="20"/>
+        </w:rPr>
+        <w:t xml:space="preserve"> </w:t>
+      </w:r>
+      <w:r>
+        <w:rPr>
+          <w:rFonts w:ascii="Segoe UI" w:hAnsi="Segoe UI" w:cs="Segoe UI"/>
+          <w:color w:val="616161"/>
+          <w:szCs w:val="20"/>
+        </w:rPr>
+        <w:t>사람의</w:t>
+      </w:r>
+      <w:r>
+        <w:rPr>
+          <w:rFonts w:ascii="Segoe UI" w:hAnsi="Segoe UI" w:cs="Segoe UI"/>
+          <w:color w:val="616161"/>
+          <w:szCs w:val="20"/>
+        </w:rPr>
+        <w:t xml:space="preserve"> </w:t>
+      </w:r>
+      <w:r>
+        <w:rPr>
+          <w:rFonts w:ascii="Segoe UI" w:hAnsi="Segoe UI" w:cs="Segoe UI"/>
+          <w:color w:val="616161"/>
+          <w:szCs w:val="20"/>
+        </w:rPr>
+        <w:t>월별</w:t>
+      </w:r>
+      <w:r>
+        <w:rPr>
+          <w:rFonts w:ascii="Segoe UI" w:hAnsi="Segoe UI" w:cs="Segoe UI"/>
+          <w:color w:val="616161"/>
+          <w:szCs w:val="20"/>
+        </w:rPr>
+        <w:t xml:space="preserve"> </w:t>
+      </w:r>
+      <w:r>
+        <w:rPr>
+          <w:rFonts w:ascii="Segoe UI" w:hAnsi="Segoe UI" w:cs="Segoe UI"/>
+          <w:color w:val="616161"/>
+          <w:szCs w:val="20"/>
+        </w:rPr>
+        <w:t>출근</w:t>
+      </w:r>
+      <w:r>
+        <w:rPr>
+          <w:rFonts w:ascii="Segoe UI" w:hAnsi="Segoe UI" w:cs="Segoe UI"/>
+          <w:color w:val="616161"/>
+          <w:szCs w:val="20"/>
+        </w:rPr>
+        <w:t>/</w:t>
+      </w:r>
+      <w:r>
+        <w:rPr>
+          <w:rFonts w:ascii="Segoe UI" w:hAnsi="Segoe UI" w:cs="Segoe UI"/>
+          <w:color w:val="616161"/>
+          <w:szCs w:val="20"/>
+        </w:rPr>
+        <w:t>퇴근</w:t>
+      </w:r>
+      <w:r>
+        <w:rPr>
+          <w:rFonts w:ascii="Segoe UI" w:hAnsi="Segoe UI" w:cs="Segoe UI"/>
+          <w:color w:val="616161"/>
+          <w:szCs w:val="20"/>
+        </w:rPr>
+        <w:t xml:space="preserve"> </w:t>
+      </w:r>
+      <w:r>
+        <w:rPr>
+          <w:rFonts w:ascii="Segoe UI" w:hAnsi="Segoe UI" w:cs="Segoe UI"/>
+          <w:color w:val="616161"/>
+          <w:szCs w:val="20"/>
+        </w:rPr>
+        <w:t>기록을</w:t>
+      </w:r>
+      <w:r>
+        <w:rPr>
+          <w:rFonts w:ascii="Segoe UI" w:hAnsi="Segoe UI" w:cs="Segoe UI"/>
+          <w:color w:val="616161"/>
+          <w:szCs w:val="20"/>
+        </w:rPr>
+        <w:t xml:space="preserve"> </w:t>
+      </w:r>
+      <w:r>
+        <w:rPr>
+          <w:rFonts w:ascii="Segoe UI" w:hAnsi="Segoe UI" w:cs="Segoe UI"/>
+          <w:color w:val="616161"/>
+          <w:szCs w:val="20"/>
+        </w:rPr>
+        <w:t>조회할</w:t>
+      </w:r>
+      <w:r>
+        <w:rPr>
+          <w:rFonts w:ascii="Segoe UI" w:hAnsi="Segoe UI" w:cs="Segoe UI"/>
+          <w:color w:val="616161"/>
+          <w:szCs w:val="20"/>
+        </w:rPr>
+        <w:t xml:space="preserve"> </w:t>
+      </w:r>
+      <w:r>
+        <w:rPr>
+          <w:rFonts w:ascii="Segoe UI" w:hAnsi="Segoe UI" w:cs="Segoe UI"/>
+          <w:color w:val="616161"/>
+          <w:szCs w:val="20"/>
+        </w:rPr>
+        <w:t>수</w:t>
+      </w:r>
+      <w:r>
+        <w:rPr>
+          <w:rFonts w:ascii="Segoe UI" w:hAnsi="Segoe UI" w:cs="Segoe UI"/>
+          <w:color w:val="616161"/>
+          <w:szCs w:val="20"/>
+        </w:rPr>
+        <w:t xml:space="preserve"> </w:t>
+      </w:r>
+      <w:r>
+        <w:rPr>
+          <w:rFonts w:ascii="Segoe UI" w:hAnsi="Segoe UI" w:cs="Segoe UI"/>
+          <w:color w:val="616161"/>
+          <w:szCs w:val="20"/>
+        </w:rPr>
+        <w:t>있습니다</w:t>
+      </w:r>
+      <w:r>
+        <w:rPr>
+          <w:rFonts w:ascii="Segoe UI" w:hAnsi="Segoe UI" w:cs="Segoe UI"/>
+          <w:color w:val="616161"/>
+          <w:szCs w:val="20"/>
+        </w:rPr>
+        <w:t>.</w:t>
       </w:r>
     </w:p>
     <w:p>

</xml_diff>

<commit_message>
fix(rules): allow authenticated users to read notices
</commit_message>
<xml_diff>
--- a/자료/시스템 아키텍처.docx
+++ b/자료/시스템 아키텍처.docx
@@ -27985,9 +27985,2212 @@
       </w:r>
     </w:p>
     <w:p>
+      <w:pPr>
+        <w:pBdr>
+          <w:bottom w:val="single" w:sz="6" w:space="1" w:color="auto"/>
+          <w:between w:val="single" w:sz="6" w:space="1" w:color="auto"/>
+        </w:pBdr>
+      </w:pPr>
+      <w:r>
+        <w:t>ADMIN 관리자메뉴</w:t>
+      </w:r>
+      <w:r>
+        <w:br/>
+        <w:t>1. 인사관리 사이드바 메뉴를 추가</w:t>
+      </w:r>
+      <w:r>
+        <w:br/>
+        <w:t>2. Default로 전체 직원을 이름순으로 보여줍니다.</w:t>
+      </w:r>
+      <w:r>
+        <w:br/>
+        <w:t>3. 상단에 해당 본부를 선택시 선택본부의 팀별 직원을 보여줍니다.</w:t>
+      </w:r>
+      <w:r>
+        <w:br/>
+        <w:t>4. 이름으로 직원을 조회할 수 있습니다.</w:t>
+      </w:r>
+      <w:r>
+        <w:br/>
+        <w:t xml:space="preserve">5. 해당 직원을 클릭시 해당구성원의 근태기록을 보여줍니다. </w:t>
+      </w:r>
+      <w:r>
+        <w:br/>
+        <w:t xml:space="preserve">6. 직원을 선택하고 해당 직원의 모든 기록을 삭제, 기록은 남기로 퇴사처리를 할 수 있습니다. 모든 기록을 삭제시에 Warning 메세지를 보여주고 누르면 로그인 비밀번호를 입력하게 합니다. </w:t>
+      </w:r>
+      <w:r>
+        <w:br/>
+        <w:t>7. 퇴사처리자는 로그인을 할 수 없게 처리합니다.</w:t>
+      </w:r>
+      <w:r>
+        <w:br/>
+        <w:t>8. 시스템마스터는 선택직원의 로그인 비밀번호를 재설정할 수 있습니다.</w:t>
+      </w:r>
+    </w:p>
+    <w:p>
+      <w:pPr>
+        <w:pBdr>
+          <w:bottom w:val="single" w:sz="6" w:space="1" w:color="auto"/>
+          <w:between w:val="single" w:sz="6" w:space="1" w:color="auto"/>
+        </w:pBdr>
+        <w:rPr>
+          <w:rFonts w:ascii="Segoe UI" w:hAnsi="Segoe UI" w:cs="Segoe UI"/>
+          <w:color w:val="616161"/>
+          <w:szCs w:val="20"/>
+        </w:rPr>
+      </w:pPr>
+      <w:r>
+        <w:rPr>
+          <w:rFonts w:ascii="Segoe UI" w:hAnsi="Segoe UI" w:cs="Segoe UI"/>
+          <w:color w:val="616161"/>
+          <w:szCs w:val="20"/>
+        </w:rPr>
+        <w:t xml:space="preserve">ADMIN &gt; </w:t>
+      </w:r>
+      <w:r>
+        <w:rPr>
+          <w:rFonts w:ascii="Segoe UI" w:hAnsi="Segoe UI" w:cs="Segoe UI"/>
+          <w:color w:val="616161"/>
+          <w:szCs w:val="20"/>
+        </w:rPr>
+        <w:t>인사관리</w:t>
+      </w:r>
+      <w:r>
+        <w:rPr>
+          <w:rFonts w:ascii="Segoe UI" w:hAnsi="Segoe UI" w:cs="Segoe UI"/>
+          <w:color w:val="616161"/>
+          <w:szCs w:val="20"/>
+        </w:rPr>
+        <w:t xml:space="preserve"> </w:t>
+      </w:r>
+      <w:r>
+        <w:rPr>
+          <w:rFonts w:ascii="Segoe UI" w:hAnsi="Segoe UI" w:cs="Segoe UI"/>
+          <w:color w:val="616161"/>
+          <w:szCs w:val="20"/>
+        </w:rPr>
+        <w:t>특정</w:t>
+      </w:r>
+      <w:r>
+        <w:rPr>
+          <w:rFonts w:ascii="Segoe UI" w:hAnsi="Segoe UI" w:cs="Segoe UI"/>
+          <w:color w:val="616161"/>
+          <w:szCs w:val="20"/>
+        </w:rPr>
+        <w:t xml:space="preserve"> </w:t>
+      </w:r>
+      <w:r>
+        <w:rPr>
+          <w:rFonts w:ascii="Segoe UI" w:hAnsi="Segoe UI" w:cs="Segoe UI"/>
+          <w:color w:val="616161"/>
+          <w:szCs w:val="20"/>
+        </w:rPr>
+        <w:t>직원</w:t>
+      </w:r>
+      <w:r>
+        <w:rPr>
+          <w:rFonts w:ascii="Segoe UI" w:hAnsi="Segoe UI" w:cs="Segoe UI"/>
+          <w:color w:val="616161"/>
+          <w:szCs w:val="20"/>
+        </w:rPr>
+        <w:t xml:space="preserve"> </w:t>
+      </w:r>
+      <w:r>
+        <w:rPr>
+          <w:rFonts w:ascii="Segoe UI" w:hAnsi="Segoe UI" w:cs="Segoe UI"/>
+          <w:color w:val="616161"/>
+          <w:szCs w:val="20"/>
+        </w:rPr>
+        <w:t>삭제완료</w:t>
+      </w:r>
+      <w:r>
+        <w:rPr>
+          <w:rFonts w:ascii="Segoe UI" w:hAnsi="Segoe UI" w:cs="Segoe UI"/>
+          <w:color w:val="616161"/>
+          <w:szCs w:val="20"/>
+        </w:rPr>
+        <w:t xml:space="preserve"> </w:t>
+      </w:r>
+      <w:r>
+        <w:rPr>
+          <w:rFonts w:ascii="Segoe UI" w:hAnsi="Segoe UI" w:cs="Segoe UI"/>
+          <w:color w:val="616161"/>
+          <w:szCs w:val="20"/>
+        </w:rPr>
+        <w:t>직후</w:t>
+      </w:r>
+      <w:r>
+        <w:rPr>
+          <w:rFonts w:ascii="Segoe UI" w:hAnsi="Segoe UI" w:cs="Segoe UI"/>
+          <w:color w:val="616161"/>
+          <w:szCs w:val="20"/>
+        </w:rPr>
+        <w:t xml:space="preserve">, </w:t>
+      </w:r>
+      <w:r>
+        <w:rPr>
+          <w:rFonts w:ascii="Segoe UI" w:hAnsi="Segoe UI" w:cs="Segoe UI"/>
+          <w:color w:val="616161"/>
+          <w:szCs w:val="20"/>
+        </w:rPr>
+        <w:t>나머지</w:t>
+      </w:r>
+      <w:r>
+        <w:rPr>
+          <w:rFonts w:ascii="Segoe UI" w:hAnsi="Segoe UI" w:cs="Segoe UI"/>
+          <w:color w:val="616161"/>
+          <w:szCs w:val="20"/>
+        </w:rPr>
+        <w:t xml:space="preserve"> </w:t>
+      </w:r>
+      <w:r>
+        <w:rPr>
+          <w:rFonts w:ascii="Segoe UI" w:hAnsi="Segoe UI" w:cs="Segoe UI"/>
+          <w:color w:val="616161"/>
+          <w:szCs w:val="20"/>
+        </w:rPr>
+        <w:t>인원이</w:t>
+      </w:r>
+      <w:r>
+        <w:rPr>
+          <w:rFonts w:ascii="Segoe UI" w:hAnsi="Segoe UI" w:cs="Segoe UI"/>
+          <w:color w:val="616161"/>
+          <w:szCs w:val="20"/>
+        </w:rPr>
+        <w:t xml:space="preserve"> </w:t>
+      </w:r>
+      <w:r>
+        <w:rPr>
+          <w:rFonts w:ascii="Segoe UI" w:hAnsi="Segoe UI" w:cs="Segoe UI"/>
+          <w:color w:val="616161"/>
+          <w:szCs w:val="20"/>
+        </w:rPr>
+        <w:t>제대로</w:t>
+      </w:r>
+      <w:r>
+        <w:rPr>
+          <w:rFonts w:ascii="Segoe UI" w:hAnsi="Segoe UI" w:cs="Segoe UI"/>
+          <w:color w:val="616161"/>
+          <w:szCs w:val="20"/>
+        </w:rPr>
+        <w:t xml:space="preserve"> </w:t>
+      </w:r>
+      <w:r>
+        <w:rPr>
+          <w:rFonts w:ascii="Segoe UI" w:hAnsi="Segoe UI" w:cs="Segoe UI"/>
+          <w:color w:val="616161"/>
+          <w:szCs w:val="20"/>
+        </w:rPr>
+        <w:t>표시되지</w:t>
+      </w:r>
+      <w:r>
+        <w:rPr>
+          <w:rFonts w:ascii="Segoe UI" w:hAnsi="Segoe UI" w:cs="Segoe UI"/>
+          <w:color w:val="616161"/>
+          <w:szCs w:val="20"/>
+        </w:rPr>
+        <w:t xml:space="preserve"> </w:t>
+      </w:r>
+      <w:r>
+        <w:rPr>
+          <w:rFonts w:ascii="Segoe UI" w:hAnsi="Segoe UI" w:cs="Segoe UI"/>
+          <w:color w:val="616161"/>
+          <w:szCs w:val="20"/>
+        </w:rPr>
+        <w:t>않음</w:t>
+      </w:r>
+      <w:r>
+        <w:rPr>
+          <w:rFonts w:ascii="Segoe UI" w:hAnsi="Segoe UI" w:cs="Segoe UI"/>
+          <w:color w:val="616161"/>
+          <w:szCs w:val="20"/>
+        </w:rPr>
+        <w:t xml:space="preserve">. </w:t>
+      </w:r>
+      <w:r>
+        <w:rPr>
+          <w:rFonts w:ascii="Segoe UI" w:hAnsi="Segoe UI" w:cs="Segoe UI"/>
+          <w:color w:val="616161"/>
+          <w:szCs w:val="20"/>
+        </w:rPr>
+        <w:t>권한에</w:t>
+      </w:r>
+      <w:r>
+        <w:rPr>
+          <w:rFonts w:ascii="Segoe UI" w:hAnsi="Segoe UI" w:cs="Segoe UI"/>
+          <w:color w:val="616161"/>
+          <w:szCs w:val="20"/>
+        </w:rPr>
+        <w:t xml:space="preserve"> </w:t>
+      </w:r>
+      <w:r>
+        <w:rPr>
+          <w:rFonts w:ascii="Segoe UI" w:hAnsi="Segoe UI" w:cs="Segoe UI"/>
+          <w:color w:val="616161"/>
+          <w:szCs w:val="20"/>
+        </w:rPr>
+        <w:t>맞춰</w:t>
+      </w:r>
+      <w:r>
+        <w:rPr>
+          <w:rFonts w:ascii="Segoe UI" w:hAnsi="Segoe UI" w:cs="Segoe UI"/>
+          <w:color w:val="616161"/>
+          <w:szCs w:val="20"/>
+        </w:rPr>
+        <w:t xml:space="preserve"> </w:t>
+      </w:r>
+      <w:r>
+        <w:rPr>
+          <w:rFonts w:ascii="Segoe UI" w:hAnsi="Segoe UI" w:cs="Segoe UI"/>
+          <w:color w:val="616161"/>
+          <w:szCs w:val="20"/>
+        </w:rPr>
+        <w:t>표기되는</w:t>
+      </w:r>
+      <w:r>
+        <w:rPr>
+          <w:rFonts w:ascii="Segoe UI" w:hAnsi="Segoe UI" w:cs="Segoe UI"/>
+          <w:color w:val="616161"/>
+          <w:szCs w:val="20"/>
+        </w:rPr>
+        <w:t xml:space="preserve"> </w:t>
+      </w:r>
+      <w:r>
+        <w:rPr>
+          <w:rFonts w:ascii="Segoe UI" w:hAnsi="Segoe UI" w:cs="Segoe UI"/>
+          <w:color w:val="616161"/>
+          <w:szCs w:val="20"/>
+        </w:rPr>
+        <w:t>중복은</w:t>
+      </w:r>
+      <w:r>
+        <w:rPr>
+          <w:rFonts w:ascii="Segoe UI" w:hAnsi="Segoe UI" w:cs="Segoe UI"/>
+          <w:color w:val="616161"/>
+          <w:szCs w:val="20"/>
+        </w:rPr>
+        <w:t xml:space="preserve"> </w:t>
+      </w:r>
+      <w:r>
+        <w:rPr>
+          <w:rFonts w:ascii="Segoe UI" w:hAnsi="Segoe UI" w:cs="Segoe UI"/>
+          <w:color w:val="616161"/>
+          <w:szCs w:val="20"/>
+        </w:rPr>
+        <w:t>높은</w:t>
+      </w:r>
+      <w:r>
+        <w:rPr>
+          <w:rFonts w:ascii="Segoe UI" w:hAnsi="Segoe UI" w:cs="Segoe UI"/>
+          <w:color w:val="616161"/>
+          <w:szCs w:val="20"/>
+        </w:rPr>
+        <w:t xml:space="preserve"> </w:t>
+      </w:r>
+      <w:r>
+        <w:rPr>
+          <w:rFonts w:ascii="Segoe UI" w:hAnsi="Segoe UI" w:cs="Segoe UI"/>
+          <w:color w:val="616161"/>
+          <w:szCs w:val="20"/>
+        </w:rPr>
+        <w:t>권한을</w:t>
+      </w:r>
+      <w:r>
+        <w:rPr>
+          <w:rFonts w:ascii="Segoe UI" w:hAnsi="Segoe UI" w:cs="Segoe UI"/>
+          <w:color w:val="616161"/>
+          <w:szCs w:val="20"/>
+        </w:rPr>
+        <w:t xml:space="preserve"> </w:t>
+      </w:r>
+      <w:r>
+        <w:rPr>
+          <w:rFonts w:ascii="Segoe UI" w:hAnsi="Segoe UI" w:cs="Segoe UI"/>
+          <w:color w:val="616161"/>
+          <w:szCs w:val="20"/>
+        </w:rPr>
+        <w:t>표시하고</w:t>
+      </w:r>
+      <w:r>
+        <w:rPr>
+          <w:rFonts w:ascii="Segoe UI" w:hAnsi="Segoe UI" w:cs="Segoe UI"/>
+          <w:color w:val="616161"/>
+          <w:szCs w:val="20"/>
+        </w:rPr>
+        <w:t xml:space="preserve"> </w:t>
+      </w:r>
+      <w:r>
+        <w:rPr>
+          <w:rFonts w:ascii="Segoe UI" w:hAnsi="Segoe UI" w:cs="Segoe UI"/>
+          <w:color w:val="616161"/>
+          <w:szCs w:val="20"/>
+        </w:rPr>
+        <w:t>동일</w:t>
+      </w:r>
+      <w:r>
+        <w:rPr>
+          <w:rFonts w:ascii="Segoe UI" w:hAnsi="Segoe UI" w:cs="Segoe UI"/>
+          <w:color w:val="616161"/>
+          <w:szCs w:val="20"/>
+        </w:rPr>
+        <w:t xml:space="preserve"> </w:t>
+      </w:r>
+      <w:r>
+        <w:rPr>
+          <w:rFonts w:ascii="Segoe UI" w:hAnsi="Segoe UI" w:cs="Segoe UI"/>
+          <w:color w:val="616161"/>
+          <w:szCs w:val="20"/>
+        </w:rPr>
+        <w:t>직원은</w:t>
+      </w:r>
+      <w:r>
+        <w:rPr>
+          <w:rFonts w:ascii="Segoe UI" w:hAnsi="Segoe UI" w:cs="Segoe UI"/>
+          <w:color w:val="616161"/>
+          <w:szCs w:val="20"/>
+        </w:rPr>
+        <w:t xml:space="preserve"> </w:t>
+      </w:r>
+      <w:r>
+        <w:rPr>
+          <w:rFonts w:ascii="Segoe UI" w:hAnsi="Segoe UI" w:cs="Segoe UI"/>
+          <w:color w:val="616161"/>
+          <w:szCs w:val="20"/>
+        </w:rPr>
+        <w:t>한개의</w:t>
+      </w:r>
+      <w:r>
+        <w:rPr>
+          <w:rFonts w:ascii="Segoe UI" w:hAnsi="Segoe UI" w:cs="Segoe UI"/>
+          <w:color w:val="616161"/>
+          <w:szCs w:val="20"/>
+        </w:rPr>
+        <w:t xml:space="preserve"> </w:t>
+      </w:r>
+      <w:r>
+        <w:rPr>
+          <w:rFonts w:ascii="Segoe UI" w:hAnsi="Segoe UI" w:cs="Segoe UI"/>
+          <w:color w:val="616161"/>
+          <w:szCs w:val="20"/>
+        </w:rPr>
+        <w:t>데이터로</w:t>
+      </w:r>
+      <w:r>
+        <w:rPr>
+          <w:rFonts w:ascii="Segoe UI" w:hAnsi="Segoe UI" w:cs="Segoe UI"/>
+          <w:color w:val="616161"/>
+          <w:szCs w:val="20"/>
+        </w:rPr>
+        <w:t xml:space="preserve"> </w:t>
+      </w:r>
+      <w:r>
+        <w:rPr>
+          <w:rFonts w:ascii="Segoe UI" w:hAnsi="Segoe UI" w:cs="Segoe UI"/>
+          <w:color w:val="616161"/>
+          <w:szCs w:val="20"/>
+        </w:rPr>
+        <w:t>표시</w:t>
+      </w:r>
+      <w:r>
+        <w:rPr>
+          <w:rFonts w:ascii="Segoe UI" w:hAnsi="Segoe UI" w:cs="Segoe UI"/>
+          <w:color w:val="616161"/>
+          <w:szCs w:val="20"/>
+        </w:rPr>
+        <w:t xml:space="preserve"> </w:t>
+      </w:r>
+      <w:r>
+        <w:rPr>
+          <w:rFonts w:ascii="Segoe UI" w:hAnsi="Segoe UI" w:cs="Segoe UI"/>
+          <w:color w:val="616161"/>
+          <w:szCs w:val="20"/>
+        </w:rPr>
+        <w:t>조직관리</w:t>
+      </w:r>
+      <w:r>
+        <w:rPr>
+          <w:rFonts w:ascii="Segoe UI" w:hAnsi="Segoe UI" w:cs="Segoe UI"/>
+          <w:color w:val="616161"/>
+          <w:szCs w:val="20"/>
+        </w:rPr>
+        <w:t xml:space="preserve">&gt; </w:t>
+      </w:r>
+      <w:r>
+        <w:rPr>
+          <w:rFonts w:ascii="Segoe UI" w:hAnsi="Segoe UI" w:cs="Segoe UI"/>
+          <w:color w:val="616161"/>
+          <w:szCs w:val="20"/>
+        </w:rPr>
+        <w:t>팀없음</w:t>
+      </w:r>
+      <w:r>
+        <w:rPr>
+          <w:rFonts w:ascii="Segoe UI" w:hAnsi="Segoe UI" w:cs="Segoe UI"/>
+          <w:color w:val="616161"/>
+          <w:szCs w:val="20"/>
+        </w:rPr>
+        <w:t xml:space="preserve"> </w:t>
+      </w:r>
+      <w:r>
+        <w:rPr>
+          <w:rFonts w:ascii="Segoe UI" w:hAnsi="Segoe UI" w:cs="Segoe UI"/>
+          <w:color w:val="616161"/>
+          <w:szCs w:val="20"/>
+        </w:rPr>
+        <w:t>직원을</w:t>
+      </w:r>
+      <w:r>
+        <w:rPr>
+          <w:rFonts w:ascii="Segoe UI" w:hAnsi="Segoe UI" w:cs="Segoe UI"/>
+          <w:color w:val="616161"/>
+          <w:szCs w:val="20"/>
+        </w:rPr>
+        <w:t xml:space="preserve"> </w:t>
+      </w:r>
+      <w:r>
+        <w:rPr>
+          <w:rFonts w:ascii="Segoe UI" w:hAnsi="Segoe UI" w:cs="Segoe UI"/>
+          <w:color w:val="616161"/>
+          <w:szCs w:val="20"/>
+        </w:rPr>
+        <w:t>화면에</w:t>
+      </w:r>
+      <w:r>
+        <w:rPr>
+          <w:rFonts w:ascii="Segoe UI" w:hAnsi="Segoe UI" w:cs="Segoe UI"/>
+          <w:color w:val="616161"/>
+          <w:szCs w:val="20"/>
+        </w:rPr>
+        <w:t xml:space="preserve"> </w:t>
+      </w:r>
+      <w:r>
+        <w:rPr>
+          <w:rFonts w:ascii="Segoe UI" w:hAnsi="Segoe UI" w:cs="Segoe UI"/>
+          <w:color w:val="616161"/>
+          <w:szCs w:val="20"/>
+        </w:rPr>
+        <w:t>표시</w:t>
+      </w:r>
+    </w:p>
+    <w:p>
+      <w:pPr>
+        <w:pBdr>
+          <w:bottom w:val="single" w:sz="6" w:space="1" w:color="auto"/>
+          <w:between w:val="single" w:sz="6" w:space="1" w:color="auto"/>
+        </w:pBdr>
+        <w:rPr>
+          <w:rFonts w:ascii="Segoe UI" w:hAnsi="Segoe UI" w:cs="Segoe UI"/>
+          <w:color w:val="616161"/>
+          <w:szCs w:val="20"/>
+        </w:rPr>
+      </w:pPr>
+      <w:r>
+        <w:rPr>
+          <w:rFonts w:ascii="Segoe UI" w:hAnsi="Segoe UI" w:cs="Segoe UI"/>
+          <w:color w:val="616161"/>
+          <w:szCs w:val="20"/>
+        </w:rPr>
+        <w:lastRenderedPageBreak/>
+        <w:t xml:space="preserve">ADMIN </w:t>
+      </w:r>
+      <w:r>
+        <w:rPr>
+          <w:rFonts w:ascii="Segoe UI" w:hAnsi="Segoe UI" w:cs="Segoe UI"/>
+          <w:color w:val="616161"/>
+          <w:szCs w:val="20"/>
+        </w:rPr>
+        <w:t>조직관리</w:t>
+      </w:r>
+      <w:r>
+        <w:rPr>
+          <w:rFonts w:ascii="Segoe UI" w:hAnsi="Segoe UI" w:cs="Segoe UI"/>
+          <w:color w:val="616161"/>
+          <w:szCs w:val="20"/>
+        </w:rPr>
+        <w:t xml:space="preserve"> </w:t>
+      </w:r>
+      <w:r>
+        <w:rPr>
+          <w:rFonts w:ascii="Segoe UI" w:hAnsi="Segoe UI" w:cs="Segoe UI"/>
+          <w:color w:val="616161"/>
+          <w:szCs w:val="20"/>
+        </w:rPr>
+        <w:t>전사</w:t>
+      </w:r>
+      <w:r>
+        <w:rPr>
+          <w:rFonts w:ascii="Segoe UI" w:hAnsi="Segoe UI" w:cs="Segoe UI"/>
+          <w:color w:val="616161"/>
+          <w:szCs w:val="20"/>
+        </w:rPr>
+        <w:t xml:space="preserve"> </w:t>
+      </w:r>
+      <w:r>
+        <w:rPr>
+          <w:rFonts w:ascii="Segoe UI" w:hAnsi="Segoe UI" w:cs="Segoe UI"/>
+          <w:color w:val="616161"/>
+          <w:szCs w:val="20"/>
+        </w:rPr>
+        <w:t>조직</w:t>
+      </w:r>
+      <w:r>
+        <w:rPr>
+          <w:rFonts w:ascii="Segoe UI" w:hAnsi="Segoe UI" w:cs="Segoe UI"/>
+          <w:color w:val="616161"/>
+          <w:szCs w:val="20"/>
+        </w:rPr>
+        <w:t xml:space="preserve"> </w:t>
+      </w:r>
+      <w:r>
+        <w:rPr>
+          <w:rFonts w:ascii="Segoe UI" w:hAnsi="Segoe UI" w:cs="Segoe UI"/>
+          <w:color w:val="616161"/>
+          <w:szCs w:val="20"/>
+        </w:rPr>
+        <w:t>변경</w:t>
+      </w:r>
+      <w:r>
+        <w:rPr>
+          <w:rFonts w:ascii="Segoe UI" w:hAnsi="Segoe UI" w:cs="Segoe UI"/>
+          <w:color w:val="616161"/>
+          <w:szCs w:val="20"/>
+        </w:rPr>
+        <w:t xml:space="preserve"> </w:t>
+      </w:r>
+      <w:r>
+        <w:rPr>
+          <w:rFonts w:ascii="Segoe UI" w:hAnsi="Segoe UI" w:cs="Segoe UI"/>
+          <w:color w:val="616161"/>
+          <w:szCs w:val="20"/>
+        </w:rPr>
+        <w:t>이력은</w:t>
+      </w:r>
+      <w:r>
+        <w:rPr>
+          <w:rFonts w:ascii="Segoe UI" w:hAnsi="Segoe UI" w:cs="Segoe UI"/>
+          <w:color w:val="616161"/>
+          <w:szCs w:val="20"/>
+        </w:rPr>
+        <w:t xml:space="preserve"> </w:t>
+      </w:r>
+      <w:r>
+        <w:rPr>
+          <w:rFonts w:ascii="Segoe UI" w:hAnsi="Segoe UI" w:cs="Segoe UI"/>
+          <w:color w:val="616161"/>
+          <w:szCs w:val="20"/>
+        </w:rPr>
+        <w:t>해당</w:t>
+      </w:r>
+      <w:r>
+        <w:rPr>
+          <w:rFonts w:ascii="Segoe UI" w:hAnsi="Segoe UI" w:cs="Segoe UI"/>
+          <w:color w:val="616161"/>
+          <w:szCs w:val="20"/>
+        </w:rPr>
+        <w:t xml:space="preserve"> </w:t>
+      </w:r>
+      <w:r>
+        <w:rPr>
+          <w:rFonts w:ascii="Segoe UI" w:hAnsi="Segoe UI" w:cs="Segoe UI"/>
+          <w:color w:val="616161"/>
+          <w:szCs w:val="20"/>
+        </w:rPr>
+        <w:t>직원을</w:t>
+      </w:r>
+      <w:r>
+        <w:rPr>
+          <w:rFonts w:ascii="Segoe UI" w:hAnsi="Segoe UI" w:cs="Segoe UI"/>
+          <w:color w:val="616161"/>
+          <w:szCs w:val="20"/>
+        </w:rPr>
+        <w:t xml:space="preserve"> </w:t>
+      </w:r>
+      <w:r>
+        <w:rPr>
+          <w:rFonts w:ascii="Segoe UI" w:hAnsi="Segoe UI" w:cs="Segoe UI"/>
+          <w:color w:val="616161"/>
+          <w:szCs w:val="20"/>
+        </w:rPr>
+        <w:t>선택하여</w:t>
+      </w:r>
+      <w:r>
+        <w:rPr>
+          <w:rFonts w:ascii="Segoe UI" w:hAnsi="Segoe UI" w:cs="Segoe UI"/>
+          <w:color w:val="616161"/>
+          <w:szCs w:val="20"/>
+        </w:rPr>
+        <w:t xml:space="preserve"> </w:t>
+      </w:r>
+      <w:r>
+        <w:rPr>
+          <w:rFonts w:ascii="Segoe UI" w:hAnsi="Segoe UI" w:cs="Segoe UI"/>
+          <w:color w:val="616161"/>
+          <w:szCs w:val="20"/>
+        </w:rPr>
+        <w:t>조회를</w:t>
+      </w:r>
+      <w:r>
+        <w:rPr>
+          <w:rFonts w:ascii="Segoe UI" w:hAnsi="Segoe UI" w:cs="Segoe UI"/>
+          <w:color w:val="616161"/>
+          <w:szCs w:val="20"/>
+        </w:rPr>
+        <w:t xml:space="preserve"> </w:t>
+      </w:r>
+      <w:r>
+        <w:rPr>
+          <w:rFonts w:ascii="Segoe UI" w:hAnsi="Segoe UI" w:cs="Segoe UI"/>
+          <w:color w:val="616161"/>
+          <w:szCs w:val="20"/>
+        </w:rPr>
+        <w:t>누를</w:t>
+      </w:r>
+      <w:r>
+        <w:rPr>
+          <w:rFonts w:ascii="Segoe UI" w:hAnsi="Segoe UI" w:cs="Segoe UI"/>
+          <w:color w:val="616161"/>
+          <w:szCs w:val="20"/>
+        </w:rPr>
+        <w:t xml:space="preserve"> </w:t>
+      </w:r>
+      <w:r>
+        <w:rPr>
+          <w:rFonts w:ascii="Segoe UI" w:hAnsi="Segoe UI" w:cs="Segoe UI"/>
+          <w:color w:val="616161"/>
+          <w:szCs w:val="20"/>
+        </w:rPr>
+        <w:t>때만</w:t>
+      </w:r>
+      <w:r>
+        <w:rPr>
+          <w:rFonts w:ascii="Segoe UI" w:hAnsi="Segoe UI" w:cs="Segoe UI"/>
+          <w:color w:val="616161"/>
+          <w:szCs w:val="20"/>
+        </w:rPr>
+        <w:t xml:space="preserve"> </w:t>
+      </w:r>
+      <w:r>
+        <w:rPr>
+          <w:rFonts w:ascii="Segoe UI" w:hAnsi="Segoe UI" w:cs="Segoe UI"/>
+          <w:color w:val="616161"/>
+          <w:szCs w:val="20"/>
+        </w:rPr>
+        <w:t>이력을</w:t>
+      </w:r>
+      <w:r>
+        <w:rPr>
+          <w:rFonts w:ascii="Segoe UI" w:hAnsi="Segoe UI" w:cs="Segoe UI"/>
+          <w:color w:val="616161"/>
+          <w:szCs w:val="20"/>
+        </w:rPr>
+        <w:t xml:space="preserve"> </w:t>
+      </w:r>
+      <w:r>
+        <w:rPr>
+          <w:rFonts w:ascii="Segoe UI" w:hAnsi="Segoe UI" w:cs="Segoe UI"/>
+          <w:color w:val="616161"/>
+          <w:szCs w:val="20"/>
+        </w:rPr>
+        <w:t>표시합니다</w:t>
+      </w:r>
+      <w:r>
+        <w:rPr>
+          <w:rFonts w:ascii="Segoe UI" w:hAnsi="Segoe UI" w:cs="Segoe UI"/>
+          <w:color w:val="616161"/>
+          <w:szCs w:val="20"/>
+        </w:rPr>
+        <w:t xml:space="preserve">. </w:t>
+      </w:r>
+      <w:r>
+        <w:rPr>
+          <w:rFonts w:ascii="Segoe UI" w:hAnsi="Segoe UI" w:cs="Segoe UI"/>
+          <w:color w:val="616161"/>
+          <w:szCs w:val="20"/>
+        </w:rPr>
+        <w:t>모든</w:t>
+      </w:r>
+      <w:r>
+        <w:rPr>
+          <w:rFonts w:ascii="Segoe UI" w:hAnsi="Segoe UI" w:cs="Segoe UI"/>
+          <w:color w:val="616161"/>
+          <w:szCs w:val="20"/>
+        </w:rPr>
+        <w:t xml:space="preserve"> </w:t>
+      </w:r>
+      <w:r>
+        <w:rPr>
+          <w:rFonts w:ascii="Segoe UI" w:hAnsi="Segoe UI" w:cs="Segoe UI"/>
+          <w:color w:val="616161"/>
+          <w:szCs w:val="20"/>
+        </w:rPr>
+        <w:t>이력삭제는</w:t>
+      </w:r>
+      <w:r>
+        <w:rPr>
+          <w:rFonts w:ascii="Segoe UI" w:hAnsi="Segoe UI" w:cs="Segoe UI"/>
+          <w:color w:val="616161"/>
+          <w:szCs w:val="20"/>
+        </w:rPr>
+        <w:t xml:space="preserve"> Warning </w:t>
+      </w:r>
+      <w:r>
+        <w:rPr>
+          <w:rFonts w:ascii="Segoe UI" w:hAnsi="Segoe UI" w:cs="Segoe UI"/>
+          <w:color w:val="616161"/>
+          <w:szCs w:val="20"/>
+        </w:rPr>
+        <w:t>경고를</w:t>
+      </w:r>
+      <w:r>
+        <w:rPr>
+          <w:rFonts w:ascii="Segoe UI" w:hAnsi="Segoe UI" w:cs="Segoe UI"/>
+          <w:color w:val="616161"/>
+          <w:szCs w:val="20"/>
+        </w:rPr>
+        <w:t xml:space="preserve"> </w:t>
+      </w:r>
+      <w:r>
+        <w:rPr>
+          <w:rFonts w:ascii="Segoe UI" w:hAnsi="Segoe UI" w:cs="Segoe UI"/>
+          <w:color w:val="616161"/>
+          <w:szCs w:val="20"/>
+        </w:rPr>
+        <w:t>보여주고</w:t>
+      </w:r>
+      <w:r>
+        <w:rPr>
+          <w:rFonts w:ascii="Segoe UI" w:hAnsi="Segoe UI" w:cs="Segoe UI"/>
+          <w:color w:val="616161"/>
+          <w:szCs w:val="20"/>
+        </w:rPr>
+        <w:t xml:space="preserve"> </w:t>
+      </w:r>
+      <w:r>
+        <w:rPr>
+          <w:rFonts w:ascii="Segoe UI" w:hAnsi="Segoe UI" w:cs="Segoe UI"/>
+          <w:color w:val="616161"/>
+          <w:szCs w:val="20"/>
+        </w:rPr>
+        <w:t>최고관리자가</w:t>
+      </w:r>
+      <w:r>
+        <w:rPr>
+          <w:rFonts w:ascii="Segoe UI" w:hAnsi="Segoe UI" w:cs="Segoe UI"/>
+          <w:color w:val="616161"/>
+          <w:szCs w:val="20"/>
+        </w:rPr>
+        <w:t xml:space="preserve"> </w:t>
+      </w:r>
+      <w:r>
+        <w:rPr>
+          <w:rFonts w:ascii="Segoe UI" w:hAnsi="Segoe UI" w:cs="Segoe UI"/>
+          <w:color w:val="616161"/>
+          <w:szCs w:val="20"/>
+        </w:rPr>
+        <w:t>비밀번호를</w:t>
+      </w:r>
+      <w:r>
+        <w:rPr>
+          <w:rFonts w:ascii="Segoe UI" w:hAnsi="Segoe UI" w:cs="Segoe UI"/>
+          <w:color w:val="616161"/>
+          <w:szCs w:val="20"/>
+        </w:rPr>
+        <w:t xml:space="preserve"> </w:t>
+      </w:r>
+      <w:r>
+        <w:rPr>
+          <w:rFonts w:ascii="Segoe UI" w:hAnsi="Segoe UI" w:cs="Segoe UI"/>
+          <w:color w:val="616161"/>
+          <w:szCs w:val="20"/>
+        </w:rPr>
+        <w:t>후</w:t>
+      </w:r>
+      <w:r>
+        <w:rPr>
+          <w:rFonts w:ascii="Segoe UI" w:hAnsi="Segoe UI" w:cs="Segoe UI"/>
+          <w:color w:val="616161"/>
+          <w:szCs w:val="20"/>
+        </w:rPr>
+        <w:t xml:space="preserve"> </w:t>
+      </w:r>
+      <w:r>
+        <w:rPr>
+          <w:rFonts w:ascii="Segoe UI" w:hAnsi="Segoe UI" w:cs="Segoe UI"/>
+          <w:color w:val="616161"/>
+          <w:szCs w:val="20"/>
+        </w:rPr>
+        <w:t>삭제할</w:t>
+      </w:r>
+      <w:r>
+        <w:rPr>
+          <w:rFonts w:ascii="Segoe UI" w:hAnsi="Segoe UI" w:cs="Segoe UI"/>
+          <w:color w:val="616161"/>
+          <w:szCs w:val="20"/>
+        </w:rPr>
+        <w:t xml:space="preserve"> </w:t>
+      </w:r>
+      <w:r>
+        <w:rPr>
+          <w:rFonts w:ascii="Segoe UI" w:hAnsi="Segoe UI" w:cs="Segoe UI"/>
+          <w:color w:val="616161"/>
+          <w:szCs w:val="20"/>
+        </w:rPr>
+        <w:t>수</w:t>
+      </w:r>
+      <w:r>
+        <w:rPr>
+          <w:rFonts w:ascii="Segoe UI" w:hAnsi="Segoe UI" w:cs="Segoe UI"/>
+          <w:color w:val="616161"/>
+          <w:szCs w:val="20"/>
+        </w:rPr>
+        <w:t xml:space="preserve"> </w:t>
+      </w:r>
+      <w:r>
+        <w:rPr>
+          <w:rFonts w:ascii="Segoe UI" w:hAnsi="Segoe UI" w:cs="Segoe UI"/>
+          <w:color w:val="616161"/>
+          <w:szCs w:val="20"/>
+        </w:rPr>
+        <w:t>있습니다</w:t>
+      </w:r>
+      <w:r>
+        <w:rPr>
+          <w:rFonts w:ascii="Segoe UI" w:hAnsi="Segoe UI" w:cs="Segoe UI"/>
+          <w:color w:val="616161"/>
+          <w:szCs w:val="20"/>
+        </w:rPr>
+        <w:t>.</w:t>
+      </w:r>
+    </w:p>
+    <w:p>
+      <w:pPr>
+        <w:pBdr>
+          <w:bottom w:val="single" w:sz="6" w:space="1" w:color="auto"/>
+          <w:between w:val="single" w:sz="6" w:space="1" w:color="auto"/>
+        </w:pBdr>
+        <w:rPr>
+          <w:rFonts w:hint="eastAsia"/>
+        </w:rPr>
+      </w:pPr>
+      <w:r>
+        <w:drawing>
+          <wp:inline distT="0" distB="0" distL="0" distR="0" wp14:anchorId="263A3579" wp14:editId="5E0A1AF5">
+            <wp:extent cx="5731510" cy="1344930"/>
+            <wp:effectExtent l="0" t="0" r="2540" b="7620"/>
+            <wp:docPr id="3" name="그림 3"/>
+            <wp:cNvGraphicFramePr>
+              <a:graphicFrameLocks xmlns:a="http://schemas.openxmlformats.org/drawingml/2006/main" noChangeAspect="1"/>
+            </wp:cNvGraphicFramePr>
+            <a:graphic xmlns:a="http://schemas.openxmlformats.org/drawingml/2006/main">
+              <a:graphicData uri="http://schemas.openxmlformats.org/drawingml/2006/picture">
+                <pic:pic xmlns:pic="http://schemas.openxmlformats.org/drawingml/2006/picture">
+                  <pic:nvPicPr>
+                    <pic:cNvPr id="1" name=""/>
+                    <pic:cNvPicPr/>
+                  </pic:nvPicPr>
+                  <pic:blipFill>
+                    <a:blip r:embed="rId9"/>
+                    <a:stretch>
+                      <a:fillRect/>
+                    </a:stretch>
+                  </pic:blipFill>
+                  <pic:spPr>
+                    <a:xfrm>
+                      <a:off x="0" y="0"/>
+                      <a:ext cx="5731510" cy="1344930"/>
+                    </a:xfrm>
+                    <a:prstGeom prst="rect">
+                      <a:avLst/>
+                    </a:prstGeom>
+                  </pic:spPr>
+                </pic:pic>
+              </a:graphicData>
+            </a:graphic>
+          </wp:inline>
+        </w:drawing>
+      </w:r>
+      <w:r>
+        <w:rPr>
+          <w:rFonts w:ascii="Segoe UI" w:hAnsi="Segoe UI" w:cs="Segoe UI"/>
+          <w:color w:val="616161"/>
+          <w:szCs w:val="20"/>
+        </w:rPr>
+        <w:t>조직관리</w:t>
+      </w:r>
+      <w:r>
+        <w:rPr>
+          <w:rFonts w:ascii="Segoe UI" w:hAnsi="Segoe UI" w:cs="Segoe UI"/>
+          <w:color w:val="616161"/>
+          <w:szCs w:val="20"/>
+        </w:rPr>
+        <w:t xml:space="preserve"> &gt; </w:t>
+      </w:r>
+      <w:r>
+        <w:rPr>
+          <w:rFonts w:ascii="Segoe UI" w:hAnsi="Segoe UI" w:cs="Segoe UI"/>
+          <w:color w:val="616161"/>
+          <w:szCs w:val="20"/>
+        </w:rPr>
+        <w:t>이력검색</w:t>
+      </w:r>
+      <w:r>
+        <w:rPr>
+          <w:rFonts w:ascii="Segoe UI" w:hAnsi="Segoe UI" w:cs="Segoe UI"/>
+          <w:color w:val="616161"/>
+          <w:szCs w:val="20"/>
+        </w:rPr>
+        <w:t xml:space="preserve"> [</w:t>
+      </w:r>
+      <w:r>
+        <w:rPr>
+          <w:rFonts w:ascii="Segoe UI" w:hAnsi="Segoe UI" w:cs="Segoe UI"/>
+          <w:color w:val="616161"/>
+          <w:szCs w:val="20"/>
+        </w:rPr>
+        <w:t>직원</w:t>
+      </w:r>
+      <w:r>
+        <w:rPr>
+          <w:rFonts w:ascii="Segoe UI" w:hAnsi="Segoe UI" w:cs="Segoe UI"/>
+          <w:color w:val="616161"/>
+          <w:szCs w:val="20"/>
+        </w:rPr>
+        <w:t xml:space="preserve"> </w:t>
+      </w:r>
+      <w:r>
+        <w:rPr>
+          <w:rFonts w:ascii="Segoe UI" w:hAnsi="Segoe UI" w:cs="Segoe UI"/>
+          <w:color w:val="616161"/>
+          <w:szCs w:val="20"/>
+        </w:rPr>
+        <w:t>이름</w:t>
+      </w:r>
+      <w:r>
+        <w:rPr>
+          <w:rFonts w:ascii="Segoe UI" w:hAnsi="Segoe UI" w:cs="Segoe UI"/>
+          <w:color w:val="616161"/>
+          <w:szCs w:val="20"/>
+        </w:rPr>
+        <w:t xml:space="preserve">] </w:t>
+      </w:r>
+      <w:r>
+        <w:rPr>
+          <w:rFonts w:ascii="Segoe UI" w:hAnsi="Segoe UI" w:cs="Segoe UI"/>
+          <w:color w:val="616161"/>
+          <w:szCs w:val="20"/>
+        </w:rPr>
+        <w:t>검색버튼</w:t>
+      </w:r>
+      <w:r>
+        <w:rPr>
+          <w:rFonts w:ascii="Segoe UI" w:hAnsi="Segoe UI" w:cs="Segoe UI"/>
+          <w:color w:val="616161"/>
+          <w:szCs w:val="20"/>
+        </w:rPr>
+        <w:t xml:space="preserve"> </w:t>
+      </w:r>
+      <w:r>
+        <w:rPr>
+          <w:rFonts w:ascii="Segoe UI" w:hAnsi="Segoe UI" w:cs="Segoe UI"/>
+          <w:color w:val="616161"/>
+          <w:szCs w:val="20"/>
+        </w:rPr>
+        <w:t>이렇게</w:t>
+      </w:r>
+      <w:r>
+        <w:rPr>
+          <w:rFonts w:ascii="Segoe UI" w:hAnsi="Segoe UI" w:cs="Segoe UI"/>
+          <w:color w:val="616161"/>
+          <w:szCs w:val="20"/>
+        </w:rPr>
+        <w:t xml:space="preserve"> </w:t>
+      </w:r>
+      <w:r>
+        <w:rPr>
+          <w:rFonts w:ascii="Segoe UI" w:hAnsi="Segoe UI" w:cs="Segoe UI"/>
+          <w:color w:val="616161"/>
+          <w:szCs w:val="20"/>
+        </w:rPr>
+        <w:t>해서</w:t>
+      </w:r>
+      <w:r>
+        <w:rPr>
+          <w:rFonts w:ascii="Segoe UI" w:hAnsi="Segoe UI" w:cs="Segoe UI"/>
+          <w:color w:val="616161"/>
+          <w:szCs w:val="20"/>
+        </w:rPr>
+        <w:t xml:space="preserve"> </w:t>
+      </w:r>
+      <w:r>
+        <w:rPr>
+          <w:rFonts w:ascii="Segoe UI" w:hAnsi="Segoe UI" w:cs="Segoe UI"/>
+          <w:color w:val="616161"/>
+          <w:szCs w:val="20"/>
+        </w:rPr>
+        <w:t>이력검색</w:t>
+      </w:r>
+      <w:r>
+        <w:rPr>
+          <w:rFonts w:ascii="Segoe UI" w:hAnsi="Segoe UI" w:cs="Segoe UI"/>
+          <w:color w:val="616161"/>
+          <w:szCs w:val="20"/>
+        </w:rPr>
+        <w:t xml:space="preserve"> </w:t>
+      </w:r>
+      <w:r>
+        <w:rPr>
+          <w:rFonts w:ascii="Segoe UI" w:hAnsi="Segoe UI" w:cs="Segoe UI"/>
+          <w:color w:val="616161"/>
+          <w:szCs w:val="20"/>
+        </w:rPr>
+        <w:t>결과를</w:t>
+      </w:r>
+      <w:r>
+        <w:rPr>
+          <w:rFonts w:ascii="Segoe UI" w:hAnsi="Segoe UI" w:cs="Segoe UI"/>
+          <w:color w:val="616161"/>
+          <w:szCs w:val="20"/>
+        </w:rPr>
+        <w:t xml:space="preserve"> </w:t>
+      </w:r>
+      <w:r>
+        <w:rPr>
+          <w:rFonts w:ascii="Segoe UI" w:hAnsi="Segoe UI" w:cs="Segoe UI"/>
+          <w:color w:val="616161"/>
+          <w:szCs w:val="20"/>
+        </w:rPr>
+        <w:t>아래</w:t>
+      </w:r>
+      <w:r>
+        <w:rPr>
+          <w:rFonts w:ascii="Segoe UI" w:hAnsi="Segoe UI" w:cs="Segoe UI"/>
+          <w:color w:val="616161"/>
+          <w:szCs w:val="20"/>
+        </w:rPr>
+        <w:t xml:space="preserve"> </w:t>
+      </w:r>
+      <w:r>
+        <w:rPr>
+          <w:rFonts w:ascii="Segoe UI" w:hAnsi="Segoe UI" w:cs="Segoe UI"/>
+          <w:color w:val="616161"/>
+          <w:szCs w:val="20"/>
+        </w:rPr>
+        <w:t>표시해주세요</w:t>
+      </w:r>
+    </w:p>
+    <w:p>
+      <w:pPr>
+        <w:pBdr>
+          <w:bottom w:val="single" w:sz="6" w:space="1" w:color="auto"/>
+          <w:between w:val="single" w:sz="6" w:space="1" w:color="auto"/>
+        </w:pBdr>
+      </w:pPr>
+      <w:r>
+        <w:rPr>
+          <w:rFonts w:ascii="Segoe UI" w:hAnsi="Segoe UI" w:cs="Segoe UI"/>
+          <w:color w:val="616161"/>
+          <w:szCs w:val="20"/>
+        </w:rPr>
+        <w:t xml:space="preserve">ADMIN </w:t>
+      </w:r>
+      <w:r>
+        <w:rPr>
+          <w:rFonts w:ascii="Segoe UI" w:hAnsi="Segoe UI" w:cs="Segoe UI"/>
+          <w:color w:val="616161"/>
+          <w:szCs w:val="20"/>
+        </w:rPr>
+        <w:t>지출결의</w:t>
+      </w:r>
+      <w:r>
+        <w:rPr>
+          <w:rFonts w:ascii="Segoe UI" w:hAnsi="Segoe UI" w:cs="Segoe UI"/>
+          <w:color w:val="616161"/>
+          <w:szCs w:val="20"/>
+        </w:rPr>
+        <w:t xml:space="preserve"> </w:t>
+      </w:r>
+      <w:r>
+        <w:rPr>
+          <w:rFonts w:ascii="Segoe UI" w:hAnsi="Segoe UI" w:cs="Segoe UI"/>
+          <w:color w:val="616161"/>
+          <w:szCs w:val="20"/>
+        </w:rPr>
+        <w:t>통합조회</w:t>
+      </w:r>
+      <w:r>
+        <w:rPr>
+          <w:rFonts w:ascii="Segoe UI" w:hAnsi="Segoe UI" w:cs="Segoe UI"/>
+          <w:color w:val="616161"/>
+          <w:szCs w:val="20"/>
+        </w:rPr>
+        <w:t xml:space="preserve">&gt; </w:t>
+      </w:r>
+      <w:r>
+        <w:rPr>
+          <w:rFonts w:ascii="Segoe UI" w:hAnsi="Segoe UI" w:cs="Segoe UI"/>
+          <w:color w:val="616161"/>
+          <w:szCs w:val="20"/>
+        </w:rPr>
+        <w:t>새로고침시</w:t>
+      </w:r>
+      <w:r>
+        <w:rPr>
+          <w:rFonts w:ascii="Segoe UI" w:hAnsi="Segoe UI" w:cs="Segoe UI"/>
+          <w:color w:val="616161"/>
+          <w:szCs w:val="20"/>
+        </w:rPr>
+        <w:t xml:space="preserve"> </w:t>
+      </w:r>
+      <w:r>
+        <w:rPr>
+          <w:rFonts w:ascii="Segoe UI" w:hAnsi="Segoe UI" w:cs="Segoe UI"/>
+          <w:color w:val="616161"/>
+          <w:szCs w:val="20"/>
+        </w:rPr>
+        <w:t>해당월</w:t>
+      </w:r>
+      <w:r>
+        <w:rPr>
+          <w:rFonts w:ascii="Segoe UI" w:hAnsi="Segoe UI" w:cs="Segoe UI"/>
+          <w:color w:val="616161"/>
+          <w:szCs w:val="20"/>
+        </w:rPr>
+        <w:t xml:space="preserve"> </w:t>
+      </w:r>
+      <w:r>
+        <w:rPr>
+          <w:rFonts w:ascii="Segoe UI" w:hAnsi="Segoe UI" w:cs="Segoe UI"/>
+          <w:color w:val="616161"/>
+          <w:szCs w:val="20"/>
+        </w:rPr>
+        <w:t>지출결의</w:t>
+      </w:r>
+      <w:r>
+        <w:rPr>
+          <w:rFonts w:ascii="Segoe UI" w:hAnsi="Segoe UI" w:cs="Segoe UI"/>
+          <w:color w:val="616161"/>
+          <w:szCs w:val="20"/>
+        </w:rPr>
+        <w:t xml:space="preserve"> </w:t>
+      </w:r>
+      <w:r>
+        <w:rPr>
+          <w:rFonts w:ascii="Segoe UI" w:hAnsi="Segoe UI" w:cs="Segoe UI"/>
+          <w:color w:val="616161"/>
+          <w:szCs w:val="20"/>
+        </w:rPr>
+        <w:t>내역이</w:t>
+      </w:r>
+      <w:r>
+        <w:rPr>
+          <w:rFonts w:ascii="Segoe UI" w:hAnsi="Segoe UI" w:cs="Segoe UI"/>
+          <w:color w:val="616161"/>
+          <w:szCs w:val="20"/>
+        </w:rPr>
+        <w:t xml:space="preserve"> </w:t>
+      </w:r>
+      <w:r>
+        <w:rPr>
+          <w:rFonts w:ascii="Segoe UI" w:hAnsi="Segoe UI" w:cs="Segoe UI"/>
+          <w:color w:val="616161"/>
+          <w:szCs w:val="20"/>
+        </w:rPr>
+        <w:t>표시되지</w:t>
+      </w:r>
+      <w:r>
+        <w:rPr>
+          <w:rFonts w:ascii="Segoe UI" w:hAnsi="Segoe UI" w:cs="Segoe UI"/>
+          <w:color w:val="616161"/>
+          <w:szCs w:val="20"/>
+        </w:rPr>
+        <w:t xml:space="preserve"> </w:t>
+      </w:r>
+      <w:r>
+        <w:rPr>
+          <w:rFonts w:ascii="Segoe UI" w:hAnsi="Segoe UI" w:cs="Segoe UI"/>
+          <w:color w:val="616161"/>
+          <w:szCs w:val="20"/>
+        </w:rPr>
+        <w:t>않습니다</w:t>
+      </w:r>
+      <w:r>
+        <w:rPr>
+          <w:rFonts w:ascii="Segoe UI" w:hAnsi="Segoe UI" w:cs="Segoe UI"/>
+          <w:color w:val="616161"/>
+          <w:szCs w:val="20"/>
+        </w:rPr>
+        <w:t xml:space="preserve">. </w:t>
+      </w:r>
+      <w:r>
+        <w:rPr>
+          <w:rFonts w:ascii="Segoe UI" w:hAnsi="Segoe UI" w:cs="Segoe UI"/>
+          <w:color w:val="616161"/>
+          <w:szCs w:val="20"/>
+        </w:rPr>
+        <w:t>다른</w:t>
+      </w:r>
+      <w:r>
+        <w:rPr>
+          <w:rFonts w:ascii="Segoe UI" w:hAnsi="Segoe UI" w:cs="Segoe UI"/>
+          <w:color w:val="616161"/>
+          <w:szCs w:val="20"/>
+        </w:rPr>
+        <w:t xml:space="preserve"> </w:t>
+      </w:r>
+      <w:r>
+        <w:rPr>
+          <w:rFonts w:ascii="Segoe UI" w:hAnsi="Segoe UI" w:cs="Segoe UI"/>
+          <w:color w:val="616161"/>
+          <w:szCs w:val="20"/>
+        </w:rPr>
+        <w:t>메뉴로</w:t>
+      </w:r>
+      <w:r>
+        <w:rPr>
+          <w:rFonts w:ascii="Segoe UI" w:hAnsi="Segoe UI" w:cs="Segoe UI"/>
+          <w:color w:val="616161"/>
+          <w:szCs w:val="20"/>
+        </w:rPr>
+        <w:t xml:space="preserve"> </w:t>
+      </w:r>
+      <w:r>
+        <w:rPr>
+          <w:rFonts w:ascii="Segoe UI" w:hAnsi="Segoe UI" w:cs="Segoe UI"/>
+          <w:color w:val="616161"/>
+          <w:szCs w:val="20"/>
+        </w:rPr>
+        <w:t>나갔다가</w:t>
+      </w:r>
+      <w:r>
+        <w:rPr>
+          <w:rFonts w:ascii="Segoe UI" w:hAnsi="Segoe UI" w:cs="Segoe UI"/>
+          <w:color w:val="616161"/>
+          <w:szCs w:val="20"/>
+        </w:rPr>
+        <w:t xml:space="preserve"> </w:t>
+      </w:r>
+      <w:r>
+        <w:rPr>
+          <w:rFonts w:ascii="Segoe UI" w:hAnsi="Segoe UI" w:cs="Segoe UI"/>
+          <w:color w:val="616161"/>
+          <w:szCs w:val="20"/>
+        </w:rPr>
+        <w:t>다시</w:t>
+      </w:r>
+      <w:r>
+        <w:rPr>
+          <w:rFonts w:ascii="Segoe UI" w:hAnsi="Segoe UI" w:cs="Segoe UI"/>
+          <w:color w:val="616161"/>
+          <w:szCs w:val="20"/>
+        </w:rPr>
+        <w:t xml:space="preserve"> </w:t>
+      </w:r>
+      <w:r>
+        <w:rPr>
+          <w:rFonts w:ascii="Segoe UI" w:hAnsi="Segoe UI" w:cs="Segoe UI"/>
+          <w:color w:val="616161"/>
+          <w:szCs w:val="20"/>
+        </w:rPr>
+        <w:t>들어오면</w:t>
+      </w:r>
+      <w:r>
+        <w:rPr>
+          <w:rFonts w:ascii="Segoe UI" w:hAnsi="Segoe UI" w:cs="Segoe UI"/>
+          <w:color w:val="616161"/>
+          <w:szCs w:val="20"/>
+        </w:rPr>
+        <w:t xml:space="preserve"> </w:t>
+      </w:r>
+      <w:r>
+        <w:rPr>
+          <w:rFonts w:ascii="Segoe UI" w:hAnsi="Segoe UI" w:cs="Segoe UI"/>
+          <w:color w:val="616161"/>
+          <w:szCs w:val="20"/>
+        </w:rPr>
+        <w:t>화면에</w:t>
+      </w:r>
+      <w:r>
+        <w:rPr>
+          <w:rFonts w:ascii="Segoe UI" w:hAnsi="Segoe UI" w:cs="Segoe UI"/>
+          <w:color w:val="616161"/>
+          <w:szCs w:val="20"/>
+        </w:rPr>
+        <w:t xml:space="preserve"> </w:t>
+      </w:r>
+      <w:r>
+        <w:rPr>
+          <w:rFonts w:ascii="Segoe UI" w:hAnsi="Segoe UI" w:cs="Segoe UI"/>
+          <w:color w:val="616161"/>
+          <w:szCs w:val="20"/>
+        </w:rPr>
+        <w:t>표시됩니다</w:t>
+      </w:r>
+      <w:r>
+        <w:rPr>
+          <w:rFonts w:ascii="Segoe UI" w:hAnsi="Segoe UI" w:cs="Segoe UI"/>
+          <w:color w:val="616161"/>
+          <w:szCs w:val="20"/>
+        </w:rPr>
+        <w:t xml:space="preserve">. </w:t>
+      </w:r>
+      <w:r>
+        <w:rPr>
+          <w:rFonts w:ascii="Segoe UI" w:hAnsi="Segoe UI" w:cs="Segoe UI"/>
+          <w:color w:val="616161"/>
+          <w:szCs w:val="20"/>
+        </w:rPr>
+        <w:t>수정해주세요</w:t>
+      </w:r>
+      <w:r>
+        <w:rPr>
+          <w:rFonts w:ascii="Segoe UI" w:hAnsi="Segoe UI" w:cs="Segoe UI"/>
+          <w:color w:val="616161"/>
+          <w:szCs w:val="20"/>
+        </w:rPr>
+        <w:t xml:space="preserve">. </w:t>
+      </w:r>
+      <w:r>
+        <w:rPr>
+          <w:rFonts w:ascii="Segoe UI" w:hAnsi="Segoe UI" w:cs="Segoe UI"/>
+          <w:color w:val="616161"/>
+          <w:szCs w:val="20"/>
+        </w:rPr>
+        <w:t>각</w:t>
+      </w:r>
+      <w:r>
+        <w:rPr>
+          <w:rFonts w:ascii="Segoe UI" w:hAnsi="Segoe UI" w:cs="Segoe UI"/>
+          <w:color w:val="616161"/>
+          <w:szCs w:val="20"/>
+        </w:rPr>
+        <w:t xml:space="preserve"> </w:t>
+      </w:r>
+      <w:r>
+        <w:rPr>
+          <w:rFonts w:ascii="Segoe UI" w:hAnsi="Segoe UI" w:cs="Segoe UI"/>
+          <w:color w:val="616161"/>
+          <w:szCs w:val="20"/>
+        </w:rPr>
+        <w:t>표시항목간</w:t>
+      </w:r>
+      <w:r>
+        <w:rPr>
+          <w:rFonts w:ascii="Segoe UI" w:hAnsi="Segoe UI" w:cs="Segoe UI"/>
+          <w:color w:val="616161"/>
+          <w:szCs w:val="20"/>
+        </w:rPr>
+        <w:t xml:space="preserve"> </w:t>
+      </w:r>
+      <w:r>
+        <w:rPr>
+          <w:rFonts w:ascii="Segoe UI" w:hAnsi="Segoe UI" w:cs="Segoe UI"/>
+          <w:color w:val="616161"/>
+          <w:szCs w:val="20"/>
+        </w:rPr>
+        <w:t>줄간</w:t>
+      </w:r>
+      <w:r>
+        <w:rPr>
+          <w:rFonts w:ascii="Segoe UI" w:hAnsi="Segoe UI" w:cs="Segoe UI"/>
+          <w:color w:val="616161"/>
+          <w:szCs w:val="20"/>
+        </w:rPr>
+        <w:t xml:space="preserve"> </w:t>
+      </w:r>
+      <w:r>
+        <w:rPr>
+          <w:rFonts w:ascii="Segoe UI" w:hAnsi="Segoe UI" w:cs="Segoe UI"/>
+          <w:color w:val="616161"/>
+          <w:szCs w:val="20"/>
+        </w:rPr>
+        <w:t>간격은</w:t>
+      </w:r>
+      <w:r>
+        <w:rPr>
+          <w:rFonts w:ascii="Segoe UI" w:hAnsi="Segoe UI" w:cs="Segoe UI"/>
+          <w:color w:val="616161"/>
+          <w:szCs w:val="20"/>
+        </w:rPr>
+        <w:t xml:space="preserve"> </w:t>
+      </w:r>
+      <w:r>
+        <w:rPr>
+          <w:rFonts w:ascii="Segoe UI" w:hAnsi="Segoe UI" w:cs="Segoe UI"/>
+          <w:color w:val="616161"/>
+          <w:szCs w:val="20"/>
+        </w:rPr>
+        <w:t>최소로</w:t>
+      </w:r>
+      <w:r>
+        <w:rPr>
+          <w:rFonts w:ascii="Segoe UI" w:hAnsi="Segoe UI" w:cs="Segoe UI"/>
+          <w:color w:val="616161"/>
+          <w:szCs w:val="20"/>
+        </w:rPr>
+        <w:t xml:space="preserve"> </w:t>
+      </w:r>
+      <w:r>
+        <w:rPr>
+          <w:rFonts w:ascii="Segoe UI" w:hAnsi="Segoe UI" w:cs="Segoe UI"/>
+          <w:color w:val="616161"/>
+          <w:szCs w:val="20"/>
+        </w:rPr>
+        <w:t>하세요</w:t>
+      </w:r>
+      <w:r>
+        <w:rPr>
+          <w:rFonts w:ascii="Segoe UI" w:hAnsi="Segoe UI" w:cs="Segoe UI"/>
+          <w:color w:val="616161"/>
+          <w:szCs w:val="20"/>
+        </w:rPr>
+        <w:t xml:space="preserve">. </w:t>
+      </w:r>
+      <w:r>
+        <w:rPr>
+          <w:rFonts w:ascii="Segoe UI" w:hAnsi="Segoe UI" w:cs="Segoe UI"/>
+          <w:color w:val="616161"/>
+          <w:szCs w:val="20"/>
+        </w:rPr>
+        <w:t>엑셀</w:t>
+      </w:r>
+      <w:r>
+        <w:rPr>
+          <w:rFonts w:ascii="Segoe UI" w:hAnsi="Segoe UI" w:cs="Segoe UI"/>
+          <w:color w:val="616161"/>
+          <w:szCs w:val="20"/>
+        </w:rPr>
+        <w:t xml:space="preserve"> </w:t>
+      </w:r>
+      <w:r>
+        <w:rPr>
+          <w:rFonts w:ascii="Segoe UI" w:hAnsi="Segoe UI" w:cs="Segoe UI"/>
+          <w:color w:val="616161"/>
+          <w:szCs w:val="20"/>
+        </w:rPr>
+        <w:t>다운로드</w:t>
+      </w:r>
+      <w:r>
+        <w:rPr>
+          <w:rFonts w:ascii="Segoe UI" w:hAnsi="Segoe UI" w:cs="Segoe UI"/>
+          <w:color w:val="616161"/>
+          <w:szCs w:val="20"/>
+        </w:rPr>
+        <w:t xml:space="preserve"> </w:t>
+      </w:r>
+      <w:r>
+        <w:rPr>
+          <w:rFonts w:ascii="Segoe UI" w:hAnsi="Segoe UI" w:cs="Segoe UI"/>
+          <w:color w:val="616161"/>
+          <w:szCs w:val="20"/>
+        </w:rPr>
+        <w:t>기능</w:t>
+      </w:r>
+      <w:r>
+        <w:rPr>
+          <w:rFonts w:ascii="Segoe UI" w:hAnsi="Segoe UI" w:cs="Segoe UI"/>
+          <w:color w:val="616161"/>
+          <w:szCs w:val="20"/>
+        </w:rPr>
+        <w:t xml:space="preserve"> </w:t>
+      </w:r>
+      <w:r>
+        <w:rPr>
+          <w:rFonts w:ascii="Segoe UI" w:hAnsi="Segoe UI" w:cs="Segoe UI"/>
+          <w:color w:val="616161"/>
+          <w:szCs w:val="20"/>
+        </w:rPr>
+        <w:t>활성화해주세요</w:t>
+      </w:r>
+      <w:r>
+        <w:rPr>
+          <w:rFonts w:ascii="Segoe UI" w:hAnsi="Segoe UI" w:cs="Segoe UI"/>
+          <w:color w:val="616161"/>
+          <w:szCs w:val="20"/>
+        </w:rPr>
+        <w:t>.</w:t>
+      </w:r>
+    </w:p>
+    <w:p>
+      <w:pPr>
+        <w:pBdr>
+          <w:bottom w:val="single" w:sz="6" w:space="1" w:color="auto"/>
+          <w:between w:val="single" w:sz="6" w:space="1" w:color="auto"/>
+        </w:pBdr>
+        <w:rPr>
+          <w:rFonts w:ascii="Segoe UI" w:hAnsi="Segoe UI" w:cs="Segoe UI"/>
+          <w:color w:val="616161"/>
+          <w:szCs w:val="20"/>
+        </w:rPr>
+      </w:pPr>
+      <w:r>
+        <w:rPr>
+          <w:rFonts w:ascii="Segoe UI" w:hAnsi="Segoe UI" w:cs="Segoe UI"/>
+          <w:color w:val="616161"/>
+          <w:szCs w:val="20"/>
+        </w:rPr>
+        <w:t>첨부</w:t>
+      </w:r>
+      <w:r>
+        <w:rPr>
+          <w:rFonts w:ascii="Segoe UI" w:hAnsi="Segoe UI" w:cs="Segoe UI"/>
+          <w:color w:val="616161"/>
+          <w:szCs w:val="20"/>
+        </w:rPr>
+        <w:t xml:space="preserve"> </w:t>
+      </w:r>
+      <w:r>
+        <w:rPr>
+          <w:rFonts w:ascii="Segoe UI" w:hAnsi="Segoe UI" w:cs="Segoe UI"/>
+          <w:color w:val="616161"/>
+          <w:szCs w:val="20"/>
+        </w:rPr>
+        <w:t>이미지를</w:t>
+      </w:r>
+      <w:r>
+        <w:rPr>
+          <w:rFonts w:ascii="Segoe UI" w:hAnsi="Segoe UI" w:cs="Segoe UI"/>
+          <w:color w:val="616161"/>
+          <w:szCs w:val="20"/>
+        </w:rPr>
+        <w:t xml:space="preserve"> </w:t>
+      </w:r>
+      <w:r>
+        <w:rPr>
+          <w:rFonts w:ascii="Segoe UI" w:hAnsi="Segoe UI" w:cs="Segoe UI"/>
+          <w:color w:val="616161"/>
+          <w:szCs w:val="20"/>
+        </w:rPr>
+        <w:t>참조하되</w:t>
+      </w:r>
+      <w:r>
+        <w:rPr>
+          <w:rFonts w:ascii="Segoe UI" w:hAnsi="Segoe UI" w:cs="Segoe UI"/>
+          <w:color w:val="616161"/>
+          <w:szCs w:val="20"/>
+        </w:rPr>
+        <w:t xml:space="preserve"> </w:t>
+      </w:r>
+      <w:r>
+        <w:rPr>
+          <w:rFonts w:ascii="Segoe UI" w:hAnsi="Segoe UI" w:cs="Segoe UI"/>
+          <w:color w:val="616161"/>
+          <w:szCs w:val="20"/>
+        </w:rPr>
+        <w:t>간단히</w:t>
+      </w:r>
+      <w:r>
+        <w:rPr>
+          <w:rFonts w:ascii="Segoe UI" w:hAnsi="Segoe UI" w:cs="Segoe UI"/>
+          <w:color w:val="616161"/>
+          <w:szCs w:val="20"/>
+        </w:rPr>
+        <w:t xml:space="preserve"> </w:t>
+      </w:r>
+      <w:r>
+        <w:rPr>
+          <w:rFonts w:ascii="Segoe UI" w:hAnsi="Segoe UI" w:cs="Segoe UI"/>
+          <w:color w:val="616161"/>
+          <w:szCs w:val="20"/>
+        </w:rPr>
+        <w:t>입력하도록</w:t>
+      </w:r>
+      <w:r>
+        <w:rPr>
+          <w:rFonts w:ascii="Segoe UI" w:hAnsi="Segoe UI" w:cs="Segoe UI"/>
+          <w:color w:val="616161"/>
+          <w:szCs w:val="20"/>
+        </w:rPr>
+        <w:t xml:space="preserve"> </w:t>
+      </w:r>
+      <w:r>
+        <w:rPr>
+          <w:rFonts w:ascii="Segoe UI" w:hAnsi="Segoe UI" w:cs="Segoe UI"/>
+          <w:color w:val="616161"/>
+          <w:szCs w:val="20"/>
+        </w:rPr>
+        <w:t>디자인을</w:t>
+      </w:r>
+      <w:r>
+        <w:rPr>
+          <w:rFonts w:ascii="Segoe UI" w:hAnsi="Segoe UI" w:cs="Segoe UI"/>
+          <w:color w:val="616161"/>
+          <w:szCs w:val="20"/>
+        </w:rPr>
+        <w:t xml:space="preserve"> </w:t>
+      </w:r>
+      <w:r>
+        <w:rPr>
+          <w:rFonts w:ascii="Segoe UI" w:hAnsi="Segoe UI" w:cs="Segoe UI"/>
+          <w:color w:val="616161"/>
+          <w:szCs w:val="20"/>
+        </w:rPr>
+        <w:t>합니다</w:t>
+      </w:r>
+      <w:r>
+        <w:rPr>
+          <w:rFonts w:ascii="Segoe UI" w:hAnsi="Segoe UI" w:cs="Segoe UI"/>
+          <w:color w:val="616161"/>
+          <w:szCs w:val="20"/>
+        </w:rPr>
+        <w:t xml:space="preserve">. </w:t>
+      </w:r>
+      <w:r>
+        <w:rPr>
+          <w:rFonts w:ascii="Segoe UI" w:hAnsi="Segoe UI" w:cs="Segoe UI"/>
+          <w:color w:val="616161"/>
+          <w:szCs w:val="20"/>
+        </w:rPr>
+        <w:t>대한민국</w:t>
+      </w:r>
+      <w:r>
+        <w:rPr>
+          <w:rFonts w:ascii="Segoe UI" w:hAnsi="Segoe UI" w:cs="Segoe UI"/>
+          <w:color w:val="616161"/>
+          <w:szCs w:val="20"/>
+        </w:rPr>
+        <w:t xml:space="preserve"> </w:t>
+      </w:r>
+      <w:r>
+        <w:rPr>
+          <w:rFonts w:ascii="Segoe UI" w:hAnsi="Segoe UI" w:cs="Segoe UI"/>
+          <w:color w:val="616161"/>
+          <w:szCs w:val="20"/>
+        </w:rPr>
+        <w:t>근로소득에</w:t>
+      </w:r>
+      <w:r>
+        <w:rPr>
+          <w:rFonts w:ascii="Segoe UI" w:hAnsi="Segoe UI" w:cs="Segoe UI"/>
+          <w:color w:val="616161"/>
+          <w:szCs w:val="20"/>
+        </w:rPr>
+        <w:t xml:space="preserve"> </w:t>
+      </w:r>
+      <w:r>
+        <w:rPr>
+          <w:rFonts w:ascii="Segoe UI" w:hAnsi="Segoe UI" w:cs="Segoe UI"/>
+          <w:color w:val="616161"/>
+          <w:szCs w:val="20"/>
+        </w:rPr>
+        <w:t>관해</w:t>
+      </w:r>
+      <w:r>
+        <w:rPr>
+          <w:rFonts w:ascii="Segoe UI" w:hAnsi="Segoe UI" w:cs="Segoe UI"/>
+          <w:color w:val="616161"/>
+          <w:szCs w:val="20"/>
+        </w:rPr>
+        <w:t xml:space="preserve"> </w:t>
+      </w:r>
+      <w:r>
+        <w:rPr>
+          <w:rFonts w:ascii="Segoe UI" w:hAnsi="Segoe UI" w:cs="Segoe UI"/>
+          <w:color w:val="616161"/>
+          <w:szCs w:val="20"/>
+        </w:rPr>
+        <w:t>소득세법</w:t>
+      </w:r>
+      <w:r>
+        <w:rPr>
+          <w:rFonts w:ascii="Segoe UI" w:hAnsi="Segoe UI" w:cs="Segoe UI"/>
+          <w:color w:val="616161"/>
+          <w:szCs w:val="20"/>
+        </w:rPr>
+        <w:t xml:space="preserve"> </w:t>
+      </w:r>
+      <w:r>
+        <w:rPr>
+          <w:rFonts w:ascii="Segoe UI" w:hAnsi="Segoe UI" w:cs="Segoe UI"/>
+          <w:color w:val="616161"/>
+          <w:szCs w:val="20"/>
+        </w:rPr>
+        <w:t>기준으로</w:t>
+      </w:r>
+      <w:r>
+        <w:rPr>
+          <w:rFonts w:ascii="Segoe UI" w:hAnsi="Segoe UI" w:cs="Segoe UI"/>
+          <w:color w:val="616161"/>
+          <w:szCs w:val="20"/>
+        </w:rPr>
+        <w:t xml:space="preserve"> 4</w:t>
+      </w:r>
+      <w:r>
+        <w:rPr>
+          <w:rFonts w:ascii="Segoe UI" w:hAnsi="Segoe UI" w:cs="Segoe UI"/>
+          <w:color w:val="616161"/>
+          <w:szCs w:val="20"/>
+        </w:rPr>
+        <w:t>대보험</w:t>
+      </w:r>
+      <w:r>
+        <w:rPr>
+          <w:rFonts w:ascii="Segoe UI" w:hAnsi="Segoe UI" w:cs="Segoe UI"/>
+          <w:color w:val="616161"/>
+          <w:szCs w:val="20"/>
+        </w:rPr>
+        <w:t xml:space="preserve"> </w:t>
+      </w:r>
+      <w:r>
+        <w:rPr>
+          <w:rFonts w:ascii="Segoe UI" w:hAnsi="Segoe UI" w:cs="Segoe UI"/>
+          <w:color w:val="616161"/>
+          <w:szCs w:val="20"/>
+        </w:rPr>
+        <w:t>및</w:t>
+      </w:r>
+      <w:r>
+        <w:rPr>
+          <w:rFonts w:ascii="Segoe UI" w:hAnsi="Segoe UI" w:cs="Segoe UI"/>
+          <w:color w:val="616161"/>
+          <w:szCs w:val="20"/>
+        </w:rPr>
+        <w:t xml:space="preserve"> </w:t>
+      </w:r>
+      <w:r>
+        <w:rPr>
+          <w:rFonts w:ascii="Segoe UI" w:hAnsi="Segoe UI" w:cs="Segoe UI"/>
+          <w:color w:val="616161"/>
+          <w:szCs w:val="20"/>
+        </w:rPr>
+        <w:t>공제대상을</w:t>
+      </w:r>
+      <w:r>
+        <w:rPr>
+          <w:rFonts w:ascii="Segoe UI" w:hAnsi="Segoe UI" w:cs="Segoe UI"/>
+          <w:color w:val="616161"/>
+          <w:szCs w:val="20"/>
+        </w:rPr>
+        <w:t xml:space="preserve"> </w:t>
+      </w:r>
+      <w:r>
+        <w:rPr>
+          <w:rFonts w:ascii="Segoe UI" w:hAnsi="Segoe UI" w:cs="Segoe UI"/>
+          <w:color w:val="616161"/>
+          <w:szCs w:val="20"/>
+        </w:rPr>
+        <w:t>넣어서</w:t>
+      </w:r>
+      <w:r>
+        <w:rPr>
+          <w:rFonts w:ascii="Segoe UI" w:hAnsi="Segoe UI" w:cs="Segoe UI"/>
+          <w:color w:val="616161"/>
+          <w:szCs w:val="20"/>
+        </w:rPr>
+        <w:t xml:space="preserve"> </w:t>
+      </w:r>
+      <w:r>
+        <w:rPr>
+          <w:rFonts w:ascii="Segoe UI" w:hAnsi="Segoe UI" w:cs="Segoe UI"/>
+          <w:color w:val="616161"/>
+          <w:szCs w:val="20"/>
+        </w:rPr>
+        <w:t>월</w:t>
+      </w:r>
+      <w:r>
+        <w:rPr>
+          <w:rFonts w:ascii="Segoe UI" w:hAnsi="Segoe UI" w:cs="Segoe UI"/>
+          <w:color w:val="616161"/>
+          <w:szCs w:val="20"/>
+        </w:rPr>
+        <w:t xml:space="preserve"> </w:t>
+      </w:r>
+      <w:r>
+        <w:rPr>
+          <w:rFonts w:ascii="Segoe UI" w:hAnsi="Segoe UI" w:cs="Segoe UI"/>
+          <w:color w:val="616161"/>
+          <w:szCs w:val="20"/>
+        </w:rPr>
+        <w:t>수령액을</w:t>
+      </w:r>
+      <w:r>
+        <w:rPr>
+          <w:rFonts w:ascii="Segoe UI" w:hAnsi="Segoe UI" w:cs="Segoe UI"/>
+          <w:color w:val="616161"/>
+          <w:szCs w:val="20"/>
+        </w:rPr>
+        <w:t xml:space="preserve"> </w:t>
+      </w:r>
+      <w:r>
+        <w:rPr>
+          <w:rFonts w:ascii="Segoe UI" w:hAnsi="Segoe UI" w:cs="Segoe UI"/>
+          <w:color w:val="616161"/>
+          <w:szCs w:val="20"/>
+        </w:rPr>
+        <w:t>산출</w:t>
+      </w:r>
+      <w:r>
+        <w:rPr>
+          <w:rFonts w:ascii="Segoe UI" w:hAnsi="Segoe UI" w:cs="Segoe UI"/>
+          <w:color w:val="616161"/>
+          <w:szCs w:val="20"/>
+        </w:rPr>
+        <w:t xml:space="preserve"> </w:t>
+      </w:r>
+      <w:r>
+        <w:rPr>
+          <w:rFonts w:ascii="Segoe UI" w:hAnsi="Segoe UI" w:cs="Segoe UI"/>
+          <w:color w:val="616161"/>
+          <w:szCs w:val="20"/>
+        </w:rPr>
+        <w:t>해주세요</w:t>
+      </w:r>
+      <w:r>
+        <w:rPr>
+          <w:rFonts w:ascii="Segoe UI" w:hAnsi="Segoe UI" w:cs="Segoe UI"/>
+          <w:color w:val="616161"/>
+          <w:szCs w:val="20"/>
+        </w:rPr>
+        <w:t xml:space="preserve">. </w:t>
+      </w:r>
+      <w:r>
+        <w:rPr>
+          <w:rFonts w:ascii="Segoe UI" w:hAnsi="Segoe UI" w:cs="Segoe UI"/>
+          <w:color w:val="616161"/>
+          <w:szCs w:val="20"/>
+        </w:rPr>
+        <w:t>급여입력은</w:t>
+      </w:r>
+      <w:r>
+        <w:rPr>
+          <w:rFonts w:ascii="Segoe UI" w:hAnsi="Segoe UI" w:cs="Segoe UI"/>
+          <w:color w:val="616161"/>
+          <w:szCs w:val="20"/>
+        </w:rPr>
+        <w:t xml:space="preserve"> </w:t>
+      </w:r>
+      <w:r>
+        <w:rPr>
+          <w:rFonts w:ascii="Segoe UI" w:hAnsi="Segoe UI" w:cs="Segoe UI"/>
+          <w:color w:val="616161"/>
+          <w:szCs w:val="20"/>
+        </w:rPr>
+        <w:t>최고관리자</w:t>
+      </w:r>
+      <w:r>
+        <w:rPr>
+          <w:rFonts w:ascii="Segoe UI" w:hAnsi="Segoe UI" w:cs="Segoe UI"/>
+          <w:color w:val="616161"/>
+          <w:szCs w:val="20"/>
+        </w:rPr>
+        <w:t xml:space="preserve">(ADMIN) </w:t>
+      </w:r>
+      <w:r>
+        <w:rPr>
+          <w:rFonts w:ascii="Segoe UI" w:hAnsi="Segoe UI" w:cs="Segoe UI"/>
+          <w:color w:val="616161"/>
+          <w:szCs w:val="20"/>
+        </w:rPr>
+        <w:t>권한권자들이</w:t>
+      </w:r>
+      <w:r>
+        <w:rPr>
+          <w:rFonts w:ascii="Segoe UI" w:hAnsi="Segoe UI" w:cs="Segoe UI"/>
+          <w:color w:val="616161"/>
+          <w:szCs w:val="20"/>
+        </w:rPr>
+        <w:t xml:space="preserve"> </w:t>
+      </w:r>
+      <w:r>
+        <w:rPr>
+          <w:rFonts w:ascii="Segoe UI" w:hAnsi="Segoe UI" w:cs="Segoe UI"/>
+          <w:color w:val="616161"/>
+          <w:szCs w:val="20"/>
+        </w:rPr>
+        <w:t>입력</w:t>
+      </w:r>
+      <w:r>
+        <w:rPr>
+          <w:rFonts w:ascii="Segoe UI" w:hAnsi="Segoe UI" w:cs="Segoe UI"/>
+          <w:color w:val="616161"/>
+          <w:szCs w:val="20"/>
+        </w:rPr>
+        <w:t xml:space="preserve"> </w:t>
+      </w:r>
+      <w:r>
+        <w:rPr>
+          <w:rFonts w:ascii="Segoe UI" w:hAnsi="Segoe UI" w:cs="Segoe UI"/>
+          <w:color w:val="616161"/>
+          <w:szCs w:val="20"/>
+        </w:rPr>
+        <w:t>및</w:t>
+      </w:r>
+      <w:r>
+        <w:rPr>
+          <w:rFonts w:ascii="Segoe UI" w:hAnsi="Segoe UI" w:cs="Segoe UI"/>
+          <w:color w:val="616161"/>
+          <w:szCs w:val="20"/>
+        </w:rPr>
+        <w:t xml:space="preserve"> </w:t>
+      </w:r>
+      <w:r>
+        <w:rPr>
+          <w:rFonts w:ascii="Segoe UI" w:hAnsi="Segoe UI" w:cs="Segoe UI"/>
+          <w:color w:val="616161"/>
+          <w:szCs w:val="20"/>
+        </w:rPr>
+        <w:t>수정을</w:t>
+      </w:r>
+      <w:r>
+        <w:rPr>
+          <w:rFonts w:ascii="Segoe UI" w:hAnsi="Segoe UI" w:cs="Segoe UI"/>
+          <w:color w:val="616161"/>
+          <w:szCs w:val="20"/>
+        </w:rPr>
+        <w:t xml:space="preserve"> </w:t>
+      </w:r>
+      <w:r>
+        <w:rPr>
+          <w:rFonts w:ascii="Segoe UI" w:hAnsi="Segoe UI" w:cs="Segoe UI"/>
+          <w:color w:val="616161"/>
+          <w:szCs w:val="20"/>
+        </w:rPr>
+        <w:t>할</w:t>
+      </w:r>
+      <w:r>
+        <w:rPr>
+          <w:rFonts w:ascii="Segoe UI" w:hAnsi="Segoe UI" w:cs="Segoe UI"/>
+          <w:color w:val="616161"/>
+          <w:szCs w:val="20"/>
+        </w:rPr>
+        <w:t xml:space="preserve"> </w:t>
+      </w:r>
+      <w:r>
+        <w:rPr>
+          <w:rFonts w:ascii="Segoe UI" w:hAnsi="Segoe UI" w:cs="Segoe UI"/>
+          <w:color w:val="616161"/>
+          <w:szCs w:val="20"/>
+        </w:rPr>
+        <w:t>수</w:t>
+      </w:r>
+      <w:r>
+        <w:rPr>
+          <w:rFonts w:ascii="Segoe UI" w:hAnsi="Segoe UI" w:cs="Segoe UI"/>
+          <w:color w:val="616161"/>
+          <w:szCs w:val="20"/>
+        </w:rPr>
+        <w:t xml:space="preserve"> </w:t>
+      </w:r>
+      <w:r>
+        <w:rPr>
+          <w:rFonts w:ascii="Segoe UI" w:hAnsi="Segoe UI" w:cs="Segoe UI"/>
+          <w:color w:val="616161"/>
+          <w:szCs w:val="20"/>
+        </w:rPr>
+        <w:t>있습니다</w:t>
+      </w:r>
+      <w:r>
+        <w:rPr>
+          <w:rFonts w:ascii="Segoe UI" w:hAnsi="Segoe UI" w:cs="Segoe UI"/>
+          <w:color w:val="616161"/>
+          <w:szCs w:val="20"/>
+        </w:rPr>
+        <w:t xml:space="preserve">. </w:t>
+      </w:r>
+      <w:r>
+        <w:rPr>
+          <w:rFonts w:ascii="Segoe UI" w:hAnsi="Segoe UI" w:cs="Segoe UI"/>
+          <w:color w:val="616161"/>
+          <w:szCs w:val="20"/>
+        </w:rPr>
+        <w:t>관리자는</w:t>
+      </w:r>
+      <w:r>
+        <w:rPr>
+          <w:rFonts w:ascii="Segoe UI" w:hAnsi="Segoe UI" w:cs="Segoe UI"/>
+          <w:color w:val="616161"/>
+          <w:szCs w:val="20"/>
+        </w:rPr>
+        <w:t xml:space="preserve"> </w:t>
+      </w:r>
+      <w:r>
+        <w:rPr>
+          <w:rFonts w:ascii="Segoe UI" w:hAnsi="Segoe UI" w:cs="Segoe UI"/>
+          <w:color w:val="616161"/>
+          <w:szCs w:val="20"/>
+        </w:rPr>
+        <w:t>직원들의</w:t>
+      </w:r>
+      <w:r>
+        <w:rPr>
+          <w:rFonts w:ascii="Segoe UI" w:hAnsi="Segoe UI" w:cs="Segoe UI"/>
+          <w:color w:val="616161"/>
+          <w:szCs w:val="20"/>
+        </w:rPr>
+        <w:t xml:space="preserve"> </w:t>
+      </w:r>
+      <w:r>
+        <w:rPr>
+          <w:rFonts w:ascii="Segoe UI" w:hAnsi="Segoe UI" w:cs="Segoe UI"/>
+          <w:color w:val="616161"/>
+          <w:szCs w:val="20"/>
+        </w:rPr>
+        <w:t>개별</w:t>
+      </w:r>
+      <w:r>
+        <w:rPr>
+          <w:rFonts w:ascii="Segoe UI" w:hAnsi="Segoe UI" w:cs="Segoe UI"/>
+          <w:color w:val="616161"/>
+          <w:szCs w:val="20"/>
+        </w:rPr>
+        <w:t xml:space="preserve"> </w:t>
+      </w:r>
+      <w:r>
+        <w:rPr>
+          <w:rFonts w:ascii="Segoe UI" w:hAnsi="Segoe UI" w:cs="Segoe UI"/>
+          <w:color w:val="616161"/>
+          <w:szCs w:val="20"/>
+        </w:rPr>
+        <w:t>산출내역을</w:t>
+      </w:r>
+      <w:r>
+        <w:rPr>
+          <w:rFonts w:ascii="Segoe UI" w:hAnsi="Segoe UI" w:cs="Segoe UI"/>
+          <w:color w:val="616161"/>
+          <w:szCs w:val="20"/>
+        </w:rPr>
+        <w:t xml:space="preserve"> </w:t>
+      </w:r>
+      <w:r>
+        <w:rPr>
+          <w:rFonts w:ascii="Segoe UI" w:hAnsi="Segoe UI" w:cs="Segoe UI"/>
+          <w:color w:val="616161"/>
+          <w:szCs w:val="20"/>
+        </w:rPr>
+        <w:t>확인하는</w:t>
+      </w:r>
+      <w:r>
+        <w:rPr>
+          <w:rFonts w:ascii="Segoe UI" w:hAnsi="Segoe UI" w:cs="Segoe UI"/>
+          <w:color w:val="616161"/>
+          <w:szCs w:val="20"/>
+        </w:rPr>
+        <w:t xml:space="preserve"> </w:t>
+      </w:r>
+      <w:r>
+        <w:rPr>
+          <w:rFonts w:ascii="Segoe UI" w:hAnsi="Segoe UI" w:cs="Segoe UI"/>
+          <w:color w:val="616161"/>
+          <w:szCs w:val="20"/>
+        </w:rPr>
+        <w:t>화면이</w:t>
+      </w:r>
+      <w:r>
+        <w:rPr>
+          <w:rFonts w:ascii="Segoe UI" w:hAnsi="Segoe UI" w:cs="Segoe UI"/>
+          <w:color w:val="616161"/>
+          <w:szCs w:val="20"/>
+        </w:rPr>
+        <w:t xml:space="preserve"> </w:t>
+      </w:r>
+      <w:r>
+        <w:rPr>
+          <w:rFonts w:ascii="Segoe UI" w:hAnsi="Segoe UI" w:cs="Segoe UI"/>
+          <w:color w:val="616161"/>
+          <w:szCs w:val="20"/>
+        </w:rPr>
+        <w:t>나오고</w:t>
+      </w:r>
+      <w:r>
+        <w:rPr>
+          <w:rFonts w:ascii="Segoe UI" w:hAnsi="Segoe UI" w:cs="Segoe UI"/>
+          <w:color w:val="616161"/>
+          <w:szCs w:val="20"/>
+        </w:rPr>
+        <w:t xml:space="preserve"> </w:t>
+      </w:r>
+      <w:r>
+        <w:rPr>
+          <w:rFonts w:ascii="Segoe UI" w:hAnsi="Segoe UI" w:cs="Segoe UI"/>
+          <w:color w:val="616161"/>
+          <w:szCs w:val="20"/>
+        </w:rPr>
+        <w:t>이를</w:t>
+      </w:r>
+      <w:r>
+        <w:rPr>
+          <w:rFonts w:ascii="Segoe UI" w:hAnsi="Segoe UI" w:cs="Segoe UI"/>
+          <w:color w:val="616161"/>
+          <w:szCs w:val="20"/>
+        </w:rPr>
+        <w:t xml:space="preserve"> </w:t>
+      </w:r>
+      <w:r>
+        <w:rPr>
+          <w:rFonts w:ascii="Segoe UI" w:hAnsi="Segoe UI" w:cs="Segoe UI"/>
+          <w:color w:val="616161"/>
+          <w:szCs w:val="20"/>
+        </w:rPr>
+        <w:t>출력할</w:t>
+      </w:r>
+      <w:r>
+        <w:rPr>
+          <w:rFonts w:ascii="Segoe UI" w:hAnsi="Segoe UI" w:cs="Segoe UI"/>
+          <w:color w:val="616161"/>
+          <w:szCs w:val="20"/>
+        </w:rPr>
+        <w:t xml:space="preserve"> </w:t>
+      </w:r>
+      <w:r>
+        <w:rPr>
+          <w:rFonts w:ascii="Segoe UI" w:hAnsi="Segoe UI" w:cs="Segoe UI"/>
+          <w:color w:val="616161"/>
+          <w:szCs w:val="20"/>
+        </w:rPr>
+        <w:t>수</w:t>
+      </w:r>
+      <w:r>
+        <w:rPr>
+          <w:rFonts w:ascii="Segoe UI" w:hAnsi="Segoe UI" w:cs="Segoe UI"/>
+          <w:color w:val="616161"/>
+          <w:szCs w:val="20"/>
+        </w:rPr>
+        <w:t xml:space="preserve"> </w:t>
+      </w:r>
+      <w:r>
+        <w:rPr>
+          <w:rFonts w:ascii="Segoe UI" w:hAnsi="Segoe UI" w:cs="Segoe UI"/>
+          <w:color w:val="616161"/>
+          <w:szCs w:val="20"/>
+        </w:rPr>
+        <w:t>있도록</w:t>
+      </w:r>
+      <w:r>
+        <w:rPr>
+          <w:rFonts w:ascii="Segoe UI" w:hAnsi="Segoe UI" w:cs="Segoe UI"/>
+          <w:color w:val="616161"/>
+          <w:szCs w:val="20"/>
+        </w:rPr>
+        <w:t xml:space="preserve"> </w:t>
+      </w:r>
+      <w:r>
+        <w:rPr>
+          <w:rFonts w:ascii="Segoe UI" w:hAnsi="Segoe UI" w:cs="Segoe UI"/>
+          <w:color w:val="616161"/>
+          <w:szCs w:val="20"/>
+        </w:rPr>
+        <w:t>합니다</w:t>
+      </w:r>
+      <w:r>
+        <w:rPr>
+          <w:rFonts w:ascii="Segoe UI" w:hAnsi="Segoe UI" w:cs="Segoe UI"/>
+          <w:color w:val="616161"/>
+          <w:szCs w:val="20"/>
+        </w:rPr>
+        <w:t>.</w:t>
+      </w:r>
+    </w:p>
+    <w:p>
+      <w:pPr>
+        <w:rPr>
+          <w:rFonts w:ascii="Segoe UI" w:hAnsi="Segoe UI" w:cs="Segoe UI"/>
+          <w:color w:val="616161"/>
+          <w:szCs w:val="20"/>
+        </w:rPr>
+      </w:pPr>
       <w:bookmarkStart w:id="0" w:name="_GoBack"/>
       <w:bookmarkEnd w:id="0"/>
     </w:p>
+    <w:p/>
     <w:p/>
     <w:p>
       <w:r>

</xml_diff>

<commit_message>
fix: restrict salary access and fix CI
</commit_message>
<xml_diff>
--- a/자료/시스템 아키텍처.docx
+++ b/자료/시스템 아키텍처.docx
@@ -30181,6 +30181,403 @@
     </w:p>
     <w:p>
       <w:pPr>
+        <w:pBdr>
+          <w:bottom w:val="single" w:sz="6" w:space="1" w:color="auto"/>
+          <w:between w:val="single" w:sz="6" w:space="1" w:color="auto"/>
+        </w:pBdr>
+        <w:rPr>
+          <w:rFonts w:ascii="Segoe UI" w:hAnsi="Segoe UI" w:cs="Segoe UI"/>
+          <w:color w:val="616161"/>
+          <w:szCs w:val="20"/>
+        </w:rPr>
+      </w:pPr>
+      <w:r>
+        <w:rPr>
+          <w:rFonts w:ascii="Segoe UI" w:hAnsi="Segoe UI" w:cs="Segoe UI"/>
+          <w:color w:val="616161"/>
+          <w:szCs w:val="20"/>
+        </w:rPr>
+        <w:t>급여</w:t>
+      </w:r>
+      <w:r>
+        <w:rPr>
+          <w:rFonts w:ascii="Segoe UI" w:hAnsi="Segoe UI" w:cs="Segoe UI"/>
+          <w:color w:val="616161"/>
+          <w:szCs w:val="20"/>
+        </w:rPr>
+        <w:t xml:space="preserve"> </w:t>
+      </w:r>
+      <w:r>
+        <w:rPr>
+          <w:rFonts w:ascii="Segoe UI" w:hAnsi="Segoe UI" w:cs="Segoe UI"/>
+          <w:color w:val="616161"/>
+          <w:szCs w:val="20"/>
+        </w:rPr>
+        <w:t>및</w:t>
+      </w:r>
+      <w:r>
+        <w:rPr>
+          <w:rFonts w:ascii="Segoe UI" w:hAnsi="Segoe UI" w:cs="Segoe UI"/>
+          <w:color w:val="616161"/>
+          <w:szCs w:val="20"/>
+        </w:rPr>
+        <w:t xml:space="preserve"> </w:t>
+      </w:r>
+      <w:r>
+        <w:rPr>
+          <w:rFonts w:ascii="Segoe UI" w:hAnsi="Segoe UI" w:cs="Segoe UI"/>
+          <w:color w:val="616161"/>
+          <w:szCs w:val="20"/>
+        </w:rPr>
+        <w:t>연봉관리는</w:t>
+      </w:r>
+      <w:r>
+        <w:rPr>
+          <w:rFonts w:ascii="Segoe UI" w:hAnsi="Segoe UI" w:cs="Segoe UI"/>
+          <w:color w:val="616161"/>
+          <w:szCs w:val="20"/>
+        </w:rPr>
+        <w:t xml:space="preserve"> "</w:t>
+      </w:r>
+      <w:r>
+        <w:rPr>
+          <w:rFonts w:ascii="Segoe UI" w:hAnsi="Segoe UI" w:cs="Segoe UI"/>
+          <w:color w:val="616161"/>
+          <w:szCs w:val="20"/>
+        </w:rPr>
+        <w:t>최고</w:t>
+      </w:r>
+      <w:r>
+        <w:rPr>
+          <w:rFonts w:ascii="Segoe UI" w:hAnsi="Segoe UI" w:cs="Segoe UI"/>
+          <w:color w:val="616161"/>
+          <w:szCs w:val="20"/>
+        </w:rPr>
+        <w:t xml:space="preserve"> </w:t>
+      </w:r>
+      <w:r>
+        <w:rPr>
+          <w:rFonts w:ascii="Segoe UI" w:hAnsi="Segoe UI" w:cs="Segoe UI"/>
+          <w:color w:val="616161"/>
+          <w:szCs w:val="20"/>
+        </w:rPr>
+        <w:t>관리자</w:t>
+      </w:r>
+      <w:r>
+        <w:rPr>
+          <w:rFonts w:ascii="Segoe UI" w:hAnsi="Segoe UI" w:cs="Segoe UI"/>
+          <w:color w:val="616161"/>
+          <w:szCs w:val="20"/>
+        </w:rPr>
+        <w:t xml:space="preserve">" </w:t>
+      </w:r>
+      <w:r>
+        <w:rPr>
+          <w:rFonts w:ascii="Segoe UI" w:hAnsi="Segoe UI" w:cs="Segoe UI"/>
+          <w:color w:val="616161"/>
+          <w:szCs w:val="20"/>
+        </w:rPr>
+        <w:t>만이</w:t>
+      </w:r>
+      <w:r>
+        <w:rPr>
+          <w:rFonts w:ascii="Segoe UI" w:hAnsi="Segoe UI" w:cs="Segoe UI"/>
+          <w:color w:val="616161"/>
+          <w:szCs w:val="20"/>
+        </w:rPr>
+        <w:t xml:space="preserve"> </w:t>
+      </w:r>
+      <w:r>
+        <w:rPr>
+          <w:rFonts w:ascii="Segoe UI" w:hAnsi="Segoe UI" w:cs="Segoe UI"/>
+          <w:color w:val="616161"/>
+          <w:szCs w:val="20"/>
+        </w:rPr>
+        <w:t>접근</w:t>
+      </w:r>
+      <w:r>
+        <w:rPr>
+          <w:rFonts w:ascii="Segoe UI" w:hAnsi="Segoe UI" w:cs="Segoe UI"/>
+          <w:color w:val="616161"/>
+          <w:szCs w:val="20"/>
+        </w:rPr>
+        <w:t xml:space="preserve"> </w:t>
+      </w:r>
+      <w:r>
+        <w:rPr>
+          <w:rFonts w:ascii="Segoe UI" w:hAnsi="Segoe UI" w:cs="Segoe UI"/>
+          <w:color w:val="616161"/>
+          <w:szCs w:val="20"/>
+        </w:rPr>
+        <w:t>가능하도록</w:t>
+      </w:r>
+      <w:r>
+        <w:rPr>
+          <w:rFonts w:ascii="Segoe UI" w:hAnsi="Segoe UI" w:cs="Segoe UI"/>
+          <w:color w:val="616161"/>
+          <w:szCs w:val="20"/>
+        </w:rPr>
+        <w:t xml:space="preserve"> </w:t>
+      </w:r>
+      <w:r>
+        <w:rPr>
+          <w:rFonts w:ascii="Segoe UI" w:hAnsi="Segoe UI" w:cs="Segoe UI"/>
+          <w:color w:val="616161"/>
+          <w:szCs w:val="20"/>
+        </w:rPr>
+        <w:t>해야</w:t>
+      </w:r>
+      <w:r>
+        <w:rPr>
+          <w:rFonts w:ascii="Segoe UI" w:hAnsi="Segoe UI" w:cs="Segoe UI"/>
+          <w:color w:val="616161"/>
+          <w:szCs w:val="20"/>
+        </w:rPr>
+        <w:t xml:space="preserve"> </w:t>
+      </w:r>
+      <w:r>
+        <w:rPr>
+          <w:rFonts w:ascii="Segoe UI" w:hAnsi="Segoe UI" w:cs="Segoe UI"/>
+          <w:color w:val="616161"/>
+          <w:szCs w:val="20"/>
+        </w:rPr>
+        <w:t>합니다</w:t>
+      </w:r>
+      <w:r>
+        <w:rPr>
+          <w:rFonts w:ascii="Segoe UI" w:hAnsi="Segoe UI" w:cs="Segoe UI"/>
+          <w:color w:val="616161"/>
+          <w:szCs w:val="20"/>
+        </w:rPr>
+        <w:t>. "</w:t>
+      </w:r>
+      <w:r>
+        <w:rPr>
+          <w:rFonts w:ascii="Segoe UI" w:hAnsi="Segoe UI" w:cs="Segoe UI"/>
+          <w:color w:val="616161"/>
+          <w:szCs w:val="20"/>
+        </w:rPr>
+        <w:t>최고</w:t>
+      </w:r>
+      <w:r>
+        <w:rPr>
+          <w:rFonts w:ascii="Segoe UI" w:hAnsi="Segoe UI" w:cs="Segoe UI"/>
+          <w:color w:val="616161"/>
+          <w:szCs w:val="20"/>
+        </w:rPr>
+        <w:t xml:space="preserve"> </w:t>
+      </w:r>
+      <w:r>
+        <w:rPr>
+          <w:rFonts w:ascii="Segoe UI" w:hAnsi="Segoe UI" w:cs="Segoe UI"/>
+          <w:color w:val="616161"/>
+          <w:szCs w:val="20"/>
+        </w:rPr>
+        <w:t>관리자</w:t>
+      </w:r>
+      <w:r>
+        <w:rPr>
+          <w:rFonts w:ascii="Segoe UI" w:hAnsi="Segoe UI" w:cs="Segoe UI"/>
+          <w:color w:val="616161"/>
+          <w:szCs w:val="20"/>
+        </w:rPr>
+        <w:t>"</w:t>
+      </w:r>
+      <w:r>
+        <w:rPr>
+          <w:rFonts w:ascii="Segoe UI" w:hAnsi="Segoe UI" w:cs="Segoe UI"/>
+          <w:color w:val="616161"/>
+          <w:szCs w:val="20"/>
+        </w:rPr>
+        <w:t>들만</w:t>
+      </w:r>
+      <w:r>
+        <w:rPr>
+          <w:rFonts w:ascii="Segoe UI" w:hAnsi="Segoe UI" w:cs="Segoe UI"/>
+          <w:color w:val="616161"/>
+          <w:szCs w:val="20"/>
+        </w:rPr>
+        <w:t xml:space="preserve"> </w:t>
+      </w:r>
+      <w:r>
+        <w:rPr>
+          <w:rFonts w:ascii="Segoe UI" w:hAnsi="Segoe UI" w:cs="Segoe UI"/>
+          <w:color w:val="616161"/>
+          <w:szCs w:val="20"/>
+        </w:rPr>
+        <w:t>연봉</w:t>
+      </w:r>
+      <w:r>
+        <w:rPr>
+          <w:rFonts w:ascii="Segoe UI" w:hAnsi="Segoe UI" w:cs="Segoe UI"/>
+          <w:color w:val="616161"/>
+          <w:szCs w:val="20"/>
+        </w:rPr>
+        <w:t xml:space="preserve"> </w:t>
+      </w:r>
+      <w:r>
+        <w:rPr>
+          <w:rFonts w:ascii="Segoe UI" w:hAnsi="Segoe UI" w:cs="Segoe UI"/>
+          <w:color w:val="616161"/>
+          <w:szCs w:val="20"/>
+        </w:rPr>
+        <w:t>입력</w:t>
+      </w:r>
+      <w:r>
+        <w:rPr>
+          <w:rFonts w:ascii="Segoe UI" w:hAnsi="Segoe UI" w:cs="Segoe UI"/>
+          <w:color w:val="616161"/>
+          <w:szCs w:val="20"/>
+        </w:rPr>
+        <w:t xml:space="preserve"> </w:t>
+      </w:r>
+      <w:r>
+        <w:rPr>
+          <w:rFonts w:ascii="Segoe UI" w:hAnsi="Segoe UI" w:cs="Segoe UI"/>
+          <w:color w:val="616161"/>
+          <w:szCs w:val="20"/>
+        </w:rPr>
+        <w:t>및</w:t>
+      </w:r>
+      <w:r>
+        <w:rPr>
+          <w:rFonts w:ascii="Segoe UI" w:hAnsi="Segoe UI" w:cs="Segoe UI"/>
+          <w:color w:val="616161"/>
+          <w:szCs w:val="20"/>
+        </w:rPr>
+        <w:t xml:space="preserve"> </w:t>
+      </w:r>
+      <w:r>
+        <w:rPr>
+          <w:rFonts w:ascii="Segoe UI" w:hAnsi="Segoe UI" w:cs="Segoe UI"/>
+          <w:color w:val="616161"/>
+          <w:szCs w:val="20"/>
+        </w:rPr>
+        <w:t>수정이</w:t>
+      </w:r>
+      <w:r>
+        <w:rPr>
+          <w:rFonts w:ascii="Segoe UI" w:hAnsi="Segoe UI" w:cs="Segoe UI"/>
+          <w:color w:val="616161"/>
+          <w:szCs w:val="20"/>
+        </w:rPr>
+        <w:t xml:space="preserve"> </w:t>
+      </w:r>
+      <w:r>
+        <w:rPr>
+          <w:rFonts w:ascii="Segoe UI" w:hAnsi="Segoe UI" w:cs="Segoe UI"/>
+          <w:color w:val="616161"/>
+          <w:szCs w:val="20"/>
+        </w:rPr>
+        <w:t>가능합니다</w:t>
+      </w:r>
+      <w:r>
+        <w:rPr>
+          <w:rFonts w:ascii="Segoe UI" w:hAnsi="Segoe UI" w:cs="Segoe UI"/>
+          <w:color w:val="616161"/>
+          <w:szCs w:val="20"/>
+        </w:rPr>
+        <w:t xml:space="preserve">. </w:t>
+      </w:r>
+      <w:r>
+        <w:rPr>
+          <w:rFonts w:ascii="Segoe UI" w:hAnsi="Segoe UI" w:cs="Segoe UI"/>
+          <w:color w:val="616161"/>
+          <w:szCs w:val="20"/>
+        </w:rPr>
+        <w:t>이전</w:t>
+      </w:r>
+      <w:r>
+        <w:rPr>
+          <w:rFonts w:ascii="Segoe UI" w:hAnsi="Segoe UI" w:cs="Segoe UI"/>
+          <w:color w:val="616161"/>
+          <w:szCs w:val="20"/>
+        </w:rPr>
+        <w:t xml:space="preserve"> Git Push </w:t>
+      </w:r>
+      <w:r>
+        <w:rPr>
+          <w:rFonts w:ascii="Segoe UI" w:hAnsi="Segoe UI" w:cs="Segoe UI"/>
+          <w:color w:val="616161"/>
+          <w:szCs w:val="20"/>
+        </w:rPr>
+        <w:t>에러가</w:t>
+      </w:r>
+      <w:r>
+        <w:rPr>
+          <w:rFonts w:ascii="Segoe UI" w:hAnsi="Segoe UI" w:cs="Segoe UI"/>
+          <w:color w:val="616161"/>
+          <w:szCs w:val="20"/>
+        </w:rPr>
+        <w:t xml:space="preserve"> </w:t>
+      </w:r>
+      <w:r>
+        <w:rPr>
+          <w:rFonts w:ascii="Segoe UI" w:hAnsi="Segoe UI" w:cs="Segoe UI"/>
+          <w:color w:val="616161"/>
+          <w:szCs w:val="20"/>
+        </w:rPr>
+        <w:t>발생했습니다</w:t>
+      </w:r>
+      <w:r>
+        <w:rPr>
+          <w:rFonts w:ascii="Segoe UI" w:hAnsi="Segoe UI" w:cs="Segoe UI"/>
+          <w:color w:val="616161"/>
+          <w:szCs w:val="20"/>
+        </w:rPr>
+        <w:t xml:space="preserve">. </w:t>
+      </w:r>
+      <w:r>
+        <w:rPr>
+          <w:rFonts w:ascii="Segoe UI" w:hAnsi="Segoe UI" w:cs="Segoe UI"/>
+          <w:color w:val="616161"/>
+          <w:szCs w:val="20"/>
+        </w:rPr>
+        <w:t>요청사항을</w:t>
+      </w:r>
+      <w:r>
+        <w:rPr>
+          <w:rFonts w:ascii="Segoe UI" w:hAnsi="Segoe UI" w:cs="Segoe UI"/>
+          <w:color w:val="616161"/>
+          <w:szCs w:val="20"/>
+        </w:rPr>
+        <w:t xml:space="preserve"> </w:t>
+      </w:r>
+      <w:r>
+        <w:rPr>
+          <w:rFonts w:ascii="Segoe UI" w:hAnsi="Segoe UI" w:cs="Segoe UI"/>
+          <w:color w:val="616161"/>
+          <w:szCs w:val="20"/>
+        </w:rPr>
+        <w:t>반영하여</w:t>
+      </w:r>
+      <w:r>
+        <w:rPr>
+          <w:rFonts w:ascii="Segoe UI" w:hAnsi="Segoe UI" w:cs="Segoe UI"/>
+          <w:color w:val="616161"/>
+          <w:szCs w:val="20"/>
+        </w:rPr>
+        <w:t xml:space="preserve"> </w:t>
+      </w:r>
+      <w:r>
+        <w:rPr>
+          <w:rFonts w:ascii="Segoe UI" w:hAnsi="Segoe UI" w:cs="Segoe UI"/>
+          <w:color w:val="616161"/>
+          <w:szCs w:val="20"/>
+        </w:rPr>
+        <w:t>점검해주세요</w:t>
+      </w:r>
+      <w:r>
+        <w:rPr>
+          <w:rFonts w:ascii="Segoe UI" w:hAnsi="Segoe UI" w:cs="Segoe UI"/>
+          <w:color w:val="616161"/>
+          <w:szCs w:val="20"/>
+        </w:rPr>
+        <w:t>.</w:t>
+      </w:r>
+    </w:p>
+    <w:p>
+      <w:pPr>
         <w:rPr>
           <w:rFonts w:ascii="Segoe UI" w:hAnsi="Segoe UI" w:cs="Segoe UI"/>
           <w:color w:val="616161"/>
@@ -30189,6 +30586,15 @@
       </w:pPr>
       <w:bookmarkStart w:id="0" w:name="_GoBack"/>
       <w:bookmarkEnd w:id="0"/>
+    </w:p>
+    <w:p>
+      <w:pPr>
+        <w:rPr>
+          <w:rFonts w:ascii="Segoe UI" w:hAnsi="Segoe UI" w:cs="Segoe UI"/>
+          <w:color w:val="616161"/>
+          <w:szCs w:val="20"/>
+        </w:rPr>
+      </w:pPr>
     </w:p>
     <w:p/>
     <w:p/>

</xml_diff>

<commit_message>
fix(dashboard): ensure immediate UI update of monthly attendance
</commit_message>
<xml_diff>
--- a/자료/시스템 아키텍처.docx
+++ b/자료/시스템 아키텍처.docx
@@ -30578,14 +30578,32 @@
     </w:p>
     <w:p>
       <w:pPr>
-        <w:rPr>
-          <w:rFonts w:ascii="Segoe UI" w:hAnsi="Segoe UI" w:cs="Segoe UI"/>
-          <w:color w:val="616161"/>
-          <w:szCs w:val="20"/>
-        </w:rPr>
+        <w:pBdr>
+          <w:bottom w:val="single" w:sz="6" w:space="1" w:color="auto"/>
+          <w:between w:val="single" w:sz="6" w:space="1" w:color="auto"/>
+        </w:pBdr>
       </w:pPr>
+      <w:r>
+        <w:t xml:space="preserve">대시보드 출근하기 클릭시 &gt; 월별 근태현황 부분이 즉시 반영되지 않음. 다른 메뉴를 클릭하고 다시 대시보드에 접근시 반영이 되어 있음. </w:t>
+      </w:r>
+      <w:r>
+        <w:br/>
+        <w:t>이를 수정하고 Push하세요.</w:t>
+      </w:r>
+    </w:p>
+    <w:p>
       <w:bookmarkStart w:id="0" w:name="_GoBack"/>
       <w:bookmarkEnd w:id="0"/>
+    </w:p>
+    <w:p/>
+    <w:p>
+      <w:pPr>
+        <w:rPr>
+          <w:rFonts w:ascii="Segoe UI" w:hAnsi="Segoe UI" w:cs="Segoe UI"/>
+          <w:color w:val="616161"/>
+          <w:szCs w:val="20"/>
+        </w:rPr>
+      </w:pPr>
     </w:p>
     <w:p>
       <w:pPr>

</xml_diff>